<commit_message>
docs: rewrite Claude Code section with tested VS Code extension setup
Base URL without trailing slash, required env vars incl.
CLAUDE_CODE_DISABLE_EXPERIMENTAL_BETAS, model selection options, and
known issue with openai/* models (output_config). Rebuild docx.

Co-Authored-By: Claude Sonnet 5.5 <noreply@anthropic.com>
Claude-Session: https://claude.ai/code/session_01K2TE7hKB2uwZb8YzUQGaRz
</commit_message>
<xml_diff>
--- a/user-docs/sotoon-api-docs.docx
+++ b/user-docs/sotoon-api-docs.docx
@@ -5730,7 +5730,7 @@
           <w:bCs/>
           <w:rtl w:val="false"/>
         </w:rPr>
-        <w:t xml:space="preserve">VS Code:</w:t>
+        <w:t xml:space="preserve">VS Code (Copilot):</w:t>
       </w:r>
       <w:r>
         <w:rPr>
@@ -5764,7 +5764,21 @@
         <w:rPr>
           <w:rtl/>
         </w:rPr>
-        <w:t xml:space="preserve"> از راهنمای قبلی؛ اسلش پایانی آدرس و مدل سبک باید تست شود.</w:t>
+        <w:t xml:space="preserve"> اتصال، آدرس بدون اسلش، متغیرهای لازم و خطای مدل‌های OpenAI روی افزونه‌ی VS Code تست شده. جواب‌دادن یک مدل غیر OpenAI </w:t>
+      </w:r>
+      <w:r>
+        <w:rPr>
+          <w:b/>
+          <w:bCs/>
+          <w:rtl/>
+        </w:rPr>
+        <w:t xml:space="preserve">تا انتها (چت + ابزار) هنوز تست نشده</w:t>
+      </w:r>
+      <w:r>
+        <w:rPr>
+          <w:rtl/>
+        </w:rPr>
+        <w:t xml:space="preserve">. روش ترمینال و دسکتاپ از مستند رسمی است.</w:t>
       </w:r>
     </w:p>
     <w:p>
@@ -5792,7 +5806,7 @@
         <w:rPr>
           <w:rtl/>
         </w:rPr>
-        <w:t xml:space="preserve"> از مستندات رسمی آن‌ها؛ تست نشده.</w:t>
+        <w:t xml:space="preserve"> از مستندات رسمی؛ تست نشده.</w:t>
       </w:r>
     </w:p>
     <w:p>
@@ -6350,7 +6364,45 @@
                 <w:shd w:fill="EFEFEF" w:color="auto" w:val="clear"/>
                 <w:rtl w:val="false"/>
               </w:rPr>
-              <w:t xml:space="preserve">https://api.intelligence.sotoon.ir/inference/</w:t>
+              <w:t xml:space="preserve">https://api.intelligence.sotoon.ir/inference</w:t>
+            </w:r>
+            <w:r>
+              <w:rPr>
+                <w:rtl/>
+              </w:rPr>
+              <w:t xml:space="preserve"> (بدون </w:t>
+            </w:r>
+            <w:r>
+              <w:rPr>
+                <w:rFonts w:ascii="Consolas" w:cs="Consolas" w:hAnsi="Consolas"/>
+                <w:sz w:val="19"/>
+                <w:szCs w:val="19"/>
+                <w:shd w:fill="EFEFEF" w:color="auto" w:val="clear"/>
+                <w:rtl w:val="false"/>
+              </w:rPr>
+              <w:t xml:space="preserve">/</w:t>
+            </w:r>
+            <w:r>
+              <w:rPr>
+                <w:rtl/>
+              </w:rPr>
+              <w:t xml:space="preserve"> آخر و بدون </w:t>
+            </w:r>
+            <w:r>
+              <w:rPr>
+                <w:rFonts w:ascii="Consolas" w:cs="Consolas" w:hAnsi="Consolas"/>
+                <w:sz w:val="19"/>
+                <w:szCs w:val="19"/>
+                <w:shd w:fill="EFEFEF" w:color="auto" w:val="clear"/>
+                <w:rtl w:val="false"/>
+              </w:rPr>
+              <w:t xml:space="preserve">/v1</w:t>
+            </w:r>
+            <w:r>
+              <w:rPr>
+                <w:rtl w:val="false"/>
+              </w:rPr>
+              <w:t xml:space="preserve">)</w:t>
             </w:r>
           </w:p>
         </w:tc>
@@ -6602,205 +6654,45 @@
       </w:pPr>
       <w:r>
         <w:rPr>
+          <w:rtl/>
+        </w:rPr>
+        <w:t xml:space="preserve">Claude Code را می‌توانید با </w:t>
+      </w:r>
+      <w:r>
+        <w:rPr>
           <w:b/>
           <w:bCs/>
           <w:rtl/>
         </w:rPr>
-        <w:t xml:space="preserve">نصب:</w:t>
-      </w:r>
-    </w:p>
-    <w:p>
-      <w:pPr>
-        <w:shd w:fill="F3F3F6" w:color="auto" w:val="clear"/>
-        <w:spacing w:after="200" w:line="260"/>
-        <w:ind w:left="120" w:right="120"/>
-      </w:pPr>
-      <w:r>
-        <w:rPr>
-          <w:rFonts w:ascii="Consolas" w:cs="Consolas" w:hAnsi="Consolas"/>
-          <w:sz w:val="18"/>
-          <w:szCs w:val="18"/>
-          <w:rtl w:val="false"/>
-        </w:rPr>
-        <w:t xml:space="preserve">npm install -g @anthropic-ai/claude-code</w:t>
-      </w:r>
-    </w:p>
-    <w:p>
-      <w:pPr>
-        <w:bidi/>
-        <w:spacing w:after="120" w:line="320"/>
-      </w:pPr>
+        <w:t xml:space="preserve">افزونه‌ی VS Code</w:t>
+      </w:r>
+      <w:r>
+        <w:rPr>
+          <w:rtl/>
+        </w:rPr>
+        <w:t xml:space="preserve"> (ساده‌تر، بدون ترمینال) یا از </w:t>
+      </w:r>
       <w:r>
         <w:rPr>
           <w:b/>
           <w:bCs/>
           <w:rtl/>
         </w:rPr>
-        <w:t xml:space="preserve">تنظیم آدرس و کلید.</w:t>
-      </w:r>
-      <w:r>
-        <w:rPr>
-          <w:rtl/>
-        </w:rPr>
-        <w:t xml:space="preserve"> به آدرس پایانی </w:t>
-      </w:r>
-      <w:r>
-        <w:rPr>
-          <w:rFonts w:ascii="Consolas" w:cs="Consolas" w:hAnsi="Consolas"/>
-          <w:sz w:val="19"/>
-          <w:szCs w:val="19"/>
-          <w:shd w:fill="EFEFEF" w:color="auto" w:val="clear"/>
-          <w:rtl w:val="false"/>
-        </w:rPr>
-        <w:t xml:space="preserve">/</w:t>
-      </w:r>
-      <w:r>
-        <w:rPr>
-          <w:rtl/>
-        </w:rPr>
-        <w:t xml:space="preserve"> دقت کنید.</w:t>
-      </w:r>
-    </w:p>
-    <w:p>
-      <w:pPr>
-        <w:bidi/>
-        <w:spacing w:after="120" w:line="320"/>
-      </w:pPr>
-      <w:r>
-        <w:rPr>
-          <w:rtl/>
-        </w:rPr>
-        <w:t xml:space="preserve">macOS و Linux (به </w:t>
-      </w:r>
-      <w:r>
-        <w:rPr>
-          <w:rFonts w:ascii="Consolas" w:cs="Consolas" w:hAnsi="Consolas"/>
-          <w:sz w:val="19"/>
-          <w:szCs w:val="19"/>
-          <w:shd w:fill="EFEFEF" w:color="auto" w:val="clear"/>
-          <w:rtl w:val="false"/>
-        </w:rPr>
-        <w:t xml:space="preserve">~/.zshrc</w:t>
-      </w:r>
-      <w:r>
-        <w:rPr>
-          <w:rtl/>
-        </w:rPr>
-        <w:t xml:space="preserve"> یا </w:t>
-      </w:r>
-      <w:r>
-        <w:rPr>
-          <w:rFonts w:ascii="Consolas" w:cs="Consolas" w:hAnsi="Consolas"/>
-          <w:sz w:val="19"/>
-          <w:szCs w:val="19"/>
-          <w:shd w:fill="EFEFEF" w:color="auto" w:val="clear"/>
-          <w:rtl w:val="false"/>
-        </w:rPr>
-        <w:t xml:space="preserve">~/.bashrc</w:t>
-      </w:r>
-      <w:r>
-        <w:rPr>
-          <w:rtl/>
-        </w:rPr>
-        <w:t xml:space="preserve"> اضافه کنید و </w:t>
-      </w:r>
-      <w:r>
-        <w:rPr>
-          <w:rFonts w:ascii="Consolas" w:cs="Consolas" w:hAnsi="Consolas"/>
-          <w:sz w:val="19"/>
-          <w:szCs w:val="19"/>
-          <w:shd w:fill="EFEFEF" w:color="auto" w:val="clear"/>
-          <w:rtl w:val="false"/>
-        </w:rPr>
-        <w:t xml:space="preserve">source ~/.zshrc</w:t>
-      </w:r>
-      <w:r>
-        <w:rPr>
-          <w:rtl/>
-        </w:rPr>
-        <w:t xml:space="preserve"> بزنید):</w:t>
-      </w:r>
-    </w:p>
-    <w:p>
-      <w:pPr>
-        <w:shd w:fill="F3F3F6" w:color="auto" w:val="clear"/>
-        <w:spacing w:after="0" w:line="260"/>
-        <w:ind w:left="120" w:right="120"/>
-      </w:pPr>
-      <w:r>
-        <w:rPr>
-          <w:rFonts w:ascii="Consolas" w:cs="Consolas" w:hAnsi="Consolas"/>
-          <w:sz w:val="18"/>
-          <w:szCs w:val="18"/>
-          <w:rtl w:val="false"/>
-        </w:rPr>
-        <w:t xml:space="preserve">export ANTHROPIC_BASE_URL="https://api.intelligence.sotoon.ir/inference/"</w:t>
-      </w:r>
-    </w:p>
-    <w:p>
-      <w:pPr>
-        <w:shd w:fill="F3F3F6" w:color="auto" w:val="clear"/>
-        <w:spacing w:after="200" w:line="260"/>
-        <w:ind w:left="120" w:right="120"/>
-      </w:pPr>
-      <w:r>
-        <w:rPr>
-          <w:rFonts w:ascii="Consolas" w:cs="Consolas" w:hAnsi="Consolas"/>
-          <w:sz w:val="18"/>
-          <w:szCs w:val="18"/>
-          <w:rtl w:val="false"/>
-        </w:rPr>
-        <w:t xml:space="preserve">export ANTHROPIC_AUTH_TOKEN="کلید-شما"</w:t>
-      </w:r>
-    </w:p>
-    <w:p>
-      <w:pPr>
-        <w:bidi/>
-        <w:spacing w:after="120" w:line="320"/>
-      </w:pPr>
-      <w:r>
-        <w:rPr>
-          <w:rtl/>
-        </w:rPr>
-        <w:t xml:space="preserve">Windows (PowerShell). برای همین نشست:</w:t>
-      </w:r>
-    </w:p>
-    <w:p>
-      <w:pPr>
-        <w:shd w:fill="F3F3F6" w:color="auto" w:val="clear"/>
-        <w:spacing w:after="0" w:line="260"/>
-        <w:ind w:left="120" w:right="120"/>
-      </w:pPr>
-      <w:r>
-        <w:rPr>
-          <w:rFonts w:ascii="Consolas" w:cs="Consolas" w:hAnsi="Consolas"/>
-          <w:sz w:val="18"/>
-          <w:szCs w:val="18"/>
-          <w:rtl w:val="false"/>
-        </w:rPr>
-        <w:t xml:space="preserve">$env:ANTHROPIC_BASE_URL="https://api.intelligence.sotoon.ir/inference/"</w:t>
-      </w:r>
-    </w:p>
-    <w:p>
-      <w:pPr>
-        <w:shd w:fill="F3F3F6" w:color="auto" w:val="clear"/>
-        <w:spacing w:after="200" w:line="260"/>
-        <w:ind w:left="120" w:right="120"/>
-      </w:pPr>
-      <w:r>
-        <w:rPr>
-          <w:rFonts w:ascii="Consolas" w:cs="Consolas" w:hAnsi="Consolas"/>
-          <w:sz w:val="18"/>
-          <w:szCs w:val="18"/>
-          <w:rtl w:val="false"/>
-        </w:rPr>
-        <w:t xml:space="preserve">$env:ANTHROPIC_AUTH_TOKEN="کلید-شما"</w:t>
-      </w:r>
-    </w:p>
-    <w:p>
-      <w:pPr>
-        <w:bidi/>
-        <w:spacing w:after="120" w:line="320"/>
+        <w:t xml:space="preserve">ترمینال</w:t>
+      </w:r>
+      <w:r>
+        <w:rPr>
+          <w:rtl/>
+        </w:rPr>
+        <w:t xml:space="preserve"> به ستون وصل کنید. هر دو بدون اشتراک Claude کار می‌کنند و هزینه بر اساس توکن از حساب ستون محاسبه می‌شود.</w:t>
+      </w:r>
+    </w:p>
+    <w:p>
+      <w:pPr>
+        <w:shd w:fill="FFF4CE" w:color="auto" w:val="clear"/>
+        <w:bidi/>
+        <w:spacing w:after="120" w:before="80" w:line="300"/>
+        <w:ind w:left="200" w:right="200"/>
       </w:pPr>
       <w:r>
         <w:rPr>
@@ -6808,149 +6700,607 @@
           <w:bCs/>
           <w:rtl/>
         </w:rPr>
-        <w:t xml:space="preserve">اجرا با مدل دلخواه:</w:t>
-      </w:r>
-    </w:p>
-    <w:p>
-      <w:pPr>
-        <w:shd w:fill="F3F3F6" w:color="auto" w:val="clear"/>
-        <w:spacing w:after="200" w:line="260"/>
-        <w:ind w:left="120" w:right="120"/>
-      </w:pPr>
-      <w:r>
-        <w:rPr>
-          <w:rFonts w:ascii="Consolas" w:cs="Consolas" w:hAnsi="Consolas"/>
-          <w:sz w:val="18"/>
-          <w:szCs w:val="18"/>
-          <w:rtl w:val="false"/>
-        </w:rPr>
-        <w:t xml:space="preserve">claude --model MODEL_ID</w:t>
-      </w:r>
-    </w:p>
-    <w:p>
-      <w:pPr>
-        <w:bidi/>
-        <w:spacing w:after="120" w:line="320"/>
-      </w:pPr>
-      <w:r>
-        <w:rPr>
-          <w:rtl/>
-        </w:rPr>
-        <w:t xml:space="preserve">یا برای همیشه: </w:t>
-      </w:r>
-      <w:r>
-        <w:rPr>
-          <w:rFonts w:ascii="Consolas" w:cs="Consolas" w:hAnsi="Consolas"/>
-          <w:sz w:val="19"/>
-          <w:szCs w:val="19"/>
-          <w:shd w:fill="EFEFEF" w:color="auto" w:val="clear"/>
-          <w:rtl w:val="false"/>
-        </w:rPr>
-        <w:t xml:space="preserve">export ANTHROPIC_MODEL="MODEL_ID"</w:t>
-      </w:r>
-      <w:r>
-        <w:rPr>
-          <w:rtl w:val="false"/>
-        </w:rPr>
-        <w:t xml:space="preserve">.</w:t>
-      </w:r>
-    </w:p>
-    <w:p>
-      <w:pPr>
-        <w:shd w:fill="FFF4CE" w:color="auto" w:val="clear"/>
-        <w:bidi/>
-        <w:spacing w:after="120" w:before="80" w:line="300"/>
-        <w:ind w:left="200" w:right="200"/>
-      </w:pPr>
-      <w:r>
-        <w:rPr>
-          <w:rtl w:val="false"/>
-        </w:rPr>
-        <w:t xml:space="preserve">⚠️ </w:t>
-      </w:r>
-      <w:r>
-        <w:rPr>
-          <w:i/>
-          <w:iCs/>
-          <w:rtl/>
-        </w:rPr>
-        <w:t xml:space="preserve">نیاز به تأیید:</w:t>
-      </w:r>
-      <w:r>
-        <w:rPr>
-          <w:rtl/>
-        </w:rPr>
-        <w:t xml:space="preserve"> Claude Code برای کارهای سبک پس‌زمینه از یک مدل کوچک جدا استفاده می‌کند. اگر خطای «مدل پیدا نشد» دیدید، یک مدل سبک از لیست انتخاب کنید و تنظیم کنید: </w:t>
-      </w:r>
-      <w:r>
-        <w:rPr>
-          <w:rFonts w:ascii="Consolas" w:cs="Consolas" w:hAnsi="Consolas"/>
-          <w:sz w:val="19"/>
-          <w:szCs w:val="19"/>
-          <w:shd w:fill="EFEFEF" w:color="auto" w:val="clear"/>
-          <w:rtl w:val="false"/>
-        </w:rPr>
-        <w:t xml:space="preserve">export ANTHROPIC_DEFAULT_HAIKU_MODEL="MODEL_ID_سبک"</w:t>
-      </w:r>
-    </w:p>
-    <w:p>
-      <w:pPr>
-        <w:pBdr>
-          <w:bottom w:val="single" w:color="D0D0DC" w:sz="6" w:space="1"/>
-        </w:pBdr>
-        <w:spacing w:after="160" w:before="80"/>
-      </w:pPr>
-    </w:p>
-    <w:p>
-      <w:pPr>
-        <w:pStyle w:val="Heading2"/>
-        <w:bidi/>
-      </w:pPr>
-      <w:r>
-        <w:rPr>
-          <w:rtl/>
-        </w:rPr>
-        <w:t xml:space="preserve">GitHub Copilot در VS Code</w:t>
-      </w:r>
-    </w:p>
-    <w:p>
-      <w:pPr>
-        <w:bidi/>
-        <w:spacing w:after="120" w:line="320"/>
-      </w:pPr>
-      <w:r>
-        <w:rPr>
-          <w:rtl/>
-        </w:rPr>
-        <w:t xml:space="preserve">با افزونه‌ی </w:t>
-      </w:r>
-      <w:r>
-        <w:rPr>
-          <w:b/>
-          <w:bCs/>
-          <w:rtl w:val="false"/>
-        </w:rPr>
-        <w:t xml:space="preserve">OAI Compatible Provider for Copilot</w:t>
-      </w:r>
-      <w:r>
-        <w:rPr>
-          <w:rtl/>
-        </w:rPr>
-        <w:t xml:space="preserve"> مدل‌های ستون را به Copilot اضافه می‌کنید.</w:t>
-      </w:r>
-    </w:p>
-    <w:p>
-      <w:pPr>
-        <w:bidi/>
-        <w:spacing w:after="120" w:line="320"/>
-      </w:pPr>
-      <w:r>
-        <w:rPr>
-          <w:b/>
-          <w:bCs/>
-          <w:rtl/>
-        </w:rPr>
-        <w:t xml:space="preserve">۱. نصب افزونه</w:t>
+        <w:t xml:space="preserve">اپ دسکتاپ و وب Claude Code (claude.ai/code) به‌طور پیش‌فرض به ستون وصل نمی‌شوند.</w:t>
+      </w:r>
+      <w:r>
+        <w:rPr>
+          <w:rtl/>
+        </w:rPr>
+        <w:t xml:space="preserve"> وب همیشه از سرور خود Anthropic استفاده می‌کند و اپ دسکتاپ فقط با تنظیم جداگانه‌ی «Third-Party Inference» ممکن است. اشتراک Claude هم فقط برای همان‌ها لازم است، نه برای اتصال به ستون.</w:t>
+      </w:r>
+    </w:p>
+    <w:p>
+      <w:pPr>
+        <w:pStyle w:val="Heading3"/>
+        <w:bidi/>
+      </w:pPr>
+      <w:r>
+        <w:rPr>
+          <w:rtl/>
+        </w:rPr>
+        <w:t xml:space="preserve">تنظیمات لازم (برای هر دو روش)</w:t>
+      </w:r>
+    </w:p>
+    <w:tbl>
+      <w:tblPr>
+        <w:bidiVisual/>
+        <w:tblW w:type="dxa" w:w="9638"/>
+        <w:tblBorders>
+          <w:top w:val="single" w:color="auto" w:sz="4"/>
+          <w:left w:val="single" w:color="auto" w:sz="4"/>
+          <w:bottom w:val="single" w:color="auto" w:sz="4"/>
+          <w:right w:val="single" w:color="auto" w:sz="4"/>
+          <w:insideH w:val="single" w:color="auto" w:sz="4"/>
+          <w:insideV w:val="single" w:color="auto" w:sz="4"/>
+        </w:tblBorders>
+      </w:tblPr>
+      <w:tblGrid>
+        <w:gridCol w:w="2966"/>
+        <w:gridCol w:w="3336"/>
+        <w:gridCol w:w="3336"/>
+      </w:tblGrid>
+      <w:tr>
+        <w:trPr>
+          <w:cantSplit/>
+          <w:tblHeader/>
+        </w:trPr>
+        <w:tc>
+          <w:tcPr>
+            <w:tcW w:type="dxa" w:w="2966"/>
+            <w:tcBorders>
+              <w:top w:val="single" w:color="C9C9D6" w:sz="4"/>
+              <w:left w:val="single" w:color="C9C9D6" w:sz="4"/>
+              <w:bottom w:val="single" w:color="C9C9D6" w:sz="4"/>
+              <w:right w:val="single" w:color="C9C9D6" w:sz="4"/>
+            </w:tcBorders>
+            <w:shd w:fill="EDE8FA" w:color="auto" w:val="clear"/>
+            <w:tcMar>
+              <w:top w:type="dxa" w:w="70"/>
+              <w:left w:type="dxa" w:w="110"/>
+              <w:bottom w:type="dxa" w:w="70"/>
+              <w:right w:type="dxa" w:w="110"/>
+            </w:tcMar>
+          </w:tcPr>
+          <w:p>
+            <w:pPr>
+              <w:bidi/>
+              <w:spacing w:after="0" w:line="290"/>
+            </w:pPr>
+            <w:r>
+              <w:rPr>
+                <w:b/>
+                <w:bCs/>
+                <w:rtl/>
+              </w:rPr>
+              <w:t xml:space="preserve">متغیر</w:t>
+            </w:r>
+          </w:p>
+        </w:tc>
+        <w:tc>
+          <w:tcPr>
+            <w:tcW w:type="dxa" w:w="3336"/>
+            <w:tcBorders>
+              <w:top w:val="single" w:color="C9C9D6" w:sz="4"/>
+              <w:left w:val="single" w:color="C9C9D6" w:sz="4"/>
+              <w:bottom w:val="single" w:color="C9C9D6" w:sz="4"/>
+              <w:right w:val="single" w:color="C9C9D6" w:sz="4"/>
+            </w:tcBorders>
+            <w:shd w:fill="EDE8FA" w:color="auto" w:val="clear"/>
+            <w:tcMar>
+              <w:top w:type="dxa" w:w="70"/>
+              <w:left w:type="dxa" w:w="110"/>
+              <w:bottom w:type="dxa" w:w="70"/>
+              <w:right w:type="dxa" w:w="110"/>
+            </w:tcMar>
+          </w:tcPr>
+          <w:p>
+            <w:pPr>
+              <w:bidi/>
+              <w:spacing w:after="0" w:line="290"/>
+            </w:pPr>
+            <w:r>
+              <w:rPr>
+                <w:b/>
+                <w:bCs/>
+                <w:rtl/>
+              </w:rPr>
+              <w:t xml:space="preserve">مقدار</w:t>
+            </w:r>
+          </w:p>
+        </w:tc>
+        <w:tc>
+          <w:tcPr>
+            <w:tcW w:type="dxa" w:w="3336"/>
+            <w:tcBorders>
+              <w:top w:val="single" w:color="C9C9D6" w:sz="4"/>
+              <w:left w:val="single" w:color="C9C9D6" w:sz="4"/>
+              <w:bottom w:val="single" w:color="C9C9D6" w:sz="4"/>
+              <w:right w:val="single" w:color="C9C9D6" w:sz="4"/>
+            </w:tcBorders>
+            <w:shd w:fill="EDE8FA" w:color="auto" w:val="clear"/>
+            <w:tcMar>
+              <w:top w:type="dxa" w:w="70"/>
+              <w:left w:type="dxa" w:w="110"/>
+              <w:bottom w:type="dxa" w:w="70"/>
+              <w:right w:type="dxa" w:w="110"/>
+            </w:tcMar>
+          </w:tcPr>
+          <w:p>
+            <w:pPr>
+              <w:bidi/>
+              <w:spacing w:after="0" w:line="290"/>
+            </w:pPr>
+            <w:r>
+              <w:rPr>
+                <w:b/>
+                <w:bCs/>
+                <w:rtl/>
+              </w:rPr>
+              <w:t xml:space="preserve">توضیح</w:t>
+            </w:r>
+          </w:p>
+        </w:tc>
+      </w:tr>
+      <w:tr>
+        <w:trPr>
+          <w:cantSplit/>
+          <w:tblHeader w:val="off"/>
+        </w:trPr>
+        <w:tc>
+          <w:tcPr>
+            <w:tcW w:type="dxa" w:w="2966"/>
+            <w:tcBorders>
+              <w:top w:val="single" w:color="C9C9D6" w:sz="4"/>
+              <w:left w:val="single" w:color="C9C9D6" w:sz="4"/>
+              <w:bottom w:val="single" w:color="C9C9D6" w:sz="4"/>
+              <w:right w:val="single" w:color="C9C9D6" w:sz="4"/>
+            </w:tcBorders>
+            <w:tcMar>
+              <w:top w:type="dxa" w:w="70"/>
+              <w:left w:type="dxa" w:w="110"/>
+              <w:bottom w:type="dxa" w:w="70"/>
+              <w:right w:type="dxa" w:w="110"/>
+            </w:tcMar>
+          </w:tcPr>
+          <w:p>
+            <w:pPr>
+              <w:bidi/>
+              <w:spacing w:after="0" w:line="290"/>
+            </w:pPr>
+            <w:r>
+              <w:rPr>
+                <w:rFonts w:ascii="Consolas" w:cs="Consolas" w:hAnsi="Consolas"/>
+                <w:sz w:val="19"/>
+                <w:szCs w:val="19"/>
+                <w:shd w:fill="EFEFEF" w:color="auto" w:val="clear"/>
+                <w:rtl w:val="false"/>
+              </w:rPr>
+              <w:t xml:space="preserve">ANTHROPIC_BASE_URL</w:t>
+            </w:r>
+          </w:p>
+        </w:tc>
+        <w:tc>
+          <w:tcPr>
+            <w:tcW w:type="dxa" w:w="3336"/>
+            <w:tcBorders>
+              <w:top w:val="single" w:color="C9C9D6" w:sz="4"/>
+              <w:left w:val="single" w:color="C9C9D6" w:sz="4"/>
+              <w:bottom w:val="single" w:color="C9C9D6" w:sz="4"/>
+              <w:right w:val="single" w:color="C9C9D6" w:sz="4"/>
+            </w:tcBorders>
+            <w:tcMar>
+              <w:top w:type="dxa" w:w="70"/>
+              <w:left w:type="dxa" w:w="110"/>
+              <w:bottom w:type="dxa" w:w="70"/>
+              <w:right w:type="dxa" w:w="110"/>
+            </w:tcMar>
+          </w:tcPr>
+          <w:p>
+            <w:pPr>
+              <w:bidi/>
+              <w:spacing w:after="0" w:line="290"/>
+            </w:pPr>
+            <w:r>
+              <w:rPr>
+                <w:rFonts w:ascii="Consolas" w:cs="Consolas" w:hAnsi="Consolas"/>
+                <w:sz w:val="19"/>
+                <w:szCs w:val="19"/>
+                <w:shd w:fill="EFEFEF" w:color="auto" w:val="clear"/>
+                <w:rtl w:val="false"/>
+              </w:rPr>
+              <w:t xml:space="preserve">https://api.intelligence.sotoon.ir/inference</w:t>
+            </w:r>
+          </w:p>
+        </w:tc>
+        <w:tc>
+          <w:tcPr>
+            <w:tcW w:type="dxa" w:w="3336"/>
+            <w:tcBorders>
+              <w:top w:val="single" w:color="C9C9D6" w:sz="4"/>
+              <w:left w:val="single" w:color="C9C9D6" w:sz="4"/>
+              <w:bottom w:val="single" w:color="C9C9D6" w:sz="4"/>
+              <w:right w:val="single" w:color="C9C9D6" w:sz="4"/>
+            </w:tcBorders>
+            <w:tcMar>
+              <w:top w:type="dxa" w:w="70"/>
+              <w:left w:type="dxa" w:w="110"/>
+              <w:bottom w:type="dxa" w:w="70"/>
+              <w:right w:type="dxa" w:w="110"/>
+            </w:tcMar>
+          </w:tcPr>
+          <w:p>
+            <w:pPr>
+              <w:bidi/>
+              <w:spacing w:after="0" w:line="290"/>
+            </w:pPr>
+            <w:r>
+              <w:rPr>
+                <w:rtl/>
+              </w:rPr>
+              <w:t xml:space="preserve">بدون </w:t>
+            </w:r>
+            <w:r>
+              <w:rPr>
+                <w:rFonts w:ascii="Consolas" w:cs="Consolas" w:hAnsi="Consolas"/>
+                <w:sz w:val="19"/>
+                <w:szCs w:val="19"/>
+                <w:shd w:fill="EFEFEF" w:color="auto" w:val="clear"/>
+                <w:rtl w:val="false"/>
+              </w:rPr>
+              <w:t xml:space="preserve">/</w:t>
+            </w:r>
+            <w:r>
+              <w:rPr>
+                <w:rtl/>
+              </w:rPr>
+              <w:t xml:space="preserve"> آخر و بدون </w:t>
+            </w:r>
+            <w:r>
+              <w:rPr>
+                <w:rFonts w:ascii="Consolas" w:cs="Consolas" w:hAnsi="Consolas"/>
+                <w:sz w:val="19"/>
+                <w:szCs w:val="19"/>
+                <w:shd w:fill="EFEFEF" w:color="auto" w:val="clear"/>
+                <w:rtl w:val="false"/>
+              </w:rPr>
+              <w:t xml:space="preserve">/v1</w:t>
+            </w:r>
+          </w:p>
+        </w:tc>
+      </w:tr>
+      <w:tr>
+        <w:trPr>
+          <w:cantSplit/>
+          <w:tblHeader w:val="off"/>
+        </w:trPr>
+        <w:tc>
+          <w:tcPr>
+            <w:tcW w:type="dxa" w:w="2966"/>
+            <w:tcBorders>
+              <w:top w:val="single" w:color="C9C9D6" w:sz="4"/>
+              <w:left w:val="single" w:color="C9C9D6" w:sz="4"/>
+              <w:bottom w:val="single" w:color="C9C9D6" w:sz="4"/>
+              <w:right w:val="single" w:color="C9C9D6" w:sz="4"/>
+            </w:tcBorders>
+            <w:tcMar>
+              <w:top w:type="dxa" w:w="70"/>
+              <w:left w:type="dxa" w:w="110"/>
+              <w:bottom w:type="dxa" w:w="70"/>
+              <w:right w:type="dxa" w:w="110"/>
+            </w:tcMar>
+          </w:tcPr>
+          <w:p>
+            <w:pPr>
+              <w:bidi/>
+              <w:spacing w:after="0" w:line="290"/>
+            </w:pPr>
+            <w:r>
+              <w:rPr>
+                <w:rFonts w:ascii="Consolas" w:cs="Consolas" w:hAnsi="Consolas"/>
+                <w:sz w:val="19"/>
+                <w:szCs w:val="19"/>
+                <w:shd w:fill="EFEFEF" w:color="auto" w:val="clear"/>
+                <w:rtl w:val="false"/>
+              </w:rPr>
+              <w:t xml:space="preserve">ANTHROPIC_AUTH_TOKEN</w:t>
+            </w:r>
+          </w:p>
+        </w:tc>
+        <w:tc>
+          <w:tcPr>
+            <w:tcW w:type="dxa" w:w="3336"/>
+            <w:tcBorders>
+              <w:top w:val="single" w:color="C9C9D6" w:sz="4"/>
+              <w:left w:val="single" w:color="C9C9D6" w:sz="4"/>
+              <w:bottom w:val="single" w:color="C9C9D6" w:sz="4"/>
+              <w:right w:val="single" w:color="C9C9D6" w:sz="4"/>
+            </w:tcBorders>
+            <w:tcMar>
+              <w:top w:type="dxa" w:w="70"/>
+              <w:left w:type="dxa" w:w="110"/>
+              <w:bottom w:type="dxa" w:w="70"/>
+              <w:right w:type="dxa" w:w="110"/>
+            </w:tcMar>
+          </w:tcPr>
+          <w:p>
+            <w:pPr>
+              <w:bidi/>
+              <w:spacing w:after="0" w:line="290"/>
+            </w:pPr>
+            <w:r>
+              <w:rPr>
+                <w:rtl/>
+              </w:rPr>
+              <w:t xml:space="preserve">کلید API</w:t>
+            </w:r>
+          </w:p>
+        </w:tc>
+        <w:tc>
+          <w:tcPr>
+            <w:tcW w:type="dxa" w:w="3336"/>
+            <w:tcBorders>
+              <w:top w:val="single" w:color="C9C9D6" w:sz="4"/>
+              <w:left w:val="single" w:color="C9C9D6" w:sz="4"/>
+              <w:bottom w:val="single" w:color="C9C9D6" w:sz="4"/>
+              <w:right w:val="single" w:color="C9C9D6" w:sz="4"/>
+            </w:tcBorders>
+            <w:tcMar>
+              <w:top w:type="dxa" w:w="70"/>
+              <w:left w:type="dxa" w:w="110"/>
+              <w:bottom w:type="dxa" w:w="70"/>
+              <w:right w:type="dxa" w:w="110"/>
+            </w:tcMar>
+          </w:tcPr>
+          <w:p>
+            <w:pPr>
+              <w:bidi/>
+              <w:spacing w:after="0" w:line="290"/>
+            </w:pPr>
+          </w:p>
+        </w:tc>
+      </w:tr>
+      <w:tr>
+        <w:trPr>
+          <w:cantSplit/>
+          <w:tblHeader w:val="off"/>
+        </w:trPr>
+        <w:tc>
+          <w:tcPr>
+            <w:tcW w:type="dxa" w:w="2966"/>
+            <w:tcBorders>
+              <w:top w:val="single" w:color="C9C9D6" w:sz="4"/>
+              <w:left w:val="single" w:color="C9C9D6" w:sz="4"/>
+              <w:bottom w:val="single" w:color="C9C9D6" w:sz="4"/>
+              <w:right w:val="single" w:color="C9C9D6" w:sz="4"/>
+            </w:tcBorders>
+            <w:tcMar>
+              <w:top w:type="dxa" w:w="70"/>
+              <w:left w:type="dxa" w:w="110"/>
+              <w:bottom w:type="dxa" w:w="70"/>
+              <w:right w:type="dxa" w:w="110"/>
+            </w:tcMar>
+          </w:tcPr>
+          <w:p>
+            <w:pPr>
+              <w:bidi/>
+              <w:spacing w:after="0" w:line="290"/>
+            </w:pPr>
+            <w:r>
+              <w:rPr>
+                <w:rFonts w:ascii="Consolas" w:cs="Consolas" w:hAnsi="Consolas"/>
+                <w:sz w:val="19"/>
+                <w:szCs w:val="19"/>
+                <w:shd w:fill="EFEFEF" w:color="auto" w:val="clear"/>
+                <w:rtl w:val="false"/>
+              </w:rPr>
+              <w:t xml:space="preserve">ANTHROPIC_MODEL</w:t>
+            </w:r>
+          </w:p>
+        </w:tc>
+        <w:tc>
+          <w:tcPr>
+            <w:tcW w:type="dxa" w:w="3336"/>
+            <w:tcBorders>
+              <w:top w:val="single" w:color="C9C9D6" w:sz="4"/>
+              <w:left w:val="single" w:color="C9C9D6" w:sz="4"/>
+              <w:bottom w:val="single" w:color="C9C9D6" w:sz="4"/>
+              <w:right w:val="single" w:color="C9C9D6" w:sz="4"/>
+            </w:tcBorders>
+            <w:tcMar>
+              <w:top w:type="dxa" w:w="70"/>
+              <w:left w:type="dxa" w:w="110"/>
+              <w:bottom w:type="dxa" w:w="70"/>
+              <w:right w:type="dxa" w:w="110"/>
+            </w:tcMar>
+          </w:tcPr>
+          <w:p>
+            <w:pPr>
+              <w:bidi/>
+              <w:spacing w:after="0" w:line="290"/>
+            </w:pPr>
+            <w:r>
+              <w:rPr>
+                <w:rFonts w:ascii="Consolas" w:cs="Consolas" w:hAnsi="Consolas"/>
+                <w:sz w:val="19"/>
+                <w:szCs w:val="19"/>
+                <w:shd w:fill="EFEFEF" w:color="auto" w:val="clear"/>
+                <w:rtl w:val="false"/>
+              </w:rPr>
+              <w:t xml:space="preserve">MODEL_ID</w:t>
+            </w:r>
+          </w:p>
+        </w:tc>
+        <w:tc>
+          <w:tcPr>
+            <w:tcW w:type="dxa" w:w="3336"/>
+            <w:tcBorders>
+              <w:top w:val="single" w:color="C9C9D6" w:sz="4"/>
+              <w:left w:val="single" w:color="C9C9D6" w:sz="4"/>
+              <w:bottom w:val="single" w:color="C9C9D6" w:sz="4"/>
+              <w:right w:val="single" w:color="C9C9D6" w:sz="4"/>
+            </w:tcBorders>
+            <w:tcMar>
+              <w:top w:type="dxa" w:w="70"/>
+              <w:left w:type="dxa" w:w="110"/>
+              <w:bottom w:type="dxa" w:w="70"/>
+              <w:right w:type="dxa" w:w="110"/>
+            </w:tcMar>
+          </w:tcPr>
+          <w:p>
+            <w:pPr>
+              <w:bidi/>
+              <w:spacing w:after="0" w:line="290"/>
+            </w:pPr>
+            <w:r>
+              <w:rPr>
+                <w:rtl/>
+              </w:rPr>
+              <w:t xml:space="preserve">شناسه‌ی مدل از صفحه‌ی </w:t>
+            </w:r>
+            <w:r>
+              <w:rPr>
+                <w:b/>
+                <w:bCs/>
+                <w:rtl/>
+              </w:rPr>
+              <w:t xml:space="preserve">مدل‌ها</w:t>
+            </w:r>
+          </w:p>
+        </w:tc>
+      </w:tr>
+      <w:tr>
+        <w:trPr>
+          <w:cantSplit/>
+          <w:tblHeader w:val="off"/>
+        </w:trPr>
+        <w:tc>
+          <w:tcPr>
+            <w:tcW w:type="dxa" w:w="2966"/>
+            <w:tcBorders>
+              <w:top w:val="single" w:color="C9C9D6" w:sz="4"/>
+              <w:left w:val="single" w:color="C9C9D6" w:sz="4"/>
+              <w:bottom w:val="single" w:color="C9C9D6" w:sz="4"/>
+              <w:right w:val="single" w:color="C9C9D6" w:sz="4"/>
+            </w:tcBorders>
+            <w:tcMar>
+              <w:top w:type="dxa" w:w="70"/>
+              <w:left w:type="dxa" w:w="110"/>
+              <w:bottom w:type="dxa" w:w="70"/>
+              <w:right w:type="dxa" w:w="110"/>
+            </w:tcMar>
+          </w:tcPr>
+          <w:p>
+            <w:pPr>
+              <w:bidi/>
+              <w:spacing w:after="0" w:line="290"/>
+            </w:pPr>
+            <w:r>
+              <w:rPr>
+                <w:rFonts w:ascii="Consolas" w:cs="Consolas" w:hAnsi="Consolas"/>
+                <w:sz w:val="19"/>
+                <w:szCs w:val="19"/>
+                <w:shd w:fill="EFEFEF" w:color="auto" w:val="clear"/>
+                <w:rtl w:val="false"/>
+              </w:rPr>
+              <w:t xml:space="preserve">CLAUDE_CODE_DISABLE_EXPERIMENTAL_BETAS</w:t>
+            </w:r>
+          </w:p>
+        </w:tc>
+        <w:tc>
+          <w:tcPr>
+            <w:tcW w:type="dxa" w:w="3336"/>
+            <w:tcBorders>
+              <w:top w:val="single" w:color="C9C9D6" w:sz="4"/>
+              <w:left w:val="single" w:color="C9C9D6" w:sz="4"/>
+              <w:bottom w:val="single" w:color="C9C9D6" w:sz="4"/>
+              <w:right w:val="single" w:color="C9C9D6" w:sz="4"/>
+            </w:tcBorders>
+            <w:tcMar>
+              <w:top w:type="dxa" w:w="70"/>
+              <w:left w:type="dxa" w:w="110"/>
+              <w:bottom w:type="dxa" w:w="70"/>
+              <w:right w:type="dxa" w:w="110"/>
+            </w:tcMar>
+          </w:tcPr>
+          <w:p>
+            <w:pPr>
+              <w:bidi/>
+              <w:spacing w:after="0" w:line="290"/>
+            </w:pPr>
+            <w:r>
+              <w:rPr>
+                <w:rFonts w:ascii="Consolas" w:cs="Consolas" w:hAnsi="Consolas"/>
+                <w:sz w:val="19"/>
+                <w:szCs w:val="19"/>
+                <w:shd w:fill="EFEFEF" w:color="auto" w:val="clear"/>
+                <w:rtl w:val="false"/>
+              </w:rPr>
+              <w:t xml:space="preserve">1</w:t>
+            </w:r>
+          </w:p>
+        </w:tc>
+        <w:tc>
+          <w:tcPr>
+            <w:tcW w:type="dxa" w:w="3336"/>
+            <w:tcBorders>
+              <w:top w:val="single" w:color="C9C9D6" w:sz="4"/>
+              <w:left w:val="single" w:color="C9C9D6" w:sz="4"/>
+              <w:bottom w:val="single" w:color="C9C9D6" w:sz="4"/>
+              <w:right w:val="single" w:color="C9C9D6" w:sz="4"/>
+            </w:tcBorders>
+            <w:tcMar>
+              <w:top w:type="dxa" w:w="70"/>
+              <w:left w:type="dxa" w:w="110"/>
+              <w:bottom w:type="dxa" w:w="70"/>
+              <w:right w:type="dxa" w:w="110"/>
+            </w:tcMar>
+          </w:tcPr>
+          <w:p>
+            <w:pPr>
+              <w:bidi/>
+              <w:spacing w:after="0" w:line="290"/>
+            </w:pPr>
+            <w:r>
+              <w:rPr>
+                <w:rtl/>
+              </w:rPr>
+              <w:t xml:space="preserve">قابلیت‌های آزمایشی مخصوص Anthropic را خاموش می‌کند. بدون آن مدل‌های غیر Claude خطای </w:t>
+            </w:r>
+            <w:r>
+              <w:rPr>
+                <w:rFonts w:ascii="Consolas" w:cs="Consolas" w:hAnsi="Consolas"/>
+                <w:sz w:val="19"/>
+                <w:szCs w:val="19"/>
+                <w:shd w:fill="EFEFEF" w:color="auto" w:val="clear"/>
+                <w:rtl w:val="false"/>
+              </w:rPr>
+              <w:t xml:space="preserve">400</w:t>
+            </w:r>
+            <w:r>
+              <w:rPr>
+                <w:rtl/>
+              </w:rPr>
+              <w:t xml:space="preserve"> می‌دهند.</w:t>
+            </w:r>
+          </w:p>
+        </w:tc>
+      </w:tr>
+    </w:tbl>
+    <w:p>
+      <w:pPr>
+        <w:spacing w:after="160"/>
+      </w:pPr>
+    </w:p>
+    <w:p>
+      <w:pPr>
+        <w:pStyle w:val="Heading3"/>
+        <w:bidi/>
+      </w:pPr>
+      <w:r>
+        <w:rPr>
+          <w:rtl/>
+        </w:rPr>
+        <w:t xml:space="preserve">روش ۱: افزونه‌ی VS Code (پیشنهادی)</w:t>
       </w:r>
     </w:p>
     <w:p>
@@ -6967,39 +7317,21 @@
         <w:rPr>
           <w:rtl/>
         </w:rPr>
-        <w:t xml:space="preserve">بخش Extensions را باز کنید (</w:t>
-      </w:r>
-      <w:r>
-        <w:rPr>
-          <w:rFonts w:ascii="Consolas" w:cs="Consolas" w:hAnsi="Consolas"/>
-          <w:sz w:val="19"/>
-          <w:szCs w:val="19"/>
-          <w:shd w:fill="EFEFEF" w:color="auto" w:val="clear"/>
-          <w:rtl w:val="false"/>
-        </w:rPr>
-        <w:t xml:space="preserve">Cmd+Shift+X</w:t>
-      </w:r>
-      <w:r>
-        <w:rPr>
-          <w:rtl/>
-        </w:rPr>
-        <w:t xml:space="preserve"> یا </w:t>
-      </w:r>
-      <w:r>
-        <w:rPr>
-          <w:rFonts w:ascii="Consolas" w:cs="Consolas" w:hAnsi="Consolas"/>
-          <w:sz w:val="19"/>
-          <w:szCs w:val="19"/>
-          <w:shd w:fill="EFEFEF" w:color="auto" w:val="clear"/>
-          <w:rtl w:val="false"/>
-        </w:rPr>
-        <w:t xml:space="preserve">Ctrl+Shift+X</w:t>
-      </w:r>
-      <w:r>
-        <w:rPr>
-          <w:rtl w:val="false"/>
-        </w:rPr>
-        <w:t xml:space="preserve">).</w:t>
+        <w:t xml:space="preserve">در Extensions، افزونه‌ی </w:t>
+      </w:r>
+      <w:r>
+        <w:rPr>
+          <w:b/>
+          <w:bCs/>
+          <w:rtl w:val="false"/>
+        </w:rPr>
+        <w:t xml:space="preserve">Claude Code</w:t>
+      </w:r>
+      <w:r>
+        <w:rPr>
+          <w:rtl/>
+        </w:rPr>
+        <w:t xml:space="preserve"> (ناشر: Anthropic) را نصب کنید. این افزونه نسخه‌ی خودش از Claude Code را همراه دارد و نصب جداگانه‌ی ترمینالی لازم نیست.</w:t>
       </w:r>
     </w:p>
     <w:p>
@@ -7014,23 +7346,178 @@
       </w:pPr>
       <w:r>
         <w:rPr>
-          <w:rtl/>
-        </w:rPr>
-        <w:t xml:space="preserve">عبارت «OAI Compatible Provider for Copilot» را جستجو و نصب کنید.</w:t>
-      </w:r>
-    </w:p>
-    <w:p>
-      <w:pPr>
-        <w:bidi/>
-        <w:spacing w:after="120" w:line="320"/>
-      </w:pPr>
+          <w:rFonts w:ascii="Consolas" w:cs="Consolas" w:hAnsi="Consolas"/>
+          <w:sz w:val="19"/>
+          <w:szCs w:val="19"/>
+          <w:shd w:fill="EFEFEF" w:color="auto" w:val="clear"/>
+          <w:rtl w:val="false"/>
+        </w:rPr>
+        <w:t xml:space="preserve">Cmd+Shift+P</w:t>
+      </w:r>
+      <w:r>
+        <w:rPr>
+          <w:rtl/>
+        </w:rPr>
+        <w:t xml:space="preserve"> (در Windows: </w:t>
+      </w:r>
+      <w:r>
+        <w:rPr>
+          <w:rFonts w:ascii="Consolas" w:cs="Consolas" w:hAnsi="Consolas"/>
+          <w:sz w:val="19"/>
+          <w:szCs w:val="19"/>
+          <w:shd w:fill="EFEFEF" w:color="auto" w:val="clear"/>
+          <w:rtl w:val="false"/>
+        </w:rPr>
+        <w:t xml:space="preserve">Ctrl+Shift+P</w:t>
+      </w:r>
+      <w:r>
+        <w:rPr>
+          <w:rtl/>
+        </w:rPr>
+        <w:t xml:space="preserve">) را بزنید و </w:t>
+      </w:r>
       <w:r>
         <w:rPr>
           <w:b/>
           <w:bCs/>
-          <w:rtl/>
-        </w:rPr>
-        <w:t xml:space="preserve">۲. تنظیم آدرس و کلید</w:t>
+          <w:rtl w:val="false"/>
+        </w:rPr>
+        <w:t xml:space="preserve">Preferences: Open User Settings (JSON)</w:t>
+      </w:r>
+      <w:r>
+        <w:rPr>
+          <w:rtl/>
+        </w:rPr>
+        <w:t xml:space="preserve"> را انتخاب کنید.</w:t>
+      </w:r>
+    </w:p>
+    <w:p>
+      <w:pPr>
+        <w:pStyle w:val="ListParagraph"/>
+        <w:numPr>
+          <w:ilvl w:val="0"/>
+          <w:numId w:val="4"/>
+        </w:numPr>
+        <w:bidi/>
+        <w:spacing w:after="120" w:line="320"/>
+      </w:pPr>
+      <w:r>
+        <w:rPr>
+          <w:rtl/>
+        </w:rPr>
+        <w:t xml:space="preserve">این بلوک را داخل آکولاد اصلی فایل اضافه کنید. اگر خط قبلی ویرگول ندارد، ویرگول بگذارید:</w:t>
+      </w:r>
+    </w:p>
+    <w:p>
+      <w:pPr>
+        <w:shd w:fill="F3F3F6" w:color="auto" w:val="clear"/>
+        <w:spacing w:after="0" w:line="260"/>
+        <w:ind w:left="120" w:right="120"/>
+      </w:pPr>
+      <w:r>
+        <w:rPr>
+          <w:rFonts w:ascii="Consolas" w:cs="Consolas" w:hAnsi="Consolas"/>
+          <w:sz w:val="18"/>
+          <w:szCs w:val="18"/>
+          <w:rtl w:val="false"/>
+        </w:rPr>
+        <w:t xml:space="preserve">"claudeCode.environmentVariables": [</w:t>
+      </w:r>
+    </w:p>
+    <w:p>
+      <w:pPr>
+        <w:shd w:fill="F3F3F6" w:color="auto" w:val="clear"/>
+        <w:spacing w:after="0" w:line="260"/>
+        <w:ind w:left="120" w:right="120"/>
+      </w:pPr>
+      <w:r>
+        <w:rPr>
+          <w:rFonts w:ascii="Consolas" w:cs="Consolas" w:hAnsi="Consolas"/>
+          <w:sz w:val="18"/>
+          <w:szCs w:val="18"/>
+          <w:rtl w:val="false"/>
+        </w:rPr>
+        <w:t xml:space="preserve">{ "name": "ANTHROPIC_BASE_URL", "value": "https://api.intelligence.sotoon.ir/inference" },</w:t>
+      </w:r>
+    </w:p>
+    <w:p>
+      <w:pPr>
+        <w:shd w:fill="F3F3F6" w:color="auto" w:val="clear"/>
+        <w:spacing w:after="0" w:line="260"/>
+        <w:ind w:left="120" w:right="120"/>
+      </w:pPr>
+      <w:r>
+        <w:rPr>
+          <w:rFonts w:ascii="Consolas" w:cs="Consolas" w:hAnsi="Consolas"/>
+          <w:sz w:val="18"/>
+          <w:szCs w:val="18"/>
+          <w:rtl w:val="false"/>
+        </w:rPr>
+        <w:t xml:space="preserve">{ "name": "ANTHROPIC_AUTH_TOKEN", "value": "کلید-شما" },</w:t>
+      </w:r>
+    </w:p>
+    <w:p>
+      <w:pPr>
+        <w:shd w:fill="F3F3F6" w:color="auto" w:val="clear"/>
+        <w:spacing w:after="0" w:line="260"/>
+        <w:ind w:left="120" w:right="120"/>
+      </w:pPr>
+      <w:r>
+        <w:rPr>
+          <w:rFonts w:ascii="Consolas" w:cs="Consolas" w:hAnsi="Consolas"/>
+          <w:sz w:val="18"/>
+          <w:szCs w:val="18"/>
+          <w:rtl w:val="false"/>
+        </w:rPr>
+        <w:t xml:space="preserve">{ "name": "ANTHROPIC_MODEL", "value": "MODEL_ID" },</w:t>
+      </w:r>
+    </w:p>
+    <w:p>
+      <w:pPr>
+        <w:shd w:fill="F3F3F6" w:color="auto" w:val="clear"/>
+        <w:spacing w:after="0" w:line="260"/>
+        <w:ind w:left="120" w:right="120"/>
+      </w:pPr>
+      <w:r>
+        <w:rPr>
+          <w:rFonts w:ascii="Consolas" w:cs="Consolas" w:hAnsi="Consolas"/>
+          <w:sz w:val="18"/>
+          <w:szCs w:val="18"/>
+          <w:rtl w:val="false"/>
+        </w:rPr>
+        <w:t xml:space="preserve">{ "name": "CLAUDE_CODE_DISABLE_EXPERIMENTAL_BETAS", "value": "1" }</w:t>
+      </w:r>
+    </w:p>
+    <w:p>
+      <w:pPr>
+        <w:shd w:fill="F3F3F6" w:color="auto" w:val="clear"/>
+        <w:spacing w:after="0" w:line="260"/>
+        <w:ind w:left="120" w:right="120"/>
+      </w:pPr>
+      <w:r>
+        <w:rPr>
+          <w:rFonts w:ascii="Consolas" w:cs="Consolas" w:hAnsi="Consolas"/>
+          <w:sz w:val="18"/>
+          <w:szCs w:val="18"/>
+          <w:rtl w:val="false"/>
+        </w:rPr>
+        <w:t xml:space="preserve">],</w:t>
+      </w:r>
+    </w:p>
+    <w:p>
+      <w:pPr>
+        <w:shd w:fill="F3F3F6" w:color="auto" w:val="clear"/>
+        <w:spacing w:after="200" w:line="260"/>
+        <w:ind w:left="120" w:right="120"/>
+      </w:pPr>
+      <w:r>
+        <w:rPr>
+          <w:rFonts w:ascii="Consolas" w:cs="Consolas" w:hAnsi="Consolas"/>
+          <w:sz w:val="18"/>
+          <w:szCs w:val="18"/>
+          <w:rtl w:val="false"/>
+        </w:rPr>
+        <w:t xml:space="preserve">"claudeCode.disableLoginPrompt": true</w:t>
       </w:r>
     </w:p>
     <w:p>
@@ -7047,7 +7534,7 @@
         <w:rPr>
           <w:rtl/>
         </w:rPr>
-        <w:t xml:space="preserve">Command Palette را باز کنید (</w:t>
+        <w:t xml:space="preserve">فایل را ذخیره کنید و VS Code را کامل ببندید و دوباره باز کنید (</w:t>
       </w:r>
       <w:r>
         <w:rPr>
@@ -7057,23 +7544,7 @@
           <w:shd w:fill="EFEFEF" w:color="auto" w:val="clear"/>
           <w:rtl w:val="false"/>
         </w:rPr>
-        <w:t xml:space="preserve">Cmd+Shift+P</w:t>
-      </w:r>
-      <w:r>
-        <w:rPr>
-          <w:rtl/>
-        </w:rPr>
-        <w:t xml:space="preserve"> یا </w:t>
-      </w:r>
-      <w:r>
-        <w:rPr>
-          <w:rFonts w:ascii="Consolas" w:cs="Consolas" w:hAnsi="Consolas"/>
-          <w:sz w:val="19"/>
-          <w:szCs w:val="19"/>
-          <w:shd w:fill="EFEFEF" w:color="auto" w:val="clear"/>
-          <w:rtl w:val="false"/>
-        </w:rPr>
-        <w:t xml:space="preserve">Ctrl+Shift+P</w:t>
+        <w:t xml:space="preserve">Cmd+Q</w:t>
       </w:r>
       <w:r>
         <w:rPr>
@@ -7096,21 +7567,299 @@
         <w:rPr>
           <w:rtl/>
         </w:rPr>
-        <w:t xml:space="preserve">دستور </w:t>
+        <w:t xml:space="preserve">پنل Claude Code را باز کنید. اگر کادر پیام را دیدید (نه صفحه‌ی ورود)، وصل شده است.</w:t>
+      </w:r>
+    </w:p>
+    <w:p>
+      <w:pPr>
+        <w:shd w:fill="FFF4CE" w:color="auto" w:val="clear"/>
+        <w:bidi/>
+        <w:spacing w:after="120" w:before="80" w:line="300"/>
+        <w:ind w:left="200" w:right="200"/>
+      </w:pPr>
+      <w:r>
+        <w:rPr>
+          <w:rtl/>
+        </w:rPr>
+        <w:t xml:space="preserve">کلید در این فایل به‌صورت متن ساده ذخیره می‌شود. اگر Settings Sync روشن است یا فایل را به اشتراک می‌گذارید، مراقب باشید.</w:t>
+      </w:r>
+    </w:p>
+    <w:p>
+      <w:pPr>
+        <w:pStyle w:val="Heading3"/>
+        <w:bidi/>
+      </w:pPr>
+      <w:r>
+        <w:rPr>
+          <w:rtl/>
+        </w:rPr>
+        <w:t xml:space="preserve">روش ۲: ترمینال</w:t>
+      </w:r>
+    </w:p>
+    <w:p>
+      <w:pPr>
+        <w:bidi/>
+        <w:spacing w:after="120" w:line="320"/>
+      </w:pPr>
+      <w:r>
+        <w:rPr>
+          <w:rtl/>
+        </w:rPr>
+        <w:t xml:space="preserve">نصب (macOS و Linux):</w:t>
+      </w:r>
+    </w:p>
+    <w:p>
+      <w:pPr>
+        <w:shd w:fill="F3F3F6" w:color="auto" w:val="clear"/>
+        <w:spacing w:after="200" w:line="260"/>
+        <w:ind w:left="120" w:right="120"/>
+      </w:pPr>
+      <w:r>
+        <w:rPr>
+          <w:rFonts w:ascii="Consolas" w:cs="Consolas" w:hAnsi="Consolas"/>
+          <w:sz w:val="18"/>
+          <w:szCs w:val="18"/>
+          <w:rtl w:val="false"/>
+        </w:rPr>
+        <w:t xml:space="preserve">curl -fsSL https://claude.ai/install.sh | bash</w:t>
+      </w:r>
+    </w:p>
+    <w:p>
+      <w:pPr>
+        <w:bidi/>
+        <w:spacing w:after="120" w:line="320"/>
+      </w:pPr>
+      <w:r>
+        <w:rPr>
+          <w:rtl/>
+        </w:rPr>
+        <w:t xml:space="preserve">بعد ترمینال را ببندید و دوباره باز کنید و با </w:t>
+      </w:r>
+      <w:r>
+        <w:rPr>
+          <w:rFonts w:ascii="Consolas" w:cs="Consolas" w:hAnsi="Consolas"/>
+          <w:sz w:val="19"/>
+          <w:szCs w:val="19"/>
+          <w:shd w:fill="EFEFEF" w:color="auto" w:val="clear"/>
+          <w:rtl w:val="false"/>
+        </w:rPr>
+        <w:t xml:space="preserve">claude --version</w:t>
+      </w:r>
+      <w:r>
+        <w:rPr>
+          <w:rtl/>
+        </w:rPr>
+        <w:t xml:space="preserve"> مطمئن شوید نصب شده است. سپس:</w:t>
+      </w:r>
+    </w:p>
+    <w:p>
+      <w:pPr>
+        <w:shd w:fill="F3F3F6" w:color="auto" w:val="clear"/>
+        <w:spacing w:after="0" w:line="260"/>
+        <w:ind w:left="120" w:right="120"/>
+      </w:pPr>
+      <w:r>
+        <w:rPr>
+          <w:rFonts w:ascii="Consolas" w:cs="Consolas" w:hAnsi="Consolas"/>
+          <w:sz w:val="18"/>
+          <w:szCs w:val="18"/>
+          <w:rtl w:val="false"/>
+        </w:rPr>
+        <w:t xml:space="preserve">export ANTHROPIC_BASE_URL="https://api.intelligence.sotoon.ir/inference"</w:t>
+      </w:r>
+    </w:p>
+    <w:p>
+      <w:pPr>
+        <w:shd w:fill="F3F3F6" w:color="auto" w:val="clear"/>
+        <w:spacing w:after="0" w:line="260"/>
+        <w:ind w:left="120" w:right="120"/>
+      </w:pPr>
+      <w:r>
+        <w:rPr>
+          <w:rFonts w:ascii="Consolas" w:cs="Consolas" w:hAnsi="Consolas"/>
+          <w:sz w:val="18"/>
+          <w:szCs w:val="18"/>
+          <w:rtl w:val="false"/>
+        </w:rPr>
+        <w:t xml:space="preserve">export ANTHROPIC_AUTH_TOKEN="کلید-شما"</w:t>
+      </w:r>
+    </w:p>
+    <w:p>
+      <w:pPr>
+        <w:shd w:fill="F3F3F6" w:color="auto" w:val="clear"/>
+        <w:spacing w:after="0" w:line="260"/>
+        <w:ind w:left="120" w:right="120"/>
+      </w:pPr>
+      <w:r>
+        <w:rPr>
+          <w:rFonts w:ascii="Consolas" w:cs="Consolas" w:hAnsi="Consolas"/>
+          <w:sz w:val="18"/>
+          <w:szCs w:val="18"/>
+          <w:rtl w:val="false"/>
+        </w:rPr>
+        <w:t xml:space="preserve">export ANTHROPIC_MODEL="MODEL_ID"</w:t>
+      </w:r>
+    </w:p>
+    <w:p>
+      <w:pPr>
+        <w:shd w:fill="F3F3F6" w:color="auto" w:val="clear"/>
+        <w:spacing w:after="0" w:line="260"/>
+        <w:ind w:left="120" w:right="120"/>
+      </w:pPr>
+      <w:r>
+        <w:rPr>
+          <w:rFonts w:ascii="Consolas" w:cs="Consolas" w:hAnsi="Consolas"/>
+          <w:sz w:val="18"/>
+          <w:szCs w:val="18"/>
+          <w:rtl w:val="false"/>
+        </w:rPr>
+        <w:t xml:space="preserve">export CLAUDE_CODE_DISABLE_EXPERIMENTAL_BETAS=1</w:t>
+      </w:r>
+    </w:p>
+    <w:p>
+      <w:pPr>
+        <w:shd w:fill="F3F3F6" w:color="auto" w:val="clear"/>
+        <w:spacing w:after="200" w:line="260"/>
+        <w:ind w:left="120" w:right="120"/>
+      </w:pPr>
+      <w:r>
+        <w:rPr>
+          <w:rFonts w:ascii="Consolas" w:cs="Consolas" w:hAnsi="Consolas"/>
+          <w:sz w:val="18"/>
+          <w:szCs w:val="18"/>
+          <w:rtl w:val="false"/>
+        </w:rPr>
+        <w:t xml:space="preserve">claude</w:t>
+      </w:r>
+    </w:p>
+    <w:p>
+      <w:pPr>
+        <w:bidi/>
+        <w:spacing w:after="120" w:line="320"/>
+      </w:pPr>
+      <w:r>
+        <w:rPr>
+          <w:rtl/>
+        </w:rPr>
+        <w:t xml:space="preserve">برای ماندگار شدن، همین خطوط را به </w:t>
+      </w:r>
+      <w:r>
+        <w:rPr>
+          <w:rFonts w:ascii="Consolas" w:cs="Consolas" w:hAnsi="Consolas"/>
+          <w:sz w:val="19"/>
+          <w:szCs w:val="19"/>
+          <w:shd w:fill="EFEFEF" w:color="auto" w:val="clear"/>
+          <w:rtl w:val="false"/>
+        </w:rPr>
+        <w:t xml:space="preserve">~/.zshrc</w:t>
+      </w:r>
+      <w:r>
+        <w:rPr>
+          <w:rtl/>
+        </w:rPr>
+        <w:t xml:space="preserve"> اضافه کنید. روی Windows از </w:t>
+      </w:r>
+      <w:r>
+        <w:rPr>
+          <w:rFonts w:ascii="Consolas" w:cs="Consolas" w:hAnsi="Consolas"/>
+          <w:sz w:val="19"/>
+          <w:szCs w:val="19"/>
+          <w:shd w:fill="EFEFEF" w:color="auto" w:val="clear"/>
+          <w:rtl w:val="false"/>
+        </w:rPr>
+        <w:t xml:space="preserve">$env:NAME="..."</w:t>
+      </w:r>
+      <w:r>
+        <w:rPr>
+          <w:rtl/>
+        </w:rPr>
+        <w:t xml:space="preserve"> در PowerShell استفاده کنید. داخل Claude Code دستور </w:t>
+      </w:r>
+      <w:r>
+        <w:rPr>
+          <w:rFonts w:ascii="Consolas" w:cs="Consolas" w:hAnsi="Consolas"/>
+          <w:sz w:val="19"/>
+          <w:szCs w:val="19"/>
+          <w:shd w:fill="EFEFEF" w:color="auto" w:val="clear"/>
+          <w:rtl w:val="false"/>
+        </w:rPr>
+        <w:t xml:space="preserve">/status</w:t>
+      </w:r>
+      <w:r>
+        <w:rPr>
+          <w:rtl/>
+        </w:rPr>
+        <w:t xml:space="preserve"> آدرس و منبع کلید را نشان می‌دهد.</w:t>
+      </w:r>
+    </w:p>
+    <w:p>
+      <w:pPr>
+        <w:pStyle w:val="Heading3"/>
+        <w:bidi/>
+      </w:pPr>
+      <w:r>
+        <w:rPr>
+          <w:rtl/>
+        </w:rPr>
+        <w:t xml:space="preserve">انتخاب مدل در Claude Code</w:t>
+      </w:r>
+    </w:p>
+    <w:p>
+      <w:pPr>
+        <w:bidi/>
+        <w:spacing w:after="120" w:line="320"/>
+      </w:pPr>
+      <w:r>
+        <w:rPr>
+          <w:rtl/>
+        </w:rPr>
+        <w:t xml:space="preserve">منوی </w:t>
+      </w:r>
+      <w:r>
+        <w:rPr>
+          <w:rFonts w:ascii="Consolas" w:cs="Consolas" w:hAnsi="Consolas"/>
+          <w:sz w:val="19"/>
+          <w:szCs w:val="19"/>
+          <w:shd w:fill="EFEFEF" w:color="auto" w:val="clear"/>
+          <w:rtl w:val="false"/>
+        </w:rPr>
+        <w:t xml:space="preserve">/model</w:t>
+      </w:r>
+      <w:r>
+        <w:rPr>
+          <w:rtl/>
+        </w:rPr>
+        <w:t xml:space="preserve"> فقط مدل‌های خود Anthropic (Fable، Sonnet، Haiku) و مدل </w:t>
+      </w:r>
+      <w:r>
+        <w:rPr>
+          <w:rFonts w:ascii="Consolas" w:cs="Consolas" w:hAnsi="Consolas"/>
+          <w:sz w:val="19"/>
+          <w:szCs w:val="19"/>
+          <w:shd w:fill="EFEFEF" w:color="auto" w:val="clear"/>
+          <w:rtl w:val="false"/>
+        </w:rPr>
+        <w:t xml:space="preserve">ANTHROPIC_MODEL</w:t>
+      </w:r>
+      <w:r>
+        <w:rPr>
+          <w:rtl/>
+        </w:rPr>
+        <w:t xml:space="preserve"> را نشان می‌دهد و </w:t>
       </w:r>
       <w:r>
         <w:rPr>
           <w:b/>
           <w:bCs/>
-          <w:rtl w:val="false"/>
-        </w:rPr>
-        <w:t xml:space="preserve">OAICopilot: Open Configuration UI</w:t>
-      </w:r>
-      <w:r>
-        <w:rPr>
-          <w:rtl/>
-        </w:rPr>
-        <w:t xml:space="preserve"> را اجرا کنید.</w:t>
+          <w:rtl/>
+        </w:rPr>
+        <w:t xml:space="preserve">لیست مدل‌های ستون را خودکار نمی‌آورد</w:t>
+      </w:r>
+      <w:r>
+        <w:rPr>
+          <w:rtl/>
+        </w:rPr>
+        <w:t xml:space="preserve">. مدل‌های Anthropic این منو را انتخاب نکنید، چون اسمشان در ستون نیست. برای مدل دیگر:</w:t>
       </w:r>
     </w:p>
     <w:p>
@@ -7118,7 +7867,1022 @@
         <w:pStyle w:val="ListParagraph"/>
         <w:numPr>
           <w:ilvl w:val="0"/>
-          <w:numId w:val="5"/>
+          <w:numId w:val="2"/>
+        </w:numPr>
+        <w:bidi/>
+        <w:spacing w:after="80" w:line="300"/>
+      </w:pPr>
+      <w:r>
+        <w:rPr>
+          <w:b/>
+          <w:bCs/>
+          <w:rtl/>
+        </w:rPr>
+        <w:t xml:space="preserve">تایپ اسم:</w:t>
+      </w:r>
+      <w:r>
+        <w:rPr>
+          <w:rtl/>
+        </w:rPr>
+        <w:t xml:space="preserve"> داخل Claude Code بنویسید </w:t>
+      </w:r>
+      <w:r>
+        <w:rPr>
+          <w:rFonts w:ascii="Consolas" w:cs="Consolas" w:hAnsi="Consolas"/>
+          <w:sz w:val="19"/>
+          <w:szCs w:val="19"/>
+          <w:shd w:fill="EFEFEF" w:color="auto" w:val="clear"/>
+          <w:rtl w:val="false"/>
+        </w:rPr>
+        <w:t xml:space="preserve">/model MODEL_ID</w:t>
+      </w:r>
+      <w:r>
+        <w:rPr>
+          <w:rtl/>
+        </w:rPr>
+        <w:t xml:space="preserve">. هر اسمی که ستون بپذیرد قبول می‌شود.</w:t>
+      </w:r>
+    </w:p>
+    <w:p>
+      <w:pPr>
+        <w:pStyle w:val="ListParagraph"/>
+        <w:numPr>
+          <w:ilvl w:val="0"/>
+          <w:numId w:val="2"/>
+        </w:numPr>
+        <w:bidi/>
+        <w:spacing w:after="80" w:line="300"/>
+      </w:pPr>
+      <w:r>
+        <w:rPr>
+          <w:b/>
+          <w:bCs/>
+          <w:rtl/>
+        </w:rPr>
+        <w:t xml:space="preserve">لیست دلخواه:</w:t>
+      </w:r>
+      <w:r>
+        <w:rPr>
+          <w:rtl/>
+        </w:rPr>
+        <w:t xml:space="preserve"> در فایل </w:t>
+      </w:r>
+      <w:r>
+        <w:rPr>
+          <w:rFonts w:ascii="Consolas" w:cs="Consolas" w:hAnsi="Consolas"/>
+          <w:sz w:val="19"/>
+          <w:szCs w:val="19"/>
+          <w:shd w:fill="EFEFEF" w:color="auto" w:val="clear"/>
+          <w:rtl w:val="false"/>
+        </w:rPr>
+        <w:t xml:space="preserve">~/.claude/settings.json</w:t>
+      </w:r>
+      <w:r>
+        <w:rPr>
+          <w:rtl/>
+        </w:rPr>
+        <w:t xml:space="preserve"> یک </w:t>
+      </w:r>
+      <w:r>
+        <w:rPr>
+          <w:rFonts w:ascii="Consolas" w:cs="Consolas" w:hAnsi="Consolas"/>
+          <w:sz w:val="19"/>
+          <w:szCs w:val="19"/>
+          <w:shd w:fill="EFEFEF" w:color="auto" w:val="clear"/>
+          <w:rtl w:val="false"/>
+        </w:rPr>
+        <w:t xml:space="preserve">modelPicker</w:t>
+      </w:r>
+      <w:r>
+        <w:rPr>
+          <w:rtl/>
+        </w:rPr>
+        <w:t xml:space="preserve"> بسازید و مدل‌های مورد نظرتان را یک بار در آن بنویسید.</w:t>
+      </w:r>
+    </w:p>
+    <w:p>
+      <w:pPr>
+        <w:pStyle w:val="ListParagraph"/>
+        <w:numPr>
+          <w:ilvl w:val="0"/>
+          <w:numId w:val="2"/>
+        </w:numPr>
+        <w:bidi/>
+        <w:spacing w:after="80" w:line="300"/>
+      </w:pPr>
+      <w:r>
+        <w:rPr>
+          <w:b/>
+          <w:bCs/>
+          <w:rtl/>
+        </w:rPr>
+        <w:t xml:space="preserve">لیست خودکار (محدود):</w:t>
+      </w:r>
+      <w:r>
+        <w:rPr>
+          <w:rtl/>
+        </w:rPr>
+        <w:t xml:space="preserve"> با </w:t>
+      </w:r>
+      <w:r>
+        <w:rPr>
+          <w:rFonts w:ascii="Consolas" w:cs="Consolas" w:hAnsi="Consolas"/>
+          <w:sz w:val="19"/>
+          <w:szCs w:val="19"/>
+          <w:shd w:fill="EFEFEF" w:color="auto" w:val="clear"/>
+          <w:rtl w:val="false"/>
+        </w:rPr>
+        <w:t xml:space="preserve">CLAUDE_CODE_ENABLE_GATEWAY_MODEL_DISCOVERY=1</w:t>
+      </w:r>
+      <w:r>
+        <w:rPr>
+          <w:rtl/>
+        </w:rPr>
+        <w:t xml:space="preserve"> فقط مدل‌هایی که اسمشان </w:t>
+      </w:r>
+      <w:r>
+        <w:rPr>
+          <w:rFonts w:ascii="Consolas" w:cs="Consolas" w:hAnsi="Consolas"/>
+          <w:sz w:val="19"/>
+          <w:szCs w:val="19"/>
+          <w:shd w:fill="EFEFEF" w:color="auto" w:val="clear"/>
+          <w:rtl w:val="false"/>
+        </w:rPr>
+        <w:t xml:space="preserve">claude</w:t>
+      </w:r>
+      <w:r>
+        <w:rPr>
+          <w:rtl/>
+        </w:rPr>
+        <w:t xml:space="preserve"> یا </w:t>
+      </w:r>
+      <w:r>
+        <w:rPr>
+          <w:rFonts w:ascii="Consolas" w:cs="Consolas" w:hAnsi="Consolas"/>
+          <w:sz w:val="19"/>
+          <w:szCs w:val="19"/>
+          <w:shd w:fill="EFEFEF" w:color="auto" w:val="clear"/>
+          <w:rtl w:val="false"/>
+        </w:rPr>
+        <w:t xml:space="preserve">anthropic</w:t>
+      </w:r>
+      <w:r>
+        <w:rPr>
+          <w:rtl/>
+        </w:rPr>
+        <w:t xml:space="preserve"> دارد در منو می‌آیند.</w:t>
+      </w:r>
+    </w:p>
+    <w:p>
+      <w:pPr>
+        <w:bidi/>
+        <w:spacing w:after="120" w:line="320"/>
+      </w:pPr>
+      <w:r>
+        <w:rPr>
+          <w:rtl/>
+        </w:rPr>
+        <w:t xml:space="preserve">اسم‌های دقیق را از صفحه‌ی </w:t>
+      </w:r>
+      <w:r>
+        <w:rPr>
+          <w:b/>
+          <w:bCs/>
+          <w:rtl/>
+        </w:rPr>
+        <w:t xml:space="preserve">مدل‌ها</w:t>
+      </w:r>
+      <w:r>
+        <w:rPr>
+          <w:rtl/>
+        </w:rPr>
+        <w:t xml:space="preserve"> بردارید.</w:t>
+      </w:r>
+    </w:p>
+    <w:p>
+      <w:pPr>
+        <w:pStyle w:val="Heading3"/>
+        <w:bidi/>
+      </w:pPr>
+      <w:r>
+        <w:rPr>
+          <w:rtl/>
+        </w:rPr>
+        <w:t xml:space="preserve">محدودیت‌های شناخته‌شده</w:t>
+      </w:r>
+    </w:p>
+    <w:p>
+      <w:pPr>
+        <w:pStyle w:val="ListParagraph"/>
+        <w:numPr>
+          <w:ilvl w:val="0"/>
+          <w:numId w:val="2"/>
+        </w:numPr>
+        <w:bidi/>
+        <w:spacing w:after="80" w:line="300"/>
+      </w:pPr>
+      <w:r>
+        <w:rPr>
+          <w:b/>
+          <w:bCs/>
+          <w:rtl/>
+        </w:rPr>
+        <w:t xml:space="preserve">مدل‌های OpenAI (</w:t>
+      </w:r>
+      <w:r>
+        <w:rPr>
+          <w:rFonts w:ascii="Consolas" w:cs="Consolas" w:hAnsi="Consolas"/>
+          <w:b/>
+          <w:bCs/>
+          <w:sz w:val="19"/>
+          <w:szCs w:val="19"/>
+          <w:shd w:fill="EFEFEF" w:color="auto" w:val="clear"/>
+          <w:rtl w:val="false"/>
+        </w:rPr>
+        <w:t xml:space="preserve">openai/...</w:t>
+      </w:r>
+      <w:r>
+        <w:rPr>
+          <w:b/>
+          <w:bCs/>
+          <w:rtl/>
+        </w:rPr>
+        <w:t xml:space="preserve">) فعلاً خطای </w:t>
+      </w:r>
+      <w:r>
+        <w:rPr>
+          <w:rFonts w:ascii="Consolas" w:cs="Consolas" w:hAnsi="Consolas"/>
+          <w:b/>
+          <w:bCs/>
+          <w:sz w:val="19"/>
+          <w:szCs w:val="19"/>
+          <w:shd w:fill="EFEFEF" w:color="auto" w:val="clear"/>
+          <w:rtl w:val="false"/>
+        </w:rPr>
+        <w:t xml:space="preserve">400 Unknown parameter: 'output_config'</w:t>
+      </w:r>
+      <w:r>
+        <w:rPr>
+          <w:b/>
+          <w:bCs/>
+          <w:rtl/>
+        </w:rPr>
+        <w:t xml:space="preserve"> می‌دهند.</w:t>
+      </w:r>
+      <w:r>
+        <w:rPr>
+          <w:rtl w:val="false"/>
+        </w:rPr>
+        <w:t xml:space="preserve"> ⚠️ </w:t>
+      </w:r>
+      <w:r>
+        <w:rPr>
+          <w:i/>
+          <w:iCs/>
+          <w:rtl/>
+        </w:rPr>
+        <w:t xml:space="preserve">در دست بررسی توسط تیم فنی. تا رفع آن، از مدل‌های دیگر استفاده کنید.</w:t>
+      </w:r>
+    </w:p>
+    <w:p>
+      <w:pPr>
+        <w:pStyle w:val="ListParagraph"/>
+        <w:numPr>
+          <w:ilvl w:val="0"/>
+          <w:numId w:val="2"/>
+        </w:numPr>
+        <w:bidi/>
+        <w:spacing w:after="80" w:line="300"/>
+      </w:pPr>
+      <w:r>
+        <w:rPr>
+          <w:rtl w:val="false"/>
+        </w:rPr>
+        <w:t xml:space="preserve">⚠️ </w:t>
+      </w:r>
+      <w:r>
+        <w:rPr>
+          <w:i/>
+          <w:iCs/>
+          <w:rtl/>
+        </w:rPr>
+        <w:t xml:space="preserve">Anthropic استفاده از Claude Code با مدل‌های غیر Claude را به‌صورت رسمی پشتیبانی نمی‌کند. این روش کار می‌کند ولی ممکن است بعضی قابلیت‌ها (مثل سطح تفکر) رفتار متفاوتی داشته باشند.</w:t>
+      </w:r>
+    </w:p>
+    <w:p>
+      <w:pPr>
+        <w:pStyle w:val="ListParagraph"/>
+        <w:numPr>
+          <w:ilvl w:val="0"/>
+          <w:numId w:val="2"/>
+        </w:numPr>
+        <w:bidi/>
+        <w:spacing w:after="80" w:line="300"/>
+      </w:pPr>
+      <w:r>
+        <w:rPr>
+          <w:rtl w:val="false"/>
+        </w:rPr>
+        <w:t xml:space="preserve">⚠️ </w:t>
+      </w:r>
+      <w:r>
+        <w:rPr>
+          <w:i/>
+          <w:iCs/>
+          <w:rtl/>
+        </w:rPr>
+        <w:t xml:space="preserve">نیاز به تأیید حقوقی/محصول: مستند رسمی Claude Code استفاده از آن را به «کشورهای پشتیبانی‌شده‌ی Anthropic» محدود می‌کند.</w:t>
+      </w:r>
+    </w:p>
+    <w:p>
+      <w:pPr>
+        <w:pStyle w:val="Heading3"/>
+        <w:bidi/>
+      </w:pPr>
+      <w:r>
+        <w:rPr>
+          <w:rtl/>
+        </w:rPr>
+        <w:t xml:space="preserve">اگر کار نکرد</w:t>
+      </w:r>
+    </w:p>
+    <w:tbl>
+      <w:tblPr>
+        <w:bidiVisual/>
+        <w:tblW w:type="dxa" w:w="9638"/>
+        <w:tblBorders>
+          <w:top w:val="single" w:color="auto" w:sz="4"/>
+          <w:left w:val="single" w:color="auto" w:sz="4"/>
+          <w:bottom w:val="single" w:color="auto" w:sz="4"/>
+          <w:right w:val="single" w:color="auto" w:sz="4"/>
+          <w:insideH w:val="single" w:color="auto" w:sz="4"/>
+          <w:insideV w:val="single" w:color="auto" w:sz="4"/>
+        </w:tblBorders>
+      </w:tblPr>
+      <w:tblGrid>
+        <w:gridCol w:w="4349"/>
+        <w:gridCol w:w="5289"/>
+      </w:tblGrid>
+      <w:tr>
+        <w:trPr>
+          <w:cantSplit/>
+          <w:tblHeader/>
+        </w:trPr>
+        <w:tc>
+          <w:tcPr>
+            <w:tcW w:type="dxa" w:w="4349"/>
+            <w:tcBorders>
+              <w:top w:val="single" w:color="C9C9D6" w:sz="4"/>
+              <w:left w:val="single" w:color="C9C9D6" w:sz="4"/>
+              <w:bottom w:val="single" w:color="C9C9D6" w:sz="4"/>
+              <w:right w:val="single" w:color="C9C9D6" w:sz="4"/>
+            </w:tcBorders>
+            <w:shd w:fill="EDE8FA" w:color="auto" w:val="clear"/>
+            <w:tcMar>
+              <w:top w:type="dxa" w:w="70"/>
+              <w:left w:type="dxa" w:w="110"/>
+              <w:bottom w:type="dxa" w:w="70"/>
+              <w:right w:type="dxa" w:w="110"/>
+            </w:tcMar>
+          </w:tcPr>
+          <w:p>
+            <w:pPr>
+              <w:bidi/>
+              <w:spacing w:after="0" w:line="290"/>
+            </w:pPr>
+            <w:r>
+              <w:rPr>
+                <w:b/>
+                <w:bCs/>
+                <w:rtl/>
+              </w:rPr>
+              <w:t xml:space="preserve">نشانه</w:t>
+            </w:r>
+          </w:p>
+        </w:tc>
+        <w:tc>
+          <w:tcPr>
+            <w:tcW w:type="dxa" w:w="5289"/>
+            <w:tcBorders>
+              <w:top w:val="single" w:color="C9C9D6" w:sz="4"/>
+              <w:left w:val="single" w:color="C9C9D6" w:sz="4"/>
+              <w:bottom w:val="single" w:color="C9C9D6" w:sz="4"/>
+              <w:right w:val="single" w:color="C9C9D6" w:sz="4"/>
+            </w:tcBorders>
+            <w:shd w:fill="EDE8FA" w:color="auto" w:val="clear"/>
+            <w:tcMar>
+              <w:top w:type="dxa" w:w="70"/>
+              <w:left w:type="dxa" w:w="110"/>
+              <w:bottom w:type="dxa" w:w="70"/>
+              <w:right w:type="dxa" w:w="110"/>
+            </w:tcMar>
+          </w:tcPr>
+          <w:p>
+            <w:pPr>
+              <w:bidi/>
+              <w:spacing w:after="0" w:line="290"/>
+            </w:pPr>
+            <w:r>
+              <w:rPr>
+                <w:b/>
+                <w:bCs/>
+                <w:rtl/>
+              </w:rPr>
+              <w:t xml:space="preserve">راه‌حل</w:t>
+            </w:r>
+          </w:p>
+        </w:tc>
+      </w:tr>
+      <w:tr>
+        <w:trPr>
+          <w:cantSplit/>
+          <w:tblHeader w:val="off"/>
+        </w:trPr>
+        <w:tc>
+          <w:tcPr>
+            <w:tcW w:type="dxa" w:w="4349"/>
+            <w:tcBorders>
+              <w:top w:val="single" w:color="C9C9D6" w:sz="4"/>
+              <w:left w:val="single" w:color="C9C9D6" w:sz="4"/>
+              <w:bottom w:val="single" w:color="C9C9D6" w:sz="4"/>
+              <w:right w:val="single" w:color="C9C9D6" w:sz="4"/>
+            </w:tcBorders>
+            <w:tcMar>
+              <w:top w:type="dxa" w:w="70"/>
+              <w:left w:type="dxa" w:w="110"/>
+              <w:bottom w:type="dxa" w:w="70"/>
+              <w:right w:type="dxa" w:w="110"/>
+            </w:tcMar>
+          </w:tcPr>
+          <w:p>
+            <w:pPr>
+              <w:bidi/>
+              <w:spacing w:after="0" w:line="290"/>
+            </w:pPr>
+            <w:r>
+              <w:rPr>
+                <w:rtl/>
+              </w:rPr>
+              <w:t xml:space="preserve">افزونه صفحه‌ی ورود نشان می‌دهد</w:t>
+            </w:r>
+          </w:p>
+        </w:tc>
+        <w:tc>
+          <w:tcPr>
+            <w:tcW w:type="dxa" w:w="5289"/>
+            <w:tcBorders>
+              <w:top w:val="single" w:color="C9C9D6" w:sz="4"/>
+              <w:left w:val="single" w:color="C9C9D6" w:sz="4"/>
+              <w:bottom w:val="single" w:color="C9C9D6" w:sz="4"/>
+              <w:right w:val="single" w:color="C9C9D6" w:sz="4"/>
+            </w:tcBorders>
+            <w:tcMar>
+              <w:top w:type="dxa" w:w="70"/>
+              <w:left w:type="dxa" w:w="110"/>
+              <w:bottom w:type="dxa" w:w="70"/>
+              <w:right w:type="dxa" w:w="110"/>
+            </w:tcMar>
+          </w:tcPr>
+          <w:p>
+            <w:pPr>
+              <w:bidi/>
+              <w:spacing w:after="0" w:line="290"/>
+            </w:pPr>
+            <w:r>
+              <w:rPr>
+                <w:rFonts w:ascii="Consolas" w:cs="Consolas" w:hAnsi="Consolas"/>
+                <w:sz w:val="19"/>
+                <w:szCs w:val="19"/>
+                <w:shd w:fill="EFEFEF" w:color="auto" w:val="clear"/>
+                <w:rtl w:val="false"/>
+              </w:rPr>
+              <w:t xml:space="preserve">claudeCode.disableLoginPrompt</w:t>
+            </w:r>
+            <w:r>
+              <w:rPr>
+                <w:rtl/>
+              </w:rPr>
+              <w:t xml:space="preserve"> را </w:t>
+            </w:r>
+            <w:r>
+              <w:rPr>
+                <w:rFonts w:ascii="Consolas" w:cs="Consolas" w:hAnsi="Consolas"/>
+                <w:sz w:val="19"/>
+                <w:szCs w:val="19"/>
+                <w:shd w:fill="EFEFEF" w:color="auto" w:val="clear"/>
+                <w:rtl w:val="false"/>
+              </w:rPr>
+              <w:t xml:space="preserve">true</w:t>
+            </w:r>
+            <w:r>
+              <w:rPr>
+                <w:rtl/>
+              </w:rPr>
+              <w:t xml:space="preserve"> کنید، فایل را ذخیره کنید و VS Code را کامل ببندید و باز کنید.</w:t>
+            </w:r>
+          </w:p>
+        </w:tc>
+      </w:tr>
+      <w:tr>
+        <w:trPr>
+          <w:cantSplit/>
+          <w:tblHeader w:val="off"/>
+        </w:trPr>
+        <w:tc>
+          <w:tcPr>
+            <w:tcW w:type="dxa" w:w="4349"/>
+            <w:tcBorders>
+              <w:top w:val="single" w:color="C9C9D6" w:sz="4"/>
+              <w:left w:val="single" w:color="C9C9D6" w:sz="4"/>
+              <w:bottom w:val="single" w:color="C9C9D6" w:sz="4"/>
+              <w:right w:val="single" w:color="C9C9D6" w:sz="4"/>
+            </w:tcBorders>
+            <w:tcMar>
+              <w:top w:type="dxa" w:w="70"/>
+              <w:left w:type="dxa" w:w="110"/>
+              <w:bottom w:type="dxa" w:w="70"/>
+              <w:right w:type="dxa" w:w="110"/>
+            </w:tcMar>
+          </w:tcPr>
+          <w:p>
+            <w:pPr>
+              <w:bidi/>
+              <w:spacing w:after="0" w:line="290"/>
+            </w:pPr>
+            <w:r>
+              <w:rPr>
+                <w:rFonts w:ascii="Consolas" w:cs="Consolas" w:hAnsi="Consolas"/>
+                <w:sz w:val="19"/>
+                <w:szCs w:val="19"/>
+                <w:shd w:fill="EFEFEF" w:color="auto" w:val="clear"/>
+                <w:rtl w:val="false"/>
+              </w:rPr>
+              <w:t xml:space="preserve">400 ... Unknown parameter</w:t>
+            </w:r>
+          </w:p>
+        </w:tc>
+        <w:tc>
+          <w:tcPr>
+            <w:tcW w:type="dxa" w:w="5289"/>
+            <w:tcBorders>
+              <w:top w:val="single" w:color="C9C9D6" w:sz="4"/>
+              <w:left w:val="single" w:color="C9C9D6" w:sz="4"/>
+              <w:bottom w:val="single" w:color="C9C9D6" w:sz="4"/>
+              <w:right w:val="single" w:color="C9C9D6" w:sz="4"/>
+            </w:tcBorders>
+            <w:tcMar>
+              <w:top w:type="dxa" w:w="70"/>
+              <w:left w:type="dxa" w:w="110"/>
+              <w:bottom w:type="dxa" w:w="70"/>
+              <w:right w:type="dxa" w:w="110"/>
+            </w:tcMar>
+          </w:tcPr>
+          <w:p>
+            <w:pPr>
+              <w:bidi/>
+              <w:spacing w:after="0" w:line="290"/>
+            </w:pPr>
+            <w:r>
+              <w:rPr>
+                <w:rtl/>
+              </w:rPr>
+              <w:t xml:space="preserve">متغیر </w:t>
+            </w:r>
+            <w:r>
+              <w:rPr>
+                <w:rFonts w:ascii="Consolas" w:cs="Consolas" w:hAnsi="Consolas"/>
+                <w:sz w:val="19"/>
+                <w:szCs w:val="19"/>
+                <w:shd w:fill="EFEFEF" w:color="auto" w:val="clear"/>
+                <w:rtl w:val="false"/>
+              </w:rPr>
+              <w:t xml:space="preserve">CLAUDE_CODE_DISABLE_EXPERIMENTAL_BETAS=1</w:t>
+            </w:r>
+            <w:r>
+              <w:rPr>
+                <w:rtl/>
+              </w:rPr>
+              <w:t xml:space="preserve"> را اضافه کنید. اگر برای مدل </w:t>
+            </w:r>
+            <w:r>
+              <w:rPr>
+                <w:rFonts w:ascii="Consolas" w:cs="Consolas" w:hAnsi="Consolas"/>
+                <w:sz w:val="19"/>
+                <w:szCs w:val="19"/>
+                <w:shd w:fill="EFEFEF" w:color="auto" w:val="clear"/>
+                <w:rtl w:val="false"/>
+              </w:rPr>
+              <w:t xml:space="preserve">openai/...</w:t>
+            </w:r>
+            <w:r>
+              <w:rPr>
+                <w:rtl/>
+              </w:rPr>
+              <w:t xml:space="preserve"> است، به بخش «محدودیت‌های شناخته‌شده» نگاه کنید.</w:t>
+            </w:r>
+          </w:p>
+        </w:tc>
+      </w:tr>
+      <w:tr>
+        <w:trPr>
+          <w:cantSplit/>
+          <w:tblHeader w:val="off"/>
+        </w:trPr>
+        <w:tc>
+          <w:tcPr>
+            <w:tcW w:type="dxa" w:w="4349"/>
+            <w:tcBorders>
+              <w:top w:val="single" w:color="C9C9D6" w:sz="4"/>
+              <w:left w:val="single" w:color="C9C9D6" w:sz="4"/>
+              <w:bottom w:val="single" w:color="C9C9D6" w:sz="4"/>
+              <w:right w:val="single" w:color="C9C9D6" w:sz="4"/>
+            </w:tcBorders>
+            <w:tcMar>
+              <w:top w:type="dxa" w:w="70"/>
+              <w:left w:type="dxa" w:w="110"/>
+              <w:bottom w:type="dxa" w:w="70"/>
+              <w:right w:type="dxa" w:w="110"/>
+            </w:tcMar>
+          </w:tcPr>
+          <w:p>
+            <w:pPr>
+              <w:bidi/>
+              <w:spacing w:after="0" w:line="290"/>
+            </w:pPr>
+            <w:r>
+              <w:rPr>
+                <w:rFonts w:ascii="Consolas" w:cs="Consolas" w:hAnsi="Consolas"/>
+                <w:sz w:val="19"/>
+                <w:szCs w:val="19"/>
+                <w:shd w:fill="EFEFEF" w:color="auto" w:val="clear"/>
+                <w:rtl w:val="false"/>
+              </w:rPr>
+              <w:t xml:space="preserve">Invalid model name</w:t>
+            </w:r>
+          </w:p>
+        </w:tc>
+        <w:tc>
+          <w:tcPr>
+            <w:tcW w:type="dxa" w:w="5289"/>
+            <w:tcBorders>
+              <w:top w:val="single" w:color="C9C9D6" w:sz="4"/>
+              <w:left w:val="single" w:color="C9C9D6" w:sz="4"/>
+              <w:bottom w:val="single" w:color="C9C9D6" w:sz="4"/>
+              <w:right w:val="single" w:color="C9C9D6" w:sz="4"/>
+            </w:tcBorders>
+            <w:tcMar>
+              <w:top w:type="dxa" w:w="70"/>
+              <w:left w:type="dxa" w:w="110"/>
+              <w:bottom w:type="dxa" w:w="70"/>
+              <w:right w:type="dxa" w:w="110"/>
+            </w:tcMar>
+          </w:tcPr>
+          <w:p>
+            <w:pPr>
+              <w:bidi/>
+              <w:spacing w:after="0" w:line="290"/>
+            </w:pPr>
+            <w:r>
+              <w:rPr>
+                <w:rtl/>
+              </w:rPr>
+              <w:t xml:space="preserve">شناسه‌ی مدل غلط است یا از منوی Anthropic انتخاب شده. با </w:t>
+            </w:r>
+            <w:r>
+              <w:rPr>
+                <w:rFonts w:ascii="Consolas" w:cs="Consolas" w:hAnsi="Consolas"/>
+                <w:sz w:val="19"/>
+                <w:szCs w:val="19"/>
+                <w:shd w:fill="EFEFEF" w:color="auto" w:val="clear"/>
+                <w:rtl w:val="false"/>
+              </w:rPr>
+              <w:t xml:space="preserve">/model MODEL_ID</w:t>
+            </w:r>
+            <w:r>
+              <w:rPr>
+                <w:rtl/>
+              </w:rPr>
+              <w:t xml:space="preserve"> اسم دقیق را بنویسید.</w:t>
+            </w:r>
+          </w:p>
+        </w:tc>
+      </w:tr>
+      <w:tr>
+        <w:trPr>
+          <w:cantSplit/>
+          <w:tblHeader w:val="off"/>
+        </w:trPr>
+        <w:tc>
+          <w:tcPr>
+            <w:tcW w:type="dxa" w:w="4349"/>
+            <w:tcBorders>
+              <w:top w:val="single" w:color="C9C9D6" w:sz="4"/>
+              <w:left w:val="single" w:color="C9C9D6" w:sz="4"/>
+              <w:bottom w:val="single" w:color="C9C9D6" w:sz="4"/>
+              <w:right w:val="single" w:color="C9C9D6" w:sz="4"/>
+            </w:tcBorders>
+            <w:tcMar>
+              <w:top w:type="dxa" w:w="70"/>
+              <w:left w:type="dxa" w:w="110"/>
+              <w:bottom w:type="dxa" w:w="70"/>
+              <w:right w:type="dxa" w:w="110"/>
+            </w:tcMar>
+          </w:tcPr>
+          <w:p>
+            <w:pPr>
+              <w:bidi/>
+              <w:spacing w:after="0" w:line="290"/>
+            </w:pPr>
+            <w:r>
+              <w:rPr>
+                <w:rFonts w:ascii="Consolas" w:cs="Consolas" w:hAnsi="Consolas"/>
+                <w:sz w:val="19"/>
+                <w:szCs w:val="19"/>
+                <w:shd w:fill="EFEFEF" w:color="auto" w:val="clear"/>
+                <w:rtl w:val="false"/>
+              </w:rPr>
+              <w:t xml:space="preserve">command not found: claude</w:t>
+            </w:r>
+            <w:r>
+              <w:rPr>
+                <w:rtl/>
+              </w:rPr>
+              <w:t xml:space="preserve"> (ترمینال)</w:t>
+            </w:r>
+          </w:p>
+        </w:tc>
+        <w:tc>
+          <w:tcPr>
+            <w:tcW w:type="dxa" w:w="5289"/>
+            <w:tcBorders>
+              <w:top w:val="single" w:color="C9C9D6" w:sz="4"/>
+              <w:left w:val="single" w:color="C9C9D6" w:sz="4"/>
+              <w:bottom w:val="single" w:color="C9C9D6" w:sz="4"/>
+              <w:right w:val="single" w:color="C9C9D6" w:sz="4"/>
+            </w:tcBorders>
+            <w:tcMar>
+              <w:top w:type="dxa" w:w="70"/>
+              <w:left w:type="dxa" w:w="110"/>
+              <w:bottom w:type="dxa" w:w="70"/>
+              <w:right w:type="dxa" w:w="110"/>
+            </w:tcMar>
+          </w:tcPr>
+          <w:p>
+            <w:pPr>
+              <w:bidi/>
+              <w:spacing w:after="0" w:line="290"/>
+            </w:pPr>
+            <w:r>
+              <w:rPr>
+                <w:rtl/>
+              </w:rPr>
+              <w:t xml:space="preserve">ترمینال را ببندید و باز کنید. اگر نشد: </w:t>
+            </w:r>
+            <w:r>
+              <w:rPr>
+                <w:rFonts w:ascii="Consolas" w:cs="Consolas" w:hAnsi="Consolas"/>
+                <w:sz w:val="19"/>
+                <w:szCs w:val="19"/>
+                <w:shd w:fill="EFEFEF" w:color="auto" w:val="clear"/>
+                <w:rtl w:val="false"/>
+              </w:rPr>
+              <w:t xml:space="preserve">echo 'export PATH="$HOME/.local/bin:$PATH"' &gt;&gt; ~/.zshrc</w:t>
+            </w:r>
+          </w:p>
+        </w:tc>
+      </w:tr>
+    </w:tbl>
+    <w:p>
+      <w:pPr>
+        <w:spacing w:after="160"/>
+      </w:pPr>
+    </w:p>
+    <w:p>
+      <w:pPr>
+        <w:pBdr>
+          <w:bottom w:val="single" w:color="D0D0DC" w:sz="6" w:space="1"/>
+        </w:pBdr>
+        <w:spacing w:after="160" w:before="80"/>
+      </w:pPr>
+    </w:p>
+    <w:p>
+      <w:pPr>
+        <w:pStyle w:val="Heading2"/>
+        <w:bidi/>
+      </w:pPr>
+      <w:r>
+        <w:rPr>
+          <w:rtl/>
+        </w:rPr>
+        <w:t xml:space="preserve">GitHub Copilot در VS Code</w:t>
+      </w:r>
+    </w:p>
+    <w:p>
+      <w:pPr>
+        <w:bidi/>
+        <w:spacing w:after="120" w:line="320"/>
+      </w:pPr>
+      <w:r>
+        <w:rPr>
+          <w:rtl/>
+        </w:rPr>
+        <w:t xml:space="preserve">با افزونه‌ی </w:t>
+      </w:r>
+      <w:r>
+        <w:rPr>
+          <w:b/>
+          <w:bCs/>
+          <w:rtl w:val="false"/>
+        </w:rPr>
+        <w:t xml:space="preserve">OAI Compatible Provider for Copilot</w:t>
+      </w:r>
+      <w:r>
+        <w:rPr>
+          <w:rtl/>
+        </w:rPr>
+        <w:t xml:space="preserve"> مدل‌های ستون را به Copilot اضافه می‌کنید.</w:t>
+      </w:r>
+    </w:p>
+    <w:p>
+      <w:pPr>
+        <w:bidi/>
+        <w:spacing w:after="120" w:line="320"/>
+      </w:pPr>
+      <w:r>
+        <w:rPr>
+          <w:b/>
+          <w:bCs/>
+          <w:rtl/>
+        </w:rPr>
+        <w:t xml:space="preserve">۱. نصب افزونه</w:t>
+      </w:r>
+    </w:p>
+    <w:p>
+      <w:pPr>
+        <w:pStyle w:val="ListParagraph"/>
+        <w:numPr>
+          <w:ilvl w:val="0"/>
+          <w:numId w:val="6"/>
+        </w:numPr>
+        <w:bidi/>
+        <w:spacing w:after="120" w:line="320"/>
+      </w:pPr>
+      <w:r>
+        <w:rPr>
+          <w:rtl/>
+        </w:rPr>
+        <w:t xml:space="preserve">بخش Extensions را باز کنید (</w:t>
+      </w:r>
+      <w:r>
+        <w:rPr>
+          <w:rFonts w:ascii="Consolas" w:cs="Consolas" w:hAnsi="Consolas"/>
+          <w:sz w:val="19"/>
+          <w:szCs w:val="19"/>
+          <w:shd w:fill="EFEFEF" w:color="auto" w:val="clear"/>
+          <w:rtl w:val="false"/>
+        </w:rPr>
+        <w:t xml:space="preserve">Cmd+Shift+X</w:t>
+      </w:r>
+      <w:r>
+        <w:rPr>
+          <w:rtl/>
+        </w:rPr>
+        <w:t xml:space="preserve"> یا </w:t>
+      </w:r>
+      <w:r>
+        <w:rPr>
+          <w:rFonts w:ascii="Consolas" w:cs="Consolas" w:hAnsi="Consolas"/>
+          <w:sz w:val="19"/>
+          <w:szCs w:val="19"/>
+          <w:shd w:fill="EFEFEF" w:color="auto" w:val="clear"/>
+          <w:rtl w:val="false"/>
+        </w:rPr>
+        <w:t xml:space="preserve">Ctrl+Shift+X</w:t>
+      </w:r>
+      <w:r>
+        <w:rPr>
+          <w:rtl w:val="false"/>
+        </w:rPr>
+        <w:t xml:space="preserve">).</w:t>
+      </w:r>
+    </w:p>
+    <w:p>
+      <w:pPr>
+        <w:pStyle w:val="ListParagraph"/>
+        <w:numPr>
+          <w:ilvl w:val="0"/>
+          <w:numId w:val="6"/>
+        </w:numPr>
+        <w:bidi/>
+        <w:spacing w:after="120" w:line="320"/>
+      </w:pPr>
+      <w:r>
+        <w:rPr>
+          <w:rtl/>
+        </w:rPr>
+        <w:t xml:space="preserve">عبارت «OAI Compatible Provider for Copilot» را جستجو و نصب کنید.</w:t>
+      </w:r>
+    </w:p>
+    <w:p>
+      <w:pPr>
+        <w:bidi/>
+        <w:spacing w:after="120" w:line="320"/>
+      </w:pPr>
+      <w:r>
+        <w:rPr>
+          <w:b/>
+          <w:bCs/>
+          <w:rtl/>
+        </w:rPr>
+        <w:t xml:space="preserve">۲. تنظیم آدرس و کلید</w:t>
+      </w:r>
+    </w:p>
+    <w:p>
+      <w:pPr>
+        <w:pStyle w:val="ListParagraph"/>
+        <w:numPr>
+          <w:ilvl w:val="0"/>
+          <w:numId w:val="7"/>
+        </w:numPr>
+        <w:bidi/>
+        <w:spacing w:after="120" w:line="320"/>
+      </w:pPr>
+      <w:r>
+        <w:rPr>
+          <w:rtl/>
+        </w:rPr>
+        <w:t xml:space="preserve">Command Palette را باز کنید (</w:t>
+      </w:r>
+      <w:r>
+        <w:rPr>
+          <w:rFonts w:ascii="Consolas" w:cs="Consolas" w:hAnsi="Consolas"/>
+          <w:sz w:val="19"/>
+          <w:szCs w:val="19"/>
+          <w:shd w:fill="EFEFEF" w:color="auto" w:val="clear"/>
+          <w:rtl w:val="false"/>
+        </w:rPr>
+        <w:t xml:space="preserve">Cmd+Shift+P</w:t>
+      </w:r>
+      <w:r>
+        <w:rPr>
+          <w:rtl/>
+        </w:rPr>
+        <w:t xml:space="preserve"> یا </w:t>
+      </w:r>
+      <w:r>
+        <w:rPr>
+          <w:rFonts w:ascii="Consolas" w:cs="Consolas" w:hAnsi="Consolas"/>
+          <w:sz w:val="19"/>
+          <w:szCs w:val="19"/>
+          <w:shd w:fill="EFEFEF" w:color="auto" w:val="clear"/>
+          <w:rtl w:val="false"/>
+        </w:rPr>
+        <w:t xml:space="preserve">Ctrl+Shift+P</w:t>
+      </w:r>
+      <w:r>
+        <w:rPr>
+          <w:rtl w:val="false"/>
+        </w:rPr>
+        <w:t xml:space="preserve">).</w:t>
+      </w:r>
+    </w:p>
+    <w:p>
+      <w:pPr>
+        <w:pStyle w:val="ListParagraph"/>
+        <w:numPr>
+          <w:ilvl w:val="0"/>
+          <w:numId w:val="7"/>
+        </w:numPr>
+        <w:bidi/>
+        <w:spacing w:after="120" w:line="320"/>
+      </w:pPr>
+      <w:r>
+        <w:rPr>
+          <w:rtl/>
+        </w:rPr>
+        <w:t xml:space="preserve">دستور </w:t>
+      </w:r>
+      <w:r>
+        <w:rPr>
+          <w:b/>
+          <w:bCs/>
+          <w:rtl w:val="false"/>
+        </w:rPr>
+        <w:t xml:space="preserve">OAICopilot: Open Configuration UI</w:t>
+      </w:r>
+      <w:r>
+        <w:rPr>
+          <w:rtl/>
+        </w:rPr>
+        <w:t xml:space="preserve"> را اجرا کنید.</w:t>
+      </w:r>
+    </w:p>
+    <w:p>
+      <w:pPr>
+        <w:pStyle w:val="ListParagraph"/>
+        <w:numPr>
+          <w:ilvl w:val="0"/>
+          <w:numId w:val="7"/>
         </w:numPr>
         <w:bidi/>
         <w:spacing w:after="120" w:line="320"/>
@@ -7209,7 +8973,7 @@
         <w:pStyle w:val="ListParagraph"/>
         <w:numPr>
           <w:ilvl w:val="0"/>
-          <w:numId w:val="5"/>
+          <w:numId w:val="7"/>
         </w:numPr>
         <w:bidi/>
         <w:spacing w:after="120" w:line="320"/>
@@ -7254,7 +9018,7 @@
         <w:pStyle w:val="ListParagraph"/>
         <w:numPr>
           <w:ilvl w:val="0"/>
-          <w:numId w:val="6"/>
+          <w:numId w:val="8"/>
         </w:numPr>
         <w:bidi/>
         <w:spacing w:after="120" w:line="320"/>
@@ -7375,7 +9139,7 @@
         <w:pStyle w:val="ListParagraph"/>
         <w:numPr>
           <w:ilvl w:val="0"/>
-          <w:numId w:val="6"/>
+          <w:numId w:val="8"/>
         </w:numPr>
         <w:bidi/>
         <w:spacing w:after="120" w:line="320"/>
@@ -7530,7 +9294,7 @@
         <w:pStyle w:val="ListParagraph"/>
         <w:numPr>
           <w:ilvl w:val="0"/>
-          <w:numId w:val="7"/>
+          <w:numId w:val="9"/>
         </w:numPr>
         <w:bidi/>
         <w:spacing w:after="120" w:line="320"/>
@@ -7547,7 +9311,7 @@
         <w:pStyle w:val="ListParagraph"/>
         <w:numPr>
           <w:ilvl w:val="0"/>
-          <w:numId w:val="7"/>
+          <w:numId w:val="9"/>
         </w:numPr>
         <w:bidi/>
         <w:spacing w:after="120" w:line="320"/>
@@ -7600,7 +9364,7 @@
         <w:pStyle w:val="ListParagraph"/>
         <w:numPr>
           <w:ilvl w:val="0"/>
-          <w:numId w:val="7"/>
+          <w:numId w:val="9"/>
         </w:numPr>
         <w:bidi/>
         <w:spacing w:after="120" w:line="320"/>
@@ -8129,7 +9893,7 @@
         <w:pStyle w:val="ListParagraph"/>
         <w:numPr>
           <w:ilvl w:val="0"/>
-          <w:numId w:val="8"/>
+          <w:numId w:val="10"/>
         </w:numPr>
         <w:bidi/>
         <w:spacing w:after="120" w:line="320"/>
@@ -8174,7 +9938,7 @@
         <w:pStyle w:val="ListParagraph"/>
         <w:numPr>
           <w:ilvl w:val="0"/>
-          <w:numId w:val="8"/>
+          <w:numId w:val="10"/>
         </w:numPr>
         <w:bidi/>
         <w:spacing w:after="120" w:line="320"/>
@@ -8191,7 +9955,7 @@
         <w:pStyle w:val="ListParagraph"/>
         <w:numPr>
           <w:ilvl w:val="0"/>
-          <w:numId w:val="8"/>
+          <w:numId w:val="10"/>
         </w:numPr>
         <w:bidi/>
         <w:spacing w:after="120" w:line="320"/>
@@ -8248,7 +10012,7 @@
         <w:pStyle w:val="ListParagraph"/>
         <w:numPr>
           <w:ilvl w:val="0"/>
-          <w:numId w:val="8"/>
+          <w:numId w:val="10"/>
         </w:numPr>
         <w:bidi/>
         <w:spacing w:after="120" w:line="320"/>
@@ -8289,7 +10053,7 @@
         <w:pStyle w:val="ListParagraph"/>
         <w:numPr>
           <w:ilvl w:val="0"/>
-          <w:numId w:val="8"/>
+          <w:numId w:val="10"/>
         </w:numPr>
         <w:bidi/>
         <w:spacing w:after="120" w:line="320"/>
@@ -8314,7 +10078,7 @@
         <w:pStyle w:val="ListParagraph"/>
         <w:numPr>
           <w:ilvl w:val="0"/>
-          <w:numId w:val="8"/>
+          <w:numId w:val="10"/>
         </w:numPr>
         <w:bidi/>
         <w:spacing w:after="120" w:line="320"/>
@@ -9485,7 +11249,7 @@
         <w:bidi/>
         <w:spacing w:after="120" w:line="320"/>
       </w:pPr>
-      <w:hyperlink w:history="1" r:id="rIdkzbwap5uwmwgiiue8ycsu">
+      <w:hyperlink w:history="1" r:id="rIdoznadqy0rfshegrdsl4ou">
         <w:r>
           <w:rPr>
             <w:rStyle w:val="Hyperlink"/>
@@ -9500,7 +11264,7 @@
         </w:rPr>
         <w:t xml:space="preserve"> · </w:t>
       </w:r>
-      <w:hyperlink w:history="1" r:id="rIdw2ybs5kdayog5mi-95vjy">
+      <w:hyperlink w:history="1" r:id="rIdgc2mqe1t5ilo0y5qa80tn">
         <w:r>
           <w:rPr>
             <w:rStyle w:val="Hyperlink"/>
@@ -9515,7 +11279,7 @@
         </w:rPr>
         <w:t xml:space="preserve"> · </w:t>
       </w:r>
-      <w:hyperlink w:history="1" r:id="rIdxi5i_glnkpy5nw53f2ofh">
+      <w:hyperlink w:history="1" r:id="rIdep8z41lidd5pdjsmlzt3w">
         <w:r>
           <w:rPr>
             <w:rStyle w:val="Hyperlink"/>
@@ -9530,7 +11294,7 @@
         </w:rPr>
         <w:t xml:space="preserve"> · </w:t>
       </w:r>
-      <w:hyperlink w:history="1" r:id="rIdtchtyvt4pllptmo59ey2k">
+      <w:hyperlink w:history="1" r:id="rIdpnta2ybidenvvd5a3nati">
         <w:r>
           <w:rPr>
             <w:rStyle w:val="Hyperlink"/>
@@ -9780,7 +11544,7 @@
   <w:abstractNum w:abstractNumId="5" w15:restartNumberingAfterBreak="0">
     <w:multiLevelType w:val="hybridMultilevel"/>
     <w:lvl w:ilvl="0" w:tentative="1">
-      <w:start w:val="1"/>
+      <w:start w:val="4"/>
       <w:numFmt w:val="decimal"/>
       <w:lvlText w:val="%1."/>
       <w:lvlJc w:val="left"/>
@@ -9814,6 +11578,30 @@
     </w:lvl>
   </w:abstractNum>
   <w:abstractNum w:abstractNumId="8" w15:restartNumberingAfterBreak="0">
+    <w:multiLevelType w:val="hybridMultilevel"/>
+    <w:lvl w:ilvl="0" w:tentative="1">
+      <w:start w:val="1"/>
+      <w:numFmt w:val="decimal"/>
+      <w:lvlText w:val="%1."/>
+      <w:lvlJc w:val="left"/>
+      <w:pPr>
+        <w:ind w:left="720" w:hanging="360"/>
+      </w:pPr>
+    </w:lvl>
+  </w:abstractNum>
+  <w:abstractNum w:abstractNumId="9" w15:restartNumberingAfterBreak="0">
+    <w:multiLevelType w:val="hybridMultilevel"/>
+    <w:lvl w:ilvl="0" w:tentative="1">
+      <w:start w:val="1"/>
+      <w:numFmt w:val="decimal"/>
+      <w:lvlText w:val="%1."/>
+      <w:lvlJc w:val="left"/>
+      <w:pPr>
+        <w:ind w:left="720" w:hanging="360"/>
+      </w:pPr>
+    </w:lvl>
+  </w:abstractNum>
+  <w:abstractNum w:abstractNumId="10" w15:restartNumberingAfterBreak="0">
     <w:multiLevelType w:val="hybridMultilevel"/>
     <w:lvl w:ilvl="0" w:tentative="1">
       <w:start w:val="1"/>
@@ -9852,7 +11640,7 @@
   <w:num w:numId="5">
     <w:abstractNumId w:val="5"/>
     <w:lvlOverride w:ilvl="0">
-      <w:startOverride w:val="1"/>
+      <w:startOverride w:val="4"/>
     </w:lvlOverride>
   </w:num>
   <w:num w:numId="6">
@@ -9869,6 +11657,18 @@
   </w:num>
   <w:num w:numId="8">
     <w:abstractNumId w:val="8"/>
+    <w:lvlOverride w:ilvl="0">
+      <w:startOverride w:val="1"/>
+    </w:lvlOverride>
+  </w:num>
+  <w:num w:numId="9">
+    <w:abstractNumId w:val="9"/>
+    <w:lvlOverride w:ilvl="0">
+      <w:startOverride w:val="1"/>
+    </w:lvlOverride>
+  </w:num>
+  <w:num w:numId="10">
+    <w:abstractNumId w:val="10"/>
     <w:lvlOverride w:ilvl="0">
       <w:startOverride w:val="1"/>
     </w:lvlOverride>

</xml_diff>

<commit_message>
docs: Claude Code verified end-to-end on VS Code extension (non-OpenAI model)
Co-Authored-By: Claude Sonnet 5.5 <noreply@anthropic.com>
Claude-Session: https://claude.ai/code/session_01K2TE7hKB2uwZb8YzUQGaRz
</commit_message>
<xml_diff>
--- a/user-docs/sotoon-api-docs.docx
+++ b/user-docs/sotoon-api-docs.docx
@@ -5764,21 +5764,39 @@
         <w:rPr>
           <w:rtl/>
         </w:rPr>
-        <w:t xml:space="preserve"> اتصال، آدرس بدون اسلش، متغیرهای لازم و خطای مدل‌های OpenAI روی افزونه‌ی VS Code تست شده. جواب‌دادن یک مدل غیر OpenAI </w:t>
-      </w:r>
-      <w:r>
-        <w:rPr>
-          <w:b/>
-          <w:bCs/>
-          <w:rtl/>
-        </w:rPr>
-        <w:t xml:space="preserve">تا انتها (چت + ابزار) هنوز تست نشده</w:t>
-      </w:r>
-      <w:r>
-        <w:rPr>
-          <w:rtl/>
-        </w:rPr>
-        <w:t xml:space="preserve">. روش ترمینال و دسکتاپ از مستند رسمی است.</w:t>
+        <w:t xml:space="preserve"> روی افزونه‌ی VS Code با مدل </w:t>
+      </w:r>
+      <w:r>
+        <w:rPr>
+          <w:rFonts w:ascii="Consolas" w:cs="Consolas" w:hAnsi="Consolas"/>
+          <w:sz w:val="19"/>
+          <w:szCs w:val="19"/>
+          <w:shd w:fill="EFEFEF" w:color="auto" w:val="clear"/>
+          <w:rtl w:val="false"/>
+        </w:rPr>
+        <w:t xml:space="preserve">bytedance-seed/seed-1.6-flash</w:t>
+      </w:r>
+      <w:r>
+        <w:rPr>
+          <w:rtl/>
+        </w:rPr>
+        <w:t xml:space="preserve"> تا انتها تست شده (پیام ساده و خوندن فایل با ابزار). مدل‌های </w:t>
+      </w:r>
+      <w:r>
+        <w:rPr>
+          <w:rFonts w:ascii="Consolas" w:cs="Consolas" w:hAnsi="Consolas"/>
+          <w:sz w:val="19"/>
+          <w:szCs w:val="19"/>
+          <w:shd w:fill="EFEFEF" w:color="auto" w:val="clear"/>
+          <w:rtl w:val="false"/>
+        </w:rPr>
+        <w:t xml:space="preserve">openai/...</w:t>
+      </w:r>
+      <w:r>
+        <w:rPr>
+          <w:rtl/>
+        </w:rPr>
+        <w:t xml:space="preserve"> خطا می‌دهند (در دست بررسی). روش ترمینال و دسکتاپ از مستند رسمی است و تست نشده.</w:t>
       </w:r>
     </w:p>
     <w:p>
@@ -11249,7 +11267,7 @@
         <w:bidi/>
         <w:spacing w:after="120" w:line="320"/>
       </w:pPr>
-      <w:hyperlink w:history="1" r:id="rIdoznadqy0rfshegrdsl4ou">
+      <w:hyperlink w:history="1" r:id="rIdtcyripmqoqn2xo5fz23jw">
         <w:r>
           <w:rPr>
             <w:rStyle w:val="Hyperlink"/>
@@ -11264,7 +11282,7 @@
         </w:rPr>
         <w:t xml:space="preserve"> · </w:t>
       </w:r>
-      <w:hyperlink w:history="1" r:id="rIdgc2mqe1t5ilo0y5qa80tn">
+      <w:hyperlink w:history="1" r:id="rId9scdrq_k_vvsss9t4tytj">
         <w:r>
           <w:rPr>
             <w:rStyle w:val="Hyperlink"/>
@@ -11279,7 +11297,7 @@
         </w:rPr>
         <w:t xml:space="preserve"> · </w:t>
       </w:r>
-      <w:hyperlink w:history="1" r:id="rIdep8z41lidd5pdjsmlzt3w">
+      <w:hyperlink w:history="1" r:id="rIdrmtshv6edpkq7gkusngl7">
         <w:r>
           <w:rPr>
             <w:rStyle w:val="Hyperlink"/>
@@ -11294,7 +11312,7 @@
         </w:rPr>
         <w:t xml:space="preserve"> · </w:t>
       </w:r>
-      <w:hyperlink w:history="1" r:id="rIdpnta2ybidenvvd5a3nati">
+      <w:hyperlink w:history="1" r:id="rIdnso4tvzfbdsl9m9-mdvnj">
         <w:r>
           <w:rPr>
             <w:rStyle w:val="Hyperlink"/>

</xml_diff>

<commit_message>
docs: fix tested model name in Claude Code verification note
Co-Authored-By: Claude Sonnet 5.5 <noreply@anthropic.com>
Claude-Session: https://claude.ai/code/session_01K2TE7hKB2uwZb8YzUQGaRz
</commit_message>
<xml_diff>
--- a/user-docs/sotoon-api-docs.docx
+++ b/user-docs/sotoon-api-docs.docx
@@ -5774,7 +5774,7 @@
           <w:shd w:fill="EFEFEF" w:color="auto" w:val="clear"/>
           <w:rtl w:val="false"/>
         </w:rPr>
-        <w:t xml:space="preserve">bytedance-seed/seed-1.6-flash</w:t>
+        <w:t xml:space="preserve">deepseek/deepseek-v4-flash-0731</w:t>
       </w:r>
       <w:r>
         <w:rPr>
@@ -11267,7 +11267,7 @@
         <w:bidi/>
         <w:spacing w:after="120" w:line="320"/>
       </w:pPr>
-      <w:hyperlink w:history="1" r:id="rIdtcyripmqoqn2xo5fz23jw">
+      <w:hyperlink w:history="1" r:id="rIdqhymdmmfma_a0hy5mio6v">
         <w:r>
           <w:rPr>
             <w:rStyle w:val="Hyperlink"/>
@@ -11282,7 +11282,7 @@
         </w:rPr>
         <w:t xml:space="preserve"> · </w:t>
       </w:r>
-      <w:hyperlink w:history="1" r:id="rId9scdrq_k_vvsss9t4tytj">
+      <w:hyperlink w:history="1" r:id="rIdztqanuqe9bzcxknodzslz">
         <w:r>
           <w:rPr>
             <w:rStyle w:val="Hyperlink"/>
@@ -11297,7 +11297,7 @@
         </w:rPr>
         <w:t xml:space="preserve"> · </w:t>
       </w:r>
-      <w:hyperlink w:history="1" r:id="rIdrmtshv6edpkq7gkusngl7">
+      <w:hyperlink w:history="1" r:id="rId59elgyr1psuybubiluzqm">
         <w:r>
           <w:rPr>
             <w:rStyle w:val="Hyperlink"/>
@@ -11312,7 +11312,7 @@
         </w:rPr>
         <w:t xml:space="preserve"> · </w:t>
       </w:r>
-      <w:hyperlink w:history="1" r:id="rIdnso4tvzfbdsl9m9-mdvnj">
+      <w:hyperlink w:history="1" r:id="rIdxh-mgb6gms46sy-z_p0_c">
         <w:r>
           <w:rPr>
             <w:rStyle w:val="Hyperlink"/>

</xml_diff>

<commit_message>
docs: Claude Code verified for file create/run and /model; add caveats
Co-Authored-By: Claude Sonnet 5.5 <noreply@anthropic.com>
Claude-Session: https://claude.ai/code/session_01K2TE7hKB2uwZb8YzUQGaRz
</commit_message>
<xml_diff>
--- a/user-docs/sotoon-api-docs.docx
+++ b/user-docs/sotoon-api-docs.docx
@@ -5764,7 +5764,7 @@
         <w:rPr>
           <w:rtl/>
         </w:rPr>
-        <w:t xml:space="preserve"> روی افزونه‌ی VS Code با مدل </w:t>
+        <w:t xml:space="preserve"> روی افزونه‌ی VS Code با مدل‌های </w:t>
       </w:r>
       <w:r>
         <w:rPr>
@@ -5780,7 +5780,55 @@
         <w:rPr>
           <w:rtl/>
         </w:rPr>
-        <w:t xml:space="preserve"> تا انتها تست شده (پیام ساده و خوندن فایل با ابزار). مدل‌های </w:t>
+        <w:t xml:space="preserve"> و </w:t>
+      </w:r>
+      <w:r>
+        <w:rPr>
+          <w:rFonts w:ascii="Consolas" w:cs="Consolas" w:hAnsi="Consolas"/>
+          <w:sz w:val="19"/>
+          <w:szCs w:val="19"/>
+          <w:shd w:fill="EFEFEF" w:color="auto" w:val="clear"/>
+          <w:rtl w:val="false"/>
+        </w:rPr>
+        <w:t xml:space="preserve">qwen/qwen3-next-80b-a3b-instruct</w:t>
+      </w:r>
+      <w:r>
+        <w:rPr>
+          <w:rtl/>
+        </w:rPr>
+        <w:t xml:space="preserve"> تا انتها تست شده (پیام ساده، خوندن فایل، ساخت و اجرای فایل، و دستور </w:t>
+      </w:r>
+      <w:r>
+        <w:rPr>
+          <w:rFonts w:ascii="Consolas" w:cs="Consolas" w:hAnsi="Consolas"/>
+          <w:sz w:val="19"/>
+          <w:szCs w:val="19"/>
+          <w:shd w:fill="EFEFEF" w:color="auto" w:val="clear"/>
+          <w:rtl w:val="false"/>
+        </w:rPr>
+        <w:t xml:space="preserve">/model</w:t>
+      </w:r>
+      <w:r>
+        <w:rPr>
+          <w:rtl/>
+        </w:rPr>
+        <w:t xml:space="preserve"> با اسم مدل). ⚠️ هنوز تأیید نشده که بعد از </w:t>
+      </w:r>
+      <w:r>
+        <w:rPr>
+          <w:rFonts w:ascii="Consolas" w:cs="Consolas" w:hAnsi="Consolas"/>
+          <w:sz w:val="19"/>
+          <w:szCs w:val="19"/>
+          <w:shd w:fill="EFEFEF" w:color="auto" w:val="clear"/>
+          <w:rtl w:val="false"/>
+        </w:rPr>
+        <w:t xml:space="preserve">/model</w:t>
+      </w:r>
+      <w:r>
+        <w:rPr>
+          <w:rtl/>
+        </w:rPr>
+        <w:t xml:space="preserve"> برچسب مدل در پایین کادر هم عوض می‌شود. مدل‌های </w:t>
       </w:r>
       <w:r>
         <w:rPr>
@@ -8199,6 +8247,72 @@
       </w:pPr>
       <w:r>
         <w:rPr>
+          <w:rtl/>
+        </w:rPr>
+        <w:t xml:space="preserve">اولین پاسخ بعد از باز کردن VS Code ممکن است ۱۰ تا ۱۵ ثانیه طول بکشد. پاسخ‌های بعدی سریع‌تر است (حدود ۵ ثانیه). ⚠️ </w:t>
+      </w:r>
+      <w:r>
+        <w:rPr>
+          <w:i/>
+          <w:iCs/>
+          <w:rtl/>
+        </w:rPr>
+        <w:t xml:space="preserve">با یک تست و یک مدل اندازه‌گیری شده.</w:t>
+      </w:r>
+    </w:p>
+    <w:p>
+      <w:pPr>
+        <w:pStyle w:val="ListParagraph"/>
+        <w:numPr>
+          <w:ilvl w:val="0"/>
+          <w:numId w:val="2"/>
+        </w:numPr>
+        <w:bidi/>
+        <w:spacing w:after="80" w:line="300"/>
+      </w:pPr>
+      <w:r>
+        <w:rPr>
+          <w:b/>
+          <w:bCs/>
+          <w:rtl/>
+        </w:rPr>
+        <w:t xml:space="preserve">از خود مدل نپرسید «چه مدلی هستی؟».</w:t>
+      </w:r>
+      <w:r>
+        <w:rPr>
+          <w:rtl/>
+        </w:rPr>
+        <w:t xml:space="preserve"> Claude Code به همه‌ی مدل‌ها می‌گوید «تو Claude هستی»، پس هر مدلی همین را جواب می‌دهد. مدل فعلی را با </w:t>
+      </w:r>
+      <w:r>
+        <w:rPr>
+          <w:rFonts w:ascii="Consolas" w:cs="Consolas" w:hAnsi="Consolas"/>
+          <w:sz w:val="19"/>
+          <w:szCs w:val="19"/>
+          <w:shd w:fill="EFEFEF" w:color="auto" w:val="clear"/>
+          <w:rtl w:val="false"/>
+        </w:rPr>
+        <w:t xml:space="preserve">/status</w:t>
+      </w:r>
+      <w:r>
+        <w:rPr>
+          <w:rtl/>
+        </w:rPr>
+        <w:t xml:space="preserve"> ببینید.</w:t>
+      </w:r>
+    </w:p>
+    <w:p>
+      <w:pPr>
+        <w:pStyle w:val="ListParagraph"/>
+        <w:numPr>
+          <w:ilvl w:val="0"/>
+          <w:numId w:val="2"/>
+        </w:numPr>
+        <w:bidi/>
+        <w:spacing w:after="80" w:line="300"/>
+      </w:pPr>
+      <w:r>
+        <w:rPr>
           <w:rtl w:val="false"/>
         </w:rPr>
         <w:t xml:space="preserve">⚠️ </w:t>
@@ -8613,6 +8727,86 @@
             </w:pPr>
             <w:r>
               <w:rPr>
+                <w:rtl/>
+              </w:rPr>
+              <w:t xml:space="preserve">مدل می‌گوید «من Claude هستم»</w:t>
+            </w:r>
+          </w:p>
+        </w:tc>
+        <w:tc>
+          <w:tcPr>
+            <w:tcW w:type="dxa" w:w="5289"/>
+            <w:tcBorders>
+              <w:top w:val="single" w:color="C9C9D6" w:sz="4"/>
+              <w:left w:val="single" w:color="C9C9D6" w:sz="4"/>
+              <w:bottom w:val="single" w:color="C9C9D6" w:sz="4"/>
+              <w:right w:val="single" w:color="C9C9D6" w:sz="4"/>
+            </w:tcBorders>
+            <w:tcMar>
+              <w:top w:type="dxa" w:w="70"/>
+              <w:left w:type="dxa" w:w="110"/>
+              <w:bottom w:type="dxa" w:w="70"/>
+              <w:right w:type="dxa" w:w="110"/>
+            </w:tcMar>
+          </w:tcPr>
+          <w:p>
+            <w:pPr>
+              <w:bidi/>
+              <w:spacing w:after="0" w:line="290"/>
+            </w:pPr>
+            <w:r>
+              <w:rPr>
+                <w:rtl/>
+              </w:rPr>
+              <w:t xml:space="preserve">عادی است و به معنی اشتباه بودن تنظیمات نیست. مدل واقعی را با </w:t>
+            </w:r>
+            <w:r>
+              <w:rPr>
+                <w:rFonts w:ascii="Consolas" w:cs="Consolas" w:hAnsi="Consolas"/>
+                <w:sz w:val="19"/>
+                <w:szCs w:val="19"/>
+                <w:shd w:fill="EFEFEF" w:color="auto" w:val="clear"/>
+                <w:rtl w:val="false"/>
+              </w:rPr>
+              <w:t xml:space="preserve">/status</w:t>
+            </w:r>
+            <w:r>
+              <w:rPr>
+                <w:rtl/>
+              </w:rPr>
+              <w:t xml:space="preserve"> ببینید.</w:t>
+            </w:r>
+          </w:p>
+        </w:tc>
+      </w:tr>
+      <w:tr>
+        <w:trPr>
+          <w:cantSplit/>
+          <w:tblHeader w:val="off"/>
+        </w:trPr>
+        <w:tc>
+          <w:tcPr>
+            <w:tcW w:type="dxa" w:w="4349"/>
+            <w:tcBorders>
+              <w:top w:val="single" w:color="C9C9D6" w:sz="4"/>
+              <w:left w:val="single" w:color="C9C9D6" w:sz="4"/>
+              <w:bottom w:val="single" w:color="C9C9D6" w:sz="4"/>
+              <w:right w:val="single" w:color="C9C9D6" w:sz="4"/>
+            </w:tcBorders>
+            <w:tcMar>
+              <w:top w:type="dxa" w:w="70"/>
+              <w:left w:type="dxa" w:w="110"/>
+              <w:bottom w:type="dxa" w:w="70"/>
+              <w:right w:type="dxa" w:w="110"/>
+            </w:tcMar>
+          </w:tcPr>
+          <w:p>
+            <w:pPr>
+              <w:bidi/>
+              <w:spacing w:after="0" w:line="290"/>
+            </w:pPr>
+            <w:r>
+              <w:rPr>
                 <w:rFonts w:ascii="Consolas" w:cs="Consolas" w:hAnsi="Consolas"/>
                 <w:sz w:val="19"/>
                 <w:szCs w:val="19"/>
@@ -11267,7 +11461,7 @@
         <w:bidi/>
         <w:spacing w:after="120" w:line="320"/>
       </w:pPr>
-      <w:hyperlink w:history="1" r:id="rIdqhymdmmfma_a0hy5mio6v">
+      <w:hyperlink w:history="1" r:id="rId1b4oxr-mtzg6sa12rgukd">
         <w:r>
           <w:rPr>
             <w:rStyle w:val="Hyperlink"/>
@@ -11282,7 +11476,7 @@
         </w:rPr>
         <w:t xml:space="preserve"> · </w:t>
       </w:r>
-      <w:hyperlink w:history="1" r:id="rIdztqanuqe9bzcxknodzslz">
+      <w:hyperlink w:history="1" r:id="rIde8bzp6mbdybf2_9tkyn55">
         <w:r>
           <w:rPr>
             <w:rStyle w:val="Hyperlink"/>
@@ -11297,7 +11491,7 @@
         </w:rPr>
         <w:t xml:space="preserve"> · </w:t>
       </w:r>
-      <w:hyperlink w:history="1" r:id="rId59elgyr1psuybubiluzqm">
+      <w:hyperlink w:history="1" r:id="rIdoq5p1ym5g9mc2pik8zrcj">
         <w:r>
           <w:rPr>
             <w:rStyle w:val="Hyperlink"/>
@@ -11312,7 +11506,7 @@
         </w:rPr>
         <w:t xml:space="preserve"> · </w:t>
       </w:r>
-      <w:hyperlink w:history="1" r:id="rIdxh-mgb6gms46sy-z_p0_c">
+      <w:hyperlink w:history="1" r:id="rId33_okvcyipu_yc0__mh5d">
         <w:r>
           <w:rPr>
             <w:rStyle w:val="Hyperlink"/>

</xml_diff>

<commit_message>
docs: Claude Code /status verification and /model notes
Co-Authored-By: Claude Sonnet 5.5 <noreply@anthropic.com>
Claude-Session: https://claude.ai/code/session_01K2TE7hKB2uwZb8YzUQGaRz
</commit_message>
<xml_diff>
--- a/user-docs/sotoon-api-docs.docx
+++ b/user-docs/sotoon-api-docs.docx
@@ -5812,7 +5812,7 @@
         <w:rPr>
           <w:rtl/>
         </w:rPr>
-        <w:t xml:space="preserve"> با اسم مدل). ⚠️ هنوز تأیید نشده که بعد از </w:t>
+        <w:t xml:space="preserve"> با اسم مدل). </w:t>
       </w:r>
       <w:r>
         <w:rPr>
@@ -5822,13 +5822,13 @@
           <w:shd w:fill="EFEFEF" w:color="auto" w:val="clear"/>
           <w:rtl w:val="false"/>
         </w:rPr>
-        <w:t xml:space="preserve">/model</w:t>
-      </w:r>
-      <w:r>
-        <w:rPr>
-          <w:rtl/>
-        </w:rPr>
-        <w:t xml:space="preserve"> برچسب مدل در پایین کادر هم عوض می‌شود. مدل‌های </w:t>
+        <w:t xml:space="preserve">/status</w:t>
+      </w:r>
+      <w:r>
+        <w:rPr>
+          <w:rtl/>
+        </w:rPr>
+        <w:t xml:space="preserve"> تأیید کرد که مدل، آدرس و کلید درست‌اند. مدل‌های </w:t>
       </w:r>
       <w:r>
         <w:rPr>
@@ -7855,7 +7855,71 @@
         <w:rPr>
           <w:rtl/>
         </w:rPr>
-        <w:t xml:space="preserve"> آدرس و منبع کلید را نشان می‌دهد.</w:t>
+        <w:t xml:space="preserve"> را بزنید: خط </w:t>
+      </w:r>
+      <w:r>
+        <w:rPr>
+          <w:rFonts w:ascii="Consolas" w:cs="Consolas" w:hAnsi="Consolas"/>
+          <w:sz w:val="19"/>
+          <w:szCs w:val="19"/>
+          <w:shd w:fill="EFEFEF" w:color="auto" w:val="clear"/>
+          <w:rtl w:val="false"/>
+        </w:rPr>
+        <w:t xml:space="preserve">Anthropic base URL</w:t>
+      </w:r>
+      <w:r>
+        <w:rPr>
+          <w:rtl/>
+        </w:rPr>
+        <w:t xml:space="preserve"> باید آدرس ستون، خط </w:t>
+      </w:r>
+      <w:r>
+        <w:rPr>
+          <w:rFonts w:ascii="Consolas" w:cs="Consolas" w:hAnsi="Consolas"/>
+          <w:sz w:val="19"/>
+          <w:szCs w:val="19"/>
+          <w:shd w:fill="EFEFEF" w:color="auto" w:val="clear"/>
+          <w:rtl w:val="false"/>
+        </w:rPr>
+        <w:t xml:space="preserve">Auth token</w:t>
+      </w:r>
+      <w:r>
+        <w:rPr>
+          <w:rtl/>
+        </w:rPr>
+        <w:t xml:space="preserve"> باید </w:t>
+      </w:r>
+      <w:r>
+        <w:rPr>
+          <w:rFonts w:ascii="Consolas" w:cs="Consolas" w:hAnsi="Consolas"/>
+          <w:sz w:val="19"/>
+          <w:szCs w:val="19"/>
+          <w:shd w:fill="EFEFEF" w:color="auto" w:val="clear"/>
+          <w:rtl w:val="false"/>
+        </w:rPr>
+        <w:t xml:space="preserve">ANTHROPIC_AUTH_TOKEN</w:t>
+      </w:r>
+      <w:r>
+        <w:rPr>
+          <w:rtl/>
+        </w:rPr>
+        <w:t xml:space="preserve"> و خط </w:t>
+      </w:r>
+      <w:r>
+        <w:rPr>
+          <w:rFonts w:ascii="Consolas" w:cs="Consolas" w:hAnsi="Consolas"/>
+          <w:sz w:val="19"/>
+          <w:szCs w:val="19"/>
+          <w:shd w:fill="EFEFEF" w:color="auto" w:val="clear"/>
+          <w:rtl w:val="false"/>
+        </w:rPr>
+        <w:t xml:space="preserve">Model</w:t>
+      </w:r>
+      <w:r>
+        <w:rPr>
+          <w:rtl/>
+        </w:rPr>
+        <w:t xml:space="preserve"> مدل شما باشد.</w:t>
       </w:r>
     </w:p>
     <w:p>
@@ -7966,7 +8030,55 @@
         <w:rPr>
           <w:rtl/>
         </w:rPr>
-        <w:t xml:space="preserve">. هر اسمی که ستون بپذیرد قبول می‌شود.</w:t>
+        <w:t xml:space="preserve">. هر اسمی که ستون بپذیرد قبول می‌شود. این تغییر فقط برای همان گفتگوست؛ برای عوض کردن مدل پیش‌فرض، </w:t>
+      </w:r>
+      <w:r>
+        <w:rPr>
+          <w:rFonts w:ascii="Consolas" w:cs="Consolas" w:hAnsi="Consolas"/>
+          <w:sz w:val="19"/>
+          <w:szCs w:val="19"/>
+          <w:shd w:fill="EFEFEF" w:color="auto" w:val="clear"/>
+          <w:rtl w:val="false"/>
+        </w:rPr>
+        <w:t xml:space="preserve">ANTHROPIC_MODEL</w:t>
+      </w:r>
+      <w:r>
+        <w:rPr>
+          <w:rtl/>
+        </w:rPr>
+        <w:t xml:space="preserve"> را تغییر دهید. برچسب مدل پایین کادر پیام ممکن است بعد از </w:t>
+      </w:r>
+      <w:r>
+        <w:rPr>
+          <w:rFonts w:ascii="Consolas" w:cs="Consolas" w:hAnsi="Consolas"/>
+          <w:sz w:val="19"/>
+          <w:szCs w:val="19"/>
+          <w:shd w:fill="EFEFEF" w:color="auto" w:val="clear"/>
+          <w:rtl w:val="false"/>
+        </w:rPr>
+        <w:t xml:space="preserve">/model</w:t>
+      </w:r>
+      <w:r>
+        <w:rPr>
+          <w:rtl/>
+        </w:rPr>
+        <w:t xml:space="preserve"> به‌روز نشود؛ مدل واقعی را با </w:t>
+      </w:r>
+      <w:r>
+        <w:rPr>
+          <w:rFonts w:ascii="Consolas" w:cs="Consolas" w:hAnsi="Consolas"/>
+          <w:sz w:val="19"/>
+          <w:szCs w:val="19"/>
+          <w:shd w:fill="EFEFEF" w:color="auto" w:val="clear"/>
+          <w:rtl w:val="false"/>
+        </w:rPr>
+        <w:t xml:space="preserve">/status</w:t>
+      </w:r>
+      <w:r>
+        <w:rPr>
+          <w:rtl/>
+        </w:rPr>
+        <w:t xml:space="preserve"> ببینید.</w:t>
       </w:r>
     </w:p>
     <w:p>
@@ -11461,7 +11573,7 @@
         <w:bidi/>
         <w:spacing w:after="120" w:line="320"/>
       </w:pPr>
-      <w:hyperlink w:history="1" r:id="rId1b4oxr-mtzg6sa12rgukd">
+      <w:hyperlink w:history="1" r:id="rId_oyjqik5ts--60k1epbbe">
         <w:r>
           <w:rPr>
             <w:rStyle w:val="Hyperlink"/>
@@ -11476,7 +11588,7 @@
         </w:rPr>
         <w:t xml:space="preserve"> · </w:t>
       </w:r>
-      <w:hyperlink w:history="1" r:id="rIde8bzp6mbdybf2_9tkyn55">
+      <w:hyperlink w:history="1" r:id="rIdclqnnewngeq3nyubfd4kz">
         <w:r>
           <w:rPr>
             <w:rStyle w:val="Hyperlink"/>
@@ -11491,7 +11603,7 @@
         </w:rPr>
         <w:t xml:space="preserve"> · </w:t>
       </w:r>
-      <w:hyperlink w:history="1" r:id="rIdoq5p1ym5g9mc2pik8zrcj">
+      <w:hyperlink w:history="1" r:id="rIdg1v6ltnzfc3qvglfycez6">
         <w:r>
           <w:rPr>
             <w:rStyle w:val="Hyperlink"/>
@@ -11506,7 +11618,7 @@
         </w:rPr>
         <w:t xml:space="preserve"> · </w:t>
       </w:r>
-      <w:hyperlink w:history="1" r:id="rId33_okvcyipu_yc0__mh5d">
+      <w:hyperlink w:history="1" r:id="rIdd17zzho5bw6va1m4wlujk">
         <w:r>
           <w:rPr>
             <w:rStyle w:val="Hyperlink"/>

</xml_diff>

<commit_message>
docs: add pricing section and model-list freshness guidance to API reference
Co-Authored-By: Claude Sonnet 5.5 <noreply@anthropic.com>
Claude-Session: https://claude.ai/code/session_01K2TE7hKB2uwZb8YzUQGaRz
</commit_message>
<xml_diff>
--- a/user-docs/sotoon-api-docs.docx
+++ b/user-docs/sotoon-api-docs.docx
@@ -2194,6 +2194,159 @@
           <w:rtl/>
         </w:rPr>
         <w:t xml:space="preserve"> معنای خاصی ندارد.</w:t>
+      </w:r>
+    </w:p>
+    <w:p>
+      <w:pPr>
+        <w:pStyle w:val="Heading3"/>
+        <w:bidi/>
+      </w:pPr>
+      <w:r>
+        <w:rPr>
+          <w:rtl/>
+        </w:rPr>
+        <w:t xml:space="preserve">لیست مدل‌ها هر روز ممکن است تغییر کند</w:t>
+      </w:r>
+    </w:p>
+    <w:p>
+      <w:pPr>
+        <w:bidi/>
+        <w:spacing w:after="120" w:line="320"/>
+      </w:pPr>
+      <w:r>
+        <w:rPr>
+          <w:rtl/>
+        </w:rPr>
+        <w:t xml:space="preserve">مدل‌ها هر روز اضافه و کم می‌شوند و اسم بعضی‌شان نسخه یا تاریخ دارد و عوض می‌شود. پس:</w:t>
+      </w:r>
+    </w:p>
+    <w:p>
+      <w:pPr>
+        <w:pStyle w:val="ListParagraph"/>
+        <w:numPr>
+          <w:ilvl w:val="0"/>
+          <w:numId w:val="2"/>
+        </w:numPr>
+        <w:bidi/>
+        <w:spacing w:after="80" w:line="300"/>
+      </w:pPr>
+      <w:r>
+        <w:rPr>
+          <w:rtl/>
+        </w:rPr>
+        <w:t xml:space="preserve">اسم مدل را در کد ثابت نگذارید. آن را در تنظیمات نگه دارید و قبل از استفاده بررسی کنید که هنوز در لیست هست:</w:t>
+      </w:r>
+    </w:p>
+    <w:p>
+      <w:pPr>
+        <w:shd w:fill="F3F3F6" w:color="auto" w:val="clear"/>
+        <w:spacing w:after="0" w:line="260"/>
+        <w:ind w:left="120" w:right="120"/>
+      </w:pPr>
+      <w:r>
+        <w:rPr>
+          <w:rFonts w:ascii="Consolas" w:cs="Consolas" w:hAnsi="Consolas"/>
+          <w:sz w:val="18"/>
+          <w:szCs w:val="18"/>
+          <w:rtl w:val="false"/>
+        </w:rPr>
+        <w:t xml:space="preserve">models = {m.id for m in client.models.list().data}</w:t>
+      </w:r>
+    </w:p>
+    <w:p>
+      <w:pPr>
+        <w:shd w:fill="F3F3F6" w:color="auto" w:val="clear"/>
+        <w:spacing w:after="0" w:line="260"/>
+        <w:ind w:left="120" w:right="120"/>
+      </w:pPr>
+      <w:r>
+        <w:rPr>
+          <w:rFonts w:ascii="Consolas" w:cs="Consolas" w:hAnsi="Consolas"/>
+          <w:sz w:val="18"/>
+          <w:szCs w:val="18"/>
+          <w:rtl w:val="false"/>
+        </w:rPr>
+        <w:t xml:space="preserve">if "MODEL_ID" not in models:</w:t>
+      </w:r>
+    </w:p>
+    <w:p>
+      <w:pPr>
+        <w:shd w:fill="F3F3F6" w:color="auto" w:val="clear"/>
+        <w:spacing w:after="200" w:line="260"/>
+        <w:ind w:left="120" w:right="120"/>
+      </w:pPr>
+      <w:r>
+        <w:rPr>
+          <w:rFonts w:ascii="Consolas" w:cs="Consolas" w:hAnsi="Consolas"/>
+          <w:sz w:val="18"/>
+          <w:szCs w:val="18"/>
+          <w:rtl w:val="false"/>
+        </w:rPr>
+        <w:t xml:space="preserve"> print("این مدل دیگر در لیست نیست؛ یک مدل دیگر انتخاب کنید.")</w:t>
+      </w:r>
+    </w:p>
+    <w:p>
+      <w:pPr>
+        <w:pStyle w:val="ListParagraph"/>
+        <w:numPr>
+          <w:ilvl w:val="0"/>
+          <w:numId w:val="2"/>
+        </w:numPr>
+        <w:bidi/>
+        <w:spacing w:after="80" w:line="300"/>
+      </w:pPr>
+      <w:r>
+        <w:rPr>
+          <w:rtl/>
+        </w:rPr>
+        <w:t xml:space="preserve">اگر مدلی حذف شده باشد، با خطای </w:t>
+      </w:r>
+      <w:r>
+        <w:rPr>
+          <w:rFonts w:ascii="Consolas" w:cs="Consolas" w:hAnsi="Consolas"/>
+          <w:sz w:val="19"/>
+          <w:szCs w:val="19"/>
+          <w:shd w:fill="EFEFEF" w:color="auto" w:val="clear"/>
+          <w:rtl w:val="false"/>
+        </w:rPr>
+        <w:t xml:space="preserve">400 Invalid model name</w:t>
+      </w:r>
+      <w:r>
+        <w:rPr>
+          <w:rtl/>
+        </w:rPr>
+        <w:t xml:space="preserve"> روبه‌رو می‌شوید.</w:t>
+      </w:r>
+    </w:p>
+    <w:p>
+      <w:pPr>
+        <w:pStyle w:val="ListParagraph"/>
+        <w:numPr>
+          <w:ilvl w:val="0"/>
+          <w:numId w:val="2"/>
+        </w:numPr>
+        <w:bidi/>
+        <w:spacing w:after="80" w:line="300"/>
+      </w:pPr>
+      <w:r>
+        <w:rPr>
+          <w:rtl/>
+        </w:rPr>
+        <w:t xml:space="preserve">ابزارهایی که لیست مدل‌ها را خودکار نمی‌گیرند (Claude Code، OpenCode، Cursor، Codex، Copilot)، هر چند وقت یک‌بار لیست خودتان را با صفحه‌ی </w:t>
+      </w:r>
+      <w:r>
+        <w:rPr>
+          <w:b/>
+          <w:bCs/>
+          <w:rtl/>
+        </w:rPr>
+        <w:t xml:space="preserve">مدل‌ها</w:t>
+      </w:r>
+      <w:r>
+        <w:rPr>
+          <w:rtl/>
+        </w:rPr>
+        <w:t xml:space="preserve"> مقایسه کنید.</w:t>
       </w:r>
     </w:p>
     <w:p>
@@ -5493,75 +5646,7 @@
         <w:rPr>
           <w:rtl/>
         </w:rPr>
-        <w:t xml:space="preserve">هزینه و بودجه</w:t>
-      </w:r>
-    </w:p>
-    <w:p>
-      <w:pPr>
-        <w:bidi/>
-        <w:spacing w:after="120" w:line="320"/>
-      </w:pPr>
-      <w:r>
-        <w:rPr>
-          <w:rtl/>
-        </w:rPr>
-        <w:t xml:space="preserve">هزینه بر اساس توکن‌های ورودی و خروجی (فیلد </w:t>
-      </w:r>
-      <w:r>
-        <w:rPr>
-          <w:rFonts w:ascii="Consolas" w:cs="Consolas" w:hAnsi="Consolas"/>
-          <w:sz w:val="19"/>
-          <w:szCs w:val="19"/>
-          <w:shd w:fill="EFEFEF" w:color="auto" w:val="clear"/>
-          <w:rtl w:val="false"/>
-        </w:rPr>
-        <w:t xml:space="preserve">usage</w:t>
-      </w:r>
-      <w:r>
-        <w:rPr>
-          <w:rtl/>
-        </w:rPr>
-        <w:t xml:space="preserve">) حساب می‌شود و برای API، چت و ابزارهای کدنویسی یکسان است. در صفحه‌ی </w:t>
-      </w:r>
-      <w:r>
-        <w:rPr>
-          <w:b/>
-          <w:bCs/>
-          <w:rtl/>
-        </w:rPr>
-        <w:t xml:space="preserve">مصرف</w:t>
-      </w:r>
-      <w:r>
-        <w:rPr>
-          <w:rtl/>
-        </w:rPr>
-        <w:t xml:space="preserve"> تعداد درخواست، توکن، هزینه و روند روزانه‌ی ۷ یا ۳۰ روز گذشته را می‌بینید. هر workspace یک </w:t>
-      </w:r>
-      <w:r>
-        <w:rPr>
-          <w:b/>
-          <w:bCs/>
-          <w:rtl/>
-        </w:rPr>
-        <w:t xml:space="preserve">بودجه</w:t>
-      </w:r>
-      <w:r>
-        <w:rPr>
-          <w:rtl/>
-        </w:rPr>
-        <w:t xml:space="preserve"> دارد که همان‌جا نمایش داده می‌شود و می‌توانید آن را افزایش دهید.</w:t>
-      </w:r>
-    </w:p>
-    <w:p>
-      <w:pPr>
-        <w:pStyle w:val="Heading2"/>
-        <w:bidi/>
-      </w:pPr>
-      <w:r>
-        <w:rPr>
-          <w:rtl/>
-        </w:rPr>
-        <w:t xml:space="preserve">محدودیت‌ها ⚠️</w:t>
+        <w:t xml:space="preserve">قیمت‌گذاری و هزینه</w:t>
       </w:r>
     </w:p>
     <w:p>
@@ -5580,21 +5665,27 @@
           <w:bCs/>
           <w:rtl/>
         </w:rPr>
-        <w:t xml:space="preserve">حداکثر درخواست و توکن در دقیقه:</w:t>
-      </w:r>
-      <w:r>
-        <w:rPr>
-          <w:rtl w:val="false"/>
-        </w:rPr>
-        <w:t xml:space="preserve"> </w:t>
-      </w:r>
-      <w:r>
-        <w:rPr>
-          <w:i/>
-          <w:iCs/>
-          <w:rtl/>
-        </w:rPr>
-        <w:t xml:space="preserve">نیاز به تأیید از تیم</w:t>
+        <w:t xml:space="preserve">پرداخت بر اساس مصرف:</w:t>
+      </w:r>
+      <w:r>
+        <w:rPr>
+          <w:rtl/>
+        </w:rPr>
+        <w:t xml:space="preserve"> هزینه بر اساس تعداد </w:t>
+      </w:r>
+      <w:r>
+        <w:rPr>
+          <w:b/>
+          <w:bCs/>
+          <w:rtl/>
+        </w:rPr>
+        <w:t xml:space="preserve">توکن‌های مصرفی</w:t>
+      </w:r>
+      <w:r>
+        <w:rPr>
+          <w:rtl/>
+        </w:rPr>
+        <w:t xml:space="preserve"> حساب می‌شود، نه تعداد درخواست. هزینه‌ی ثابت یا اشتراک ندارد و برای API، چت و ابزارهای کدنویسی یکسان است.</w:t>
       </w:r>
     </w:p>
     <w:p>
@@ -5613,13 +5704,13 @@
           <w:bCs/>
           <w:rtl/>
         </w:rPr>
-        <w:t xml:space="preserve">حداکثر اندازه‌ی ورودی (context):</w:t>
-      </w:r>
-      <w:r>
-        <w:rPr>
-          <w:rtl/>
-        </w:rPr>
-        <w:t xml:space="preserve"> برای هر مدل فرق دارد و در صفحه‌ی </w:t>
+        <w:t xml:space="preserve">قیمت هر مدل را کجا ببینم؟</w:t>
+      </w:r>
+      <w:r>
+        <w:rPr>
+          <w:rtl/>
+        </w:rPr>
+        <w:t xml:space="preserve"> در صفحه‌ی </w:t>
       </w:r>
       <w:r>
         <w:rPr>
@@ -5633,27 +5724,64 @@
         <w:rPr>
           <w:rtl/>
         </w:rPr>
-        <w:t xml:space="preserve"> است.</w:t>
-      </w:r>
-    </w:p>
-    <w:p>
-      <w:pPr>
-        <w:pBdr>
-          <w:bottom w:val="single" w:color="D0D0DC" w:sz="6" w:space="1"/>
-        </w:pBdr>
-        <w:spacing w:after="160" w:before="80"/>
-      </w:pPr>
-    </w:p>
-    <w:p>
-      <w:pPr>
-        <w:pStyle w:val="Heading2"/>
-        <w:bidi/>
-      </w:pPr>
-      <w:r>
-        <w:rPr>
-          <w:rtl/>
-        </w:rPr>
-        <w:t xml:space="preserve">قیمت‌گذاری و انتخاب مدل ⚠️</w:t>
+        <w:t xml:space="preserve">. قیمت توکن ورودی و خروجی هر مدل آنجاست و از مدلی به مدل دیگر فرق می‌کند.</w:t>
+      </w:r>
+    </w:p>
+    <w:p>
+      <w:pPr>
+        <w:pStyle w:val="ListParagraph"/>
+        <w:numPr>
+          <w:ilvl w:val="0"/>
+          <w:numId w:val="2"/>
+        </w:numPr>
+        <w:bidi/>
+        <w:spacing w:after="80" w:line="300"/>
+      </w:pPr>
+      <w:r>
+        <w:rPr>
+          <w:b/>
+          <w:bCs/>
+          <w:rtl/>
+        </w:rPr>
+        <w:t xml:space="preserve">تعداد توکن‌ها را از کجا بدانم؟</w:t>
+      </w:r>
+      <w:r>
+        <w:rPr>
+          <w:rtl/>
+        </w:rPr>
+        <w:t xml:space="preserve"> فیلد </w:t>
+      </w:r>
+      <w:r>
+        <w:rPr>
+          <w:rFonts w:ascii="Consolas" w:cs="Consolas" w:hAnsi="Consolas"/>
+          <w:sz w:val="19"/>
+          <w:szCs w:val="19"/>
+          <w:shd w:fill="EFEFEF" w:color="auto" w:val="clear"/>
+          <w:rtl w:val="false"/>
+        </w:rPr>
+        <w:t xml:space="preserve">usage</w:t>
+      </w:r>
+      <w:r>
+        <w:rPr>
+          <w:rtl/>
+        </w:rPr>
+        <w:t xml:space="preserve"> در هر پاسخ.</w:t>
+      </w:r>
+    </w:p>
+    <w:p>
+      <w:pPr>
+        <w:shd w:fill="F3F3F6" w:color="auto" w:val="clear"/>
+        <w:spacing w:after="200" w:line="260"/>
+        <w:ind w:left="120" w:right="120"/>
+      </w:pPr>
+      <w:r>
+        <w:rPr>
+          <w:rFonts w:ascii="Consolas" w:cs="Consolas" w:hAnsi="Consolas"/>
+          <w:sz w:val="18"/>
+          <w:szCs w:val="18"/>
+          <w:rtl w:val="false"/>
+        </w:rPr>
+        <w:t xml:space="preserve">هزینه = (توکن ورودی ÷ 1,000,000 × قیمت ورودی) + (توکن خروجی ÷ 1,000,000 × قیمت خروجی)</w:t>
       </w:r>
     </w:p>
     <w:p>
@@ -5661,13 +5789,323 @@
         <w:bidi/>
         <w:spacing w:after="120" w:line="320"/>
       </w:pPr>
+      <w:r>
+        <w:rPr>
+          <w:b/>
+          <w:bCs/>
+          <w:rtl/>
+        </w:rPr>
+        <w:t xml:space="preserve">مثال</w:t>
+      </w:r>
+      <w:r>
+        <w:rPr>
+          <w:rtl/>
+        </w:rPr>
+        <w:t xml:space="preserve"> (اعداد فرضی): قیمت ورودی ۵ دلار و قیمت خروجی ۱۵ دلار به ازای یک میلیون توکن. اگر ۱٬۰۰۰ توکن ورودی و ۵۰۰ توکن خروجی مصرف شود:</w:t>
+      </w:r>
+    </w:p>
+    <w:p>
+      <w:pPr>
+        <w:shd w:fill="F3F3F6" w:color="auto" w:val="clear"/>
+        <w:spacing w:after="200" w:line="260"/>
+        <w:ind w:left="120" w:right="120"/>
+      </w:pPr>
+      <w:r>
+        <w:rPr>
+          <w:rFonts w:ascii="Consolas" w:cs="Consolas" w:hAnsi="Consolas"/>
+          <w:sz w:val="18"/>
+          <w:szCs w:val="18"/>
+          <w:rtl w:val="false"/>
+        </w:rPr>
+        <w:t xml:space="preserve">(1,000 ÷ 1,000,000 × 5) + (500 ÷ 1,000,000 × 15) = 0.0125 دلار</w:t>
+      </w:r>
+    </w:p>
+    <w:p>
+      <w:pPr>
+        <w:bidi/>
+        <w:spacing w:after="120" w:line="320"/>
+      </w:pPr>
+      <w:r>
+        <w:rPr>
+          <w:b/>
+          <w:bCs/>
+          <w:rtl/>
+        </w:rPr>
+        <w:t xml:space="preserve">مدل‌های reasoning:</w:t>
+      </w:r>
+      <w:r>
+        <w:rPr>
+          <w:rtl/>
+        </w:rPr>
+        <w:t xml:space="preserve"> توکن‌های «تفکر» جزو توکن‌های خروجی (</w:t>
+      </w:r>
+      <w:r>
+        <w:rPr>
+          <w:rFonts w:ascii="Consolas" w:cs="Consolas" w:hAnsi="Consolas"/>
+          <w:sz w:val="19"/>
+          <w:szCs w:val="19"/>
+          <w:shd w:fill="EFEFEF" w:color="auto" w:val="clear"/>
+          <w:rtl w:val="false"/>
+        </w:rPr>
+        <w:t xml:space="preserve">completion_tokens</w:t>
+      </w:r>
+      <w:r>
+        <w:rPr>
+          <w:rtl/>
+        </w:rPr>
+        <w:t xml:space="preserve">) شمرده می‌شوند، پس یک پاسخ کوتاه هم می‌تواند خروجی بیشتری از انتظار مصرف کند. ⚠️ </w:t>
+      </w:r>
       <w:r>
         <w:rPr>
           <w:i/>
           <w:iCs/>
           <w:rtl/>
         </w:rPr>
-        <w:t xml:space="preserve">این بخش با متن نهایی تیم محصول جایگزین می‌شود.</w:t>
+        <w:t xml:space="preserve">تأیید نهایی نحوه‌ی محاسبه‌ی هزینه‌ی reasoning و cache از تیم فنی.</w:t>
+      </w:r>
+    </w:p>
+    <w:p>
+      <w:pPr>
+        <w:bidi/>
+        <w:spacing w:after="120" w:line="320"/>
+      </w:pPr>
+      <w:r>
+        <w:rPr>
+          <w:b/>
+          <w:bCs/>
+          <w:rtl/>
+        </w:rPr>
+        <w:t xml:space="preserve">مصرف و بودجه:</w:t>
+      </w:r>
+      <w:r>
+        <w:rPr>
+          <w:rtl/>
+        </w:rPr>
+        <w:t xml:space="preserve"> در صفحه‌ی </w:t>
+      </w:r>
+      <w:r>
+        <w:rPr>
+          <w:b/>
+          <w:bCs/>
+          <w:rtl/>
+        </w:rPr>
+        <w:t xml:space="preserve">مصرف</w:t>
+      </w:r>
+      <w:r>
+        <w:rPr>
+          <w:rtl/>
+        </w:rPr>
+        <w:t xml:space="preserve"> تعداد درخواست، توکن، هزینه و روند روزانه‌ی ۷ یا ۳۰ روز گذشته را می‌بینید. هر workspace یک </w:t>
+      </w:r>
+      <w:r>
+        <w:rPr>
+          <w:b/>
+          <w:bCs/>
+          <w:rtl/>
+        </w:rPr>
+        <w:t xml:space="preserve">بودجه</w:t>
+      </w:r>
+      <w:r>
+        <w:rPr>
+          <w:rtl/>
+        </w:rPr>
+        <w:t xml:space="preserve"> دارد که همان‌جا نمایش داده می‌شود و می‌توانید آن را افزایش دهید.</w:t>
+      </w:r>
+    </w:p>
+    <w:p>
+      <w:pPr>
+        <w:bidi/>
+        <w:spacing w:after="120" w:line="320"/>
+      </w:pPr>
+      <w:r>
+        <w:rPr>
+          <w:b/>
+          <w:bCs/>
+          <w:rtl/>
+        </w:rPr>
+        <w:t xml:space="preserve">چطور هزینه را کم کنم؟</w:t>
+      </w:r>
+    </w:p>
+    <w:p>
+      <w:pPr>
+        <w:pStyle w:val="ListParagraph"/>
+        <w:numPr>
+          <w:ilvl w:val="0"/>
+          <w:numId w:val="4"/>
+        </w:numPr>
+        <w:bidi/>
+        <w:spacing w:after="120" w:line="320"/>
+      </w:pPr>
+      <w:r>
+        <w:rPr>
+          <w:rtl/>
+        </w:rPr>
+        <w:t xml:space="preserve">برای کارهای ساده از مدل‌های کوچک‌تر و ارزان‌تر استفاده کنید.</w:t>
+      </w:r>
+    </w:p>
+    <w:p>
+      <w:pPr>
+        <w:pStyle w:val="ListParagraph"/>
+        <w:numPr>
+          <w:ilvl w:val="0"/>
+          <w:numId w:val="4"/>
+        </w:numPr>
+        <w:bidi/>
+        <w:spacing w:after="120" w:line="320"/>
+      </w:pPr>
+      <w:r>
+        <w:rPr>
+          <w:rtl/>
+        </w:rPr>
+        <w:t xml:space="preserve">با </w:t>
+      </w:r>
+      <w:r>
+        <w:rPr>
+          <w:rFonts w:ascii="Consolas" w:cs="Consolas" w:hAnsi="Consolas"/>
+          <w:sz w:val="19"/>
+          <w:szCs w:val="19"/>
+          <w:shd w:fill="EFEFEF" w:color="auto" w:val="clear"/>
+          <w:rtl w:val="false"/>
+        </w:rPr>
+        <w:t xml:space="preserve">max_tokens</w:t>
+      </w:r>
+      <w:r>
+        <w:rPr>
+          <w:rtl/>
+        </w:rPr>
+        <w:t xml:space="preserve"> طول پاسخ را محدود کنید (برای مدل‌های reasoning عدد را خیلی کوچک نگذارید؛ به بخش «پاسخ خالی» نگاه کنید).</w:t>
+      </w:r>
+    </w:p>
+    <w:p>
+      <w:pPr>
+        <w:pStyle w:val="ListParagraph"/>
+        <w:numPr>
+          <w:ilvl w:val="0"/>
+          <w:numId w:val="4"/>
+        </w:numPr>
+        <w:bidi/>
+        <w:spacing w:after="120" w:line="320"/>
+      </w:pPr>
+      <w:r>
+        <w:rPr>
+          <w:rtl/>
+        </w:rPr>
+        <w:t xml:space="preserve">پرامپت‌های شفاف و کوتاه بنویسید؛ توکن کمتری مصرف می‌کنند.</w:t>
+      </w:r>
+    </w:p>
+    <w:p>
+      <w:pPr>
+        <w:pStyle w:val="ListParagraph"/>
+        <w:numPr>
+          <w:ilvl w:val="0"/>
+          <w:numId w:val="4"/>
+        </w:numPr>
+        <w:bidi/>
+        <w:spacing w:after="120" w:line="320"/>
+      </w:pPr>
+      <w:r>
+        <w:rPr>
+          <w:rtl/>
+        </w:rPr>
+        <w:t xml:space="preserve">مصرف را مرتب در صفحه‌ی </w:t>
+      </w:r>
+      <w:r>
+        <w:rPr>
+          <w:b/>
+          <w:bCs/>
+          <w:rtl/>
+        </w:rPr>
+        <w:t xml:space="preserve">مصرف</w:t>
+      </w:r>
+      <w:r>
+        <w:rPr>
+          <w:rtl/>
+        </w:rPr>
+        <w:t xml:space="preserve"> ببینید.</w:t>
+      </w:r>
+    </w:p>
+    <w:p>
+      <w:pPr>
+        <w:pStyle w:val="Heading2"/>
+        <w:bidi/>
+      </w:pPr>
+      <w:r>
+        <w:rPr>
+          <w:rtl/>
+        </w:rPr>
+        <w:t xml:space="preserve">محدودیت‌ها ⚠️</w:t>
+      </w:r>
+    </w:p>
+    <w:p>
+      <w:pPr>
+        <w:pStyle w:val="ListParagraph"/>
+        <w:numPr>
+          <w:ilvl w:val="0"/>
+          <w:numId w:val="2"/>
+        </w:numPr>
+        <w:bidi/>
+        <w:spacing w:after="80" w:line="300"/>
+      </w:pPr>
+      <w:r>
+        <w:rPr>
+          <w:b/>
+          <w:bCs/>
+          <w:rtl/>
+        </w:rPr>
+        <w:t xml:space="preserve">حداکثر درخواست و توکن در دقیقه:</w:t>
+      </w:r>
+      <w:r>
+        <w:rPr>
+          <w:rtl w:val="false"/>
+        </w:rPr>
+        <w:t xml:space="preserve"> </w:t>
+      </w:r>
+      <w:r>
+        <w:rPr>
+          <w:i/>
+          <w:iCs/>
+          <w:rtl/>
+        </w:rPr>
+        <w:t xml:space="preserve">نیاز به تأیید از تیم</w:t>
+      </w:r>
+    </w:p>
+    <w:p>
+      <w:pPr>
+        <w:pStyle w:val="ListParagraph"/>
+        <w:numPr>
+          <w:ilvl w:val="0"/>
+          <w:numId w:val="2"/>
+        </w:numPr>
+        <w:bidi/>
+        <w:spacing w:after="80" w:line="300"/>
+      </w:pPr>
+      <w:r>
+        <w:rPr>
+          <w:b/>
+          <w:bCs/>
+          <w:rtl/>
+        </w:rPr>
+        <w:t xml:space="preserve">حداکثر اندازه‌ی ورودی (context):</w:t>
+      </w:r>
+      <w:r>
+        <w:rPr>
+          <w:rtl/>
+        </w:rPr>
+        <w:t xml:space="preserve"> برای هر مدل فرق دارد و در صفحه‌ی </w:t>
+      </w:r>
+      <w:r>
+        <w:rPr>
+          <w:b/>
+          <w:bCs/>
+          <w:rtl/>
+        </w:rPr>
+        <w:t xml:space="preserve">مدل‌ها</w:t>
+      </w:r>
+      <w:r>
+        <w:rPr>
+          <w:rtl/>
+        </w:rPr>
+        <w:t xml:space="preserve"> است.</w:t>
       </w:r>
     </w:p>
     <w:p>
@@ -7374,7 +7812,7 @@
         <w:pStyle w:val="ListParagraph"/>
         <w:numPr>
           <w:ilvl w:val="0"/>
-          <w:numId w:val="4"/>
+          <w:numId w:val="5"/>
         </w:numPr>
         <w:bidi/>
         <w:spacing w:after="120" w:line="320"/>
@@ -7398,192 +7836,6 @@
           <w:rtl/>
         </w:rPr>
         <w:t xml:space="preserve"> (ناشر: Anthropic) را نصب کنید. این افزونه نسخه‌ی خودش از Claude Code را همراه دارد و نصب جداگانه‌ی ترمینالی لازم نیست.</w:t>
-      </w:r>
-    </w:p>
-    <w:p>
-      <w:pPr>
-        <w:pStyle w:val="ListParagraph"/>
-        <w:numPr>
-          <w:ilvl w:val="0"/>
-          <w:numId w:val="4"/>
-        </w:numPr>
-        <w:bidi/>
-        <w:spacing w:after="120" w:line="320"/>
-      </w:pPr>
-      <w:r>
-        <w:rPr>
-          <w:rFonts w:ascii="Consolas" w:cs="Consolas" w:hAnsi="Consolas"/>
-          <w:sz w:val="19"/>
-          <w:szCs w:val="19"/>
-          <w:shd w:fill="EFEFEF" w:color="auto" w:val="clear"/>
-          <w:rtl w:val="false"/>
-        </w:rPr>
-        <w:t xml:space="preserve">Cmd+Shift+P</w:t>
-      </w:r>
-      <w:r>
-        <w:rPr>
-          <w:rtl/>
-        </w:rPr>
-        <w:t xml:space="preserve"> (در Windows: </w:t>
-      </w:r>
-      <w:r>
-        <w:rPr>
-          <w:rFonts w:ascii="Consolas" w:cs="Consolas" w:hAnsi="Consolas"/>
-          <w:sz w:val="19"/>
-          <w:szCs w:val="19"/>
-          <w:shd w:fill="EFEFEF" w:color="auto" w:val="clear"/>
-          <w:rtl w:val="false"/>
-        </w:rPr>
-        <w:t xml:space="preserve">Ctrl+Shift+P</w:t>
-      </w:r>
-      <w:r>
-        <w:rPr>
-          <w:rtl/>
-        </w:rPr>
-        <w:t xml:space="preserve">) را بزنید و </w:t>
-      </w:r>
-      <w:r>
-        <w:rPr>
-          <w:b/>
-          <w:bCs/>
-          <w:rtl w:val="false"/>
-        </w:rPr>
-        <w:t xml:space="preserve">Preferences: Open User Settings (JSON)</w:t>
-      </w:r>
-      <w:r>
-        <w:rPr>
-          <w:rtl/>
-        </w:rPr>
-        <w:t xml:space="preserve"> را انتخاب کنید.</w:t>
-      </w:r>
-    </w:p>
-    <w:p>
-      <w:pPr>
-        <w:pStyle w:val="ListParagraph"/>
-        <w:numPr>
-          <w:ilvl w:val="0"/>
-          <w:numId w:val="4"/>
-        </w:numPr>
-        <w:bidi/>
-        <w:spacing w:after="120" w:line="320"/>
-      </w:pPr>
-      <w:r>
-        <w:rPr>
-          <w:rtl/>
-        </w:rPr>
-        <w:t xml:space="preserve">این بلوک را داخل آکولاد اصلی فایل اضافه کنید. اگر خط قبلی ویرگول ندارد، ویرگول بگذارید:</w:t>
-      </w:r>
-    </w:p>
-    <w:p>
-      <w:pPr>
-        <w:shd w:fill="F3F3F6" w:color="auto" w:val="clear"/>
-        <w:spacing w:after="0" w:line="260"/>
-        <w:ind w:left="120" w:right="120"/>
-      </w:pPr>
-      <w:r>
-        <w:rPr>
-          <w:rFonts w:ascii="Consolas" w:cs="Consolas" w:hAnsi="Consolas"/>
-          <w:sz w:val="18"/>
-          <w:szCs w:val="18"/>
-          <w:rtl w:val="false"/>
-        </w:rPr>
-        <w:t xml:space="preserve">"claudeCode.environmentVariables": [</w:t>
-      </w:r>
-    </w:p>
-    <w:p>
-      <w:pPr>
-        <w:shd w:fill="F3F3F6" w:color="auto" w:val="clear"/>
-        <w:spacing w:after="0" w:line="260"/>
-        <w:ind w:left="120" w:right="120"/>
-      </w:pPr>
-      <w:r>
-        <w:rPr>
-          <w:rFonts w:ascii="Consolas" w:cs="Consolas" w:hAnsi="Consolas"/>
-          <w:sz w:val="18"/>
-          <w:szCs w:val="18"/>
-          <w:rtl w:val="false"/>
-        </w:rPr>
-        <w:t xml:space="preserve">{ "name": "ANTHROPIC_BASE_URL", "value": "https://api.intelligence.sotoon.ir/inference" },</w:t>
-      </w:r>
-    </w:p>
-    <w:p>
-      <w:pPr>
-        <w:shd w:fill="F3F3F6" w:color="auto" w:val="clear"/>
-        <w:spacing w:after="0" w:line="260"/>
-        <w:ind w:left="120" w:right="120"/>
-      </w:pPr>
-      <w:r>
-        <w:rPr>
-          <w:rFonts w:ascii="Consolas" w:cs="Consolas" w:hAnsi="Consolas"/>
-          <w:sz w:val="18"/>
-          <w:szCs w:val="18"/>
-          <w:rtl w:val="false"/>
-        </w:rPr>
-        <w:t xml:space="preserve">{ "name": "ANTHROPIC_AUTH_TOKEN", "value": "کلید-شما" },</w:t>
-      </w:r>
-    </w:p>
-    <w:p>
-      <w:pPr>
-        <w:shd w:fill="F3F3F6" w:color="auto" w:val="clear"/>
-        <w:spacing w:after="0" w:line="260"/>
-        <w:ind w:left="120" w:right="120"/>
-      </w:pPr>
-      <w:r>
-        <w:rPr>
-          <w:rFonts w:ascii="Consolas" w:cs="Consolas" w:hAnsi="Consolas"/>
-          <w:sz w:val="18"/>
-          <w:szCs w:val="18"/>
-          <w:rtl w:val="false"/>
-        </w:rPr>
-        <w:t xml:space="preserve">{ "name": "ANTHROPIC_MODEL", "value": "MODEL_ID" },</w:t>
-      </w:r>
-    </w:p>
-    <w:p>
-      <w:pPr>
-        <w:shd w:fill="F3F3F6" w:color="auto" w:val="clear"/>
-        <w:spacing w:after="0" w:line="260"/>
-        <w:ind w:left="120" w:right="120"/>
-      </w:pPr>
-      <w:r>
-        <w:rPr>
-          <w:rFonts w:ascii="Consolas" w:cs="Consolas" w:hAnsi="Consolas"/>
-          <w:sz w:val="18"/>
-          <w:szCs w:val="18"/>
-          <w:rtl w:val="false"/>
-        </w:rPr>
-        <w:t xml:space="preserve">{ "name": "CLAUDE_CODE_DISABLE_EXPERIMENTAL_BETAS", "value": "1" }</w:t>
-      </w:r>
-    </w:p>
-    <w:p>
-      <w:pPr>
-        <w:shd w:fill="F3F3F6" w:color="auto" w:val="clear"/>
-        <w:spacing w:after="0" w:line="260"/>
-        <w:ind w:left="120" w:right="120"/>
-      </w:pPr>
-      <w:r>
-        <w:rPr>
-          <w:rFonts w:ascii="Consolas" w:cs="Consolas" w:hAnsi="Consolas"/>
-          <w:sz w:val="18"/>
-          <w:szCs w:val="18"/>
-          <w:rtl w:val="false"/>
-        </w:rPr>
-        <w:t xml:space="preserve">],</w:t>
-      </w:r>
-    </w:p>
-    <w:p>
-      <w:pPr>
-        <w:shd w:fill="F3F3F6" w:color="auto" w:val="clear"/>
-        <w:spacing w:after="200" w:line="260"/>
-        <w:ind w:left="120" w:right="120"/>
-      </w:pPr>
-      <w:r>
-        <w:rPr>
-          <w:rFonts w:ascii="Consolas" w:cs="Consolas" w:hAnsi="Consolas"/>
-          <w:sz w:val="18"/>
-          <w:szCs w:val="18"/>
-          <w:rtl w:val="false"/>
-        </w:rPr>
-        <w:t xml:space="preserve">"claudeCode.disableLoginPrompt": true</w:t>
       </w:r>
     </w:p>
     <w:p>
@@ -7598,25 +7850,49 @@
       </w:pPr>
       <w:r>
         <w:rPr>
-          <w:rtl/>
-        </w:rPr>
-        <w:t xml:space="preserve">فایل را ذخیره کنید و VS Code را کامل ببندید و دوباره باز کنید (</w:t>
-      </w:r>
-      <w:r>
-        <w:rPr>
           <w:rFonts w:ascii="Consolas" w:cs="Consolas" w:hAnsi="Consolas"/>
           <w:sz w:val="19"/>
           <w:szCs w:val="19"/>
           <w:shd w:fill="EFEFEF" w:color="auto" w:val="clear"/>
           <w:rtl w:val="false"/>
         </w:rPr>
-        <w:t xml:space="preserve">Cmd+Q</w:t>
-      </w:r>
-      <w:r>
-        <w:rPr>
-          <w:rtl w:val="false"/>
-        </w:rPr>
-        <w:t xml:space="preserve">).</w:t>
+        <w:t xml:space="preserve">Cmd+Shift+P</w:t>
+      </w:r>
+      <w:r>
+        <w:rPr>
+          <w:rtl/>
+        </w:rPr>
+        <w:t xml:space="preserve"> (در Windows: </w:t>
+      </w:r>
+      <w:r>
+        <w:rPr>
+          <w:rFonts w:ascii="Consolas" w:cs="Consolas" w:hAnsi="Consolas"/>
+          <w:sz w:val="19"/>
+          <w:szCs w:val="19"/>
+          <w:shd w:fill="EFEFEF" w:color="auto" w:val="clear"/>
+          <w:rtl w:val="false"/>
+        </w:rPr>
+        <w:t xml:space="preserve">Ctrl+Shift+P</w:t>
+      </w:r>
+      <w:r>
+        <w:rPr>
+          <w:rtl/>
+        </w:rPr>
+        <w:t xml:space="preserve">) را بزنید و </w:t>
+      </w:r>
+      <w:r>
+        <w:rPr>
+          <w:b/>
+          <w:bCs/>
+          <w:rtl w:val="false"/>
+        </w:rPr>
+        <w:t xml:space="preserve">Preferences: Open User Settings (JSON)</w:t>
+      </w:r>
+      <w:r>
+        <w:rPr>
+          <w:rtl/>
+        </w:rPr>
+        <w:t xml:space="preserve"> را انتخاب کنید.</w:t>
       </w:r>
     </w:p>
     <w:p>
@@ -7625,6 +7901,168 @@
         <w:numPr>
           <w:ilvl w:val="0"/>
           <w:numId w:val="5"/>
+        </w:numPr>
+        <w:bidi/>
+        <w:spacing w:after="120" w:line="320"/>
+      </w:pPr>
+      <w:r>
+        <w:rPr>
+          <w:rtl/>
+        </w:rPr>
+        <w:t xml:space="preserve">این بلوک را داخل آکولاد اصلی فایل اضافه کنید. اگر خط قبلی ویرگول ندارد، ویرگول بگذارید:</w:t>
+      </w:r>
+    </w:p>
+    <w:p>
+      <w:pPr>
+        <w:shd w:fill="F3F3F6" w:color="auto" w:val="clear"/>
+        <w:spacing w:after="0" w:line="260"/>
+        <w:ind w:left="120" w:right="120"/>
+      </w:pPr>
+      <w:r>
+        <w:rPr>
+          <w:rFonts w:ascii="Consolas" w:cs="Consolas" w:hAnsi="Consolas"/>
+          <w:sz w:val="18"/>
+          <w:szCs w:val="18"/>
+          <w:rtl w:val="false"/>
+        </w:rPr>
+        <w:t xml:space="preserve">"claudeCode.environmentVariables": [</w:t>
+      </w:r>
+    </w:p>
+    <w:p>
+      <w:pPr>
+        <w:shd w:fill="F3F3F6" w:color="auto" w:val="clear"/>
+        <w:spacing w:after="0" w:line="260"/>
+        <w:ind w:left="120" w:right="120"/>
+      </w:pPr>
+      <w:r>
+        <w:rPr>
+          <w:rFonts w:ascii="Consolas" w:cs="Consolas" w:hAnsi="Consolas"/>
+          <w:sz w:val="18"/>
+          <w:szCs w:val="18"/>
+          <w:rtl w:val="false"/>
+        </w:rPr>
+        <w:t xml:space="preserve">{ "name": "ANTHROPIC_BASE_URL", "value": "https://api.intelligence.sotoon.ir/inference" },</w:t>
+      </w:r>
+    </w:p>
+    <w:p>
+      <w:pPr>
+        <w:shd w:fill="F3F3F6" w:color="auto" w:val="clear"/>
+        <w:spacing w:after="0" w:line="260"/>
+        <w:ind w:left="120" w:right="120"/>
+      </w:pPr>
+      <w:r>
+        <w:rPr>
+          <w:rFonts w:ascii="Consolas" w:cs="Consolas" w:hAnsi="Consolas"/>
+          <w:sz w:val="18"/>
+          <w:szCs w:val="18"/>
+          <w:rtl w:val="false"/>
+        </w:rPr>
+        <w:t xml:space="preserve">{ "name": "ANTHROPIC_AUTH_TOKEN", "value": "کلید-شما" },</w:t>
+      </w:r>
+    </w:p>
+    <w:p>
+      <w:pPr>
+        <w:shd w:fill="F3F3F6" w:color="auto" w:val="clear"/>
+        <w:spacing w:after="0" w:line="260"/>
+        <w:ind w:left="120" w:right="120"/>
+      </w:pPr>
+      <w:r>
+        <w:rPr>
+          <w:rFonts w:ascii="Consolas" w:cs="Consolas" w:hAnsi="Consolas"/>
+          <w:sz w:val="18"/>
+          <w:szCs w:val="18"/>
+          <w:rtl w:val="false"/>
+        </w:rPr>
+        <w:t xml:space="preserve">{ "name": "ANTHROPIC_MODEL", "value": "MODEL_ID" },</w:t>
+      </w:r>
+    </w:p>
+    <w:p>
+      <w:pPr>
+        <w:shd w:fill="F3F3F6" w:color="auto" w:val="clear"/>
+        <w:spacing w:after="0" w:line="260"/>
+        <w:ind w:left="120" w:right="120"/>
+      </w:pPr>
+      <w:r>
+        <w:rPr>
+          <w:rFonts w:ascii="Consolas" w:cs="Consolas" w:hAnsi="Consolas"/>
+          <w:sz w:val="18"/>
+          <w:szCs w:val="18"/>
+          <w:rtl w:val="false"/>
+        </w:rPr>
+        <w:t xml:space="preserve">{ "name": "CLAUDE_CODE_DISABLE_EXPERIMENTAL_BETAS", "value": "1" }</w:t>
+      </w:r>
+    </w:p>
+    <w:p>
+      <w:pPr>
+        <w:shd w:fill="F3F3F6" w:color="auto" w:val="clear"/>
+        <w:spacing w:after="0" w:line="260"/>
+        <w:ind w:left="120" w:right="120"/>
+      </w:pPr>
+      <w:r>
+        <w:rPr>
+          <w:rFonts w:ascii="Consolas" w:cs="Consolas" w:hAnsi="Consolas"/>
+          <w:sz w:val="18"/>
+          <w:szCs w:val="18"/>
+          <w:rtl w:val="false"/>
+        </w:rPr>
+        <w:t xml:space="preserve">],</w:t>
+      </w:r>
+    </w:p>
+    <w:p>
+      <w:pPr>
+        <w:shd w:fill="F3F3F6" w:color="auto" w:val="clear"/>
+        <w:spacing w:after="200" w:line="260"/>
+        <w:ind w:left="120" w:right="120"/>
+      </w:pPr>
+      <w:r>
+        <w:rPr>
+          <w:rFonts w:ascii="Consolas" w:cs="Consolas" w:hAnsi="Consolas"/>
+          <w:sz w:val="18"/>
+          <w:szCs w:val="18"/>
+          <w:rtl w:val="false"/>
+        </w:rPr>
+        <w:t xml:space="preserve">"claudeCode.disableLoginPrompt": true</w:t>
+      </w:r>
+    </w:p>
+    <w:p>
+      <w:pPr>
+        <w:pStyle w:val="ListParagraph"/>
+        <w:numPr>
+          <w:ilvl w:val="0"/>
+          <w:numId w:val="6"/>
+        </w:numPr>
+        <w:bidi/>
+        <w:spacing w:after="120" w:line="320"/>
+      </w:pPr>
+      <w:r>
+        <w:rPr>
+          <w:rtl/>
+        </w:rPr>
+        <w:t xml:space="preserve">فایل را ذخیره کنید و VS Code را کامل ببندید و دوباره باز کنید (</w:t>
+      </w:r>
+      <w:r>
+        <w:rPr>
+          <w:rFonts w:ascii="Consolas" w:cs="Consolas" w:hAnsi="Consolas"/>
+          <w:sz w:val="19"/>
+          <w:szCs w:val="19"/>
+          <w:shd w:fill="EFEFEF" w:color="auto" w:val="clear"/>
+          <w:rtl w:val="false"/>
+        </w:rPr>
+        <w:t xml:space="preserve">Cmd+Q</w:t>
+      </w:r>
+      <w:r>
+        <w:rPr>
+          <w:rtl w:val="false"/>
+        </w:rPr>
+        <w:t xml:space="preserve">).</w:t>
+      </w:r>
+    </w:p>
+    <w:p>
+      <w:pPr>
+        <w:pStyle w:val="ListParagraph"/>
+        <w:numPr>
+          <w:ilvl w:val="0"/>
+          <w:numId w:val="6"/>
         </w:numPr>
         <w:bidi/>
         <w:spacing w:after="120" w:line="320"/>
@@ -9046,7 +9484,7 @@
         <w:pStyle w:val="ListParagraph"/>
         <w:numPr>
           <w:ilvl w:val="0"/>
-          <w:numId w:val="6"/>
+          <w:numId w:val="7"/>
         </w:numPr>
         <w:bidi/>
         <w:spacing w:after="120" w:line="320"/>
@@ -9088,37 +9526,6 @@
           <w:rtl w:val="false"/>
         </w:rPr>
         <w:t xml:space="preserve">).</w:t>
-      </w:r>
-    </w:p>
-    <w:p>
-      <w:pPr>
-        <w:pStyle w:val="ListParagraph"/>
-        <w:numPr>
-          <w:ilvl w:val="0"/>
-          <w:numId w:val="6"/>
-        </w:numPr>
-        <w:bidi/>
-        <w:spacing w:after="120" w:line="320"/>
-      </w:pPr>
-      <w:r>
-        <w:rPr>
-          <w:rtl/>
-        </w:rPr>
-        <w:t xml:space="preserve">عبارت «OAI Compatible Provider for Copilot» را جستجو و نصب کنید.</w:t>
-      </w:r>
-    </w:p>
-    <w:p>
-      <w:pPr>
-        <w:bidi/>
-        <w:spacing w:after="120" w:line="320"/>
-      </w:pPr>
-      <w:r>
-        <w:rPr>
-          <w:b/>
-          <w:bCs/>
-          <w:rtl/>
-        </w:rPr>
-        <w:t xml:space="preserve">۲. تنظیم آدرس و کلید</w:t>
       </w:r>
     </w:p>
     <w:p>
@@ -9135,6 +9542,37 @@
         <w:rPr>
           <w:rtl/>
         </w:rPr>
+        <w:t xml:space="preserve">عبارت «OAI Compatible Provider for Copilot» را جستجو و نصب کنید.</w:t>
+      </w:r>
+    </w:p>
+    <w:p>
+      <w:pPr>
+        <w:bidi/>
+        <w:spacing w:after="120" w:line="320"/>
+      </w:pPr>
+      <w:r>
+        <w:rPr>
+          <w:b/>
+          <w:bCs/>
+          <w:rtl/>
+        </w:rPr>
+        <w:t xml:space="preserve">۲. تنظیم آدرس و کلید</w:t>
+      </w:r>
+    </w:p>
+    <w:p>
+      <w:pPr>
+        <w:pStyle w:val="ListParagraph"/>
+        <w:numPr>
+          <w:ilvl w:val="0"/>
+          <w:numId w:val="8"/>
+        </w:numPr>
+        <w:bidi/>
+        <w:spacing w:after="120" w:line="320"/>
+      </w:pPr>
+      <w:r>
+        <w:rPr>
+          <w:rtl/>
+        </w:rPr>
         <w:t xml:space="preserve">Command Palette را باز کنید (</w:t>
       </w:r>
       <w:r>
@@ -9175,7 +9613,7 @@
         <w:pStyle w:val="ListParagraph"/>
         <w:numPr>
           <w:ilvl w:val="0"/>
-          <w:numId w:val="7"/>
+          <w:numId w:val="8"/>
         </w:numPr>
         <w:bidi/>
         <w:spacing w:after="120" w:line="320"/>
@@ -9206,7 +9644,7 @@
         <w:pStyle w:val="ListParagraph"/>
         <w:numPr>
           <w:ilvl w:val="0"/>
-          <w:numId w:val="7"/>
+          <w:numId w:val="8"/>
         </w:numPr>
         <w:bidi/>
         <w:spacing w:after="120" w:line="320"/>
@@ -9297,7 +9735,7 @@
         <w:pStyle w:val="ListParagraph"/>
         <w:numPr>
           <w:ilvl w:val="0"/>
-          <w:numId w:val="7"/>
+          <w:numId w:val="8"/>
         </w:numPr>
         <w:bidi/>
         <w:spacing w:after="120" w:line="320"/>
@@ -9342,7 +9780,7 @@
         <w:pStyle w:val="ListParagraph"/>
         <w:numPr>
           <w:ilvl w:val="0"/>
-          <w:numId w:val="8"/>
+          <w:numId w:val="9"/>
         </w:numPr>
         <w:bidi/>
         <w:spacing w:after="120" w:line="320"/>
@@ -9463,7 +9901,7 @@
         <w:pStyle w:val="ListParagraph"/>
         <w:numPr>
           <w:ilvl w:val="0"/>
-          <w:numId w:val="8"/>
+          <w:numId w:val="9"/>
         </w:numPr>
         <w:bidi/>
         <w:spacing w:after="120" w:line="320"/>
@@ -9618,7 +10056,7 @@
         <w:pStyle w:val="ListParagraph"/>
         <w:numPr>
           <w:ilvl w:val="0"/>
-          <w:numId w:val="9"/>
+          <w:numId w:val="10"/>
         </w:numPr>
         <w:bidi/>
         <w:spacing w:after="120" w:line="320"/>
@@ -9635,7 +10073,7 @@
         <w:pStyle w:val="ListParagraph"/>
         <w:numPr>
           <w:ilvl w:val="0"/>
-          <w:numId w:val="9"/>
+          <w:numId w:val="10"/>
         </w:numPr>
         <w:bidi/>
         <w:spacing w:after="120" w:line="320"/>
@@ -9688,7 +10126,7 @@
         <w:pStyle w:val="ListParagraph"/>
         <w:numPr>
           <w:ilvl w:val="0"/>
-          <w:numId w:val="9"/>
+          <w:numId w:val="10"/>
         </w:numPr>
         <w:bidi/>
         <w:spacing w:after="120" w:line="320"/>
@@ -10217,7 +10655,7 @@
         <w:pStyle w:val="ListParagraph"/>
         <w:numPr>
           <w:ilvl w:val="0"/>
-          <w:numId w:val="10"/>
+          <w:numId w:val="11"/>
         </w:numPr>
         <w:bidi/>
         <w:spacing w:after="120" w:line="320"/>
@@ -10262,7 +10700,7 @@
         <w:pStyle w:val="ListParagraph"/>
         <w:numPr>
           <w:ilvl w:val="0"/>
-          <w:numId w:val="10"/>
+          <w:numId w:val="11"/>
         </w:numPr>
         <w:bidi/>
         <w:spacing w:after="120" w:line="320"/>
@@ -10279,7 +10717,7 @@
         <w:pStyle w:val="ListParagraph"/>
         <w:numPr>
           <w:ilvl w:val="0"/>
-          <w:numId w:val="10"/>
+          <w:numId w:val="11"/>
         </w:numPr>
         <w:bidi/>
         <w:spacing w:after="120" w:line="320"/>
@@ -10336,7 +10774,7 @@
         <w:pStyle w:val="ListParagraph"/>
         <w:numPr>
           <w:ilvl w:val="0"/>
-          <w:numId w:val="10"/>
+          <w:numId w:val="11"/>
         </w:numPr>
         <w:bidi/>
         <w:spacing w:after="120" w:line="320"/>
@@ -10377,7 +10815,7 @@
         <w:pStyle w:val="ListParagraph"/>
         <w:numPr>
           <w:ilvl w:val="0"/>
-          <w:numId w:val="10"/>
+          <w:numId w:val="11"/>
         </w:numPr>
         <w:bidi/>
         <w:spacing w:after="120" w:line="320"/>
@@ -10402,7 +10840,7 @@
         <w:pStyle w:val="ListParagraph"/>
         <w:numPr>
           <w:ilvl w:val="0"/>
-          <w:numId w:val="10"/>
+          <w:numId w:val="11"/>
         </w:numPr>
         <w:bidi/>
         <w:spacing w:after="120" w:line="320"/>
@@ -11573,7 +12011,7 @@
         <w:bidi/>
         <w:spacing w:after="120" w:line="320"/>
       </w:pPr>
-      <w:hyperlink w:history="1" r:id="rId_oyjqik5ts--60k1epbbe">
+      <w:hyperlink w:history="1" r:id="rId6vd3rjmfvo7zf1njx0dz6">
         <w:r>
           <w:rPr>
             <w:rStyle w:val="Hyperlink"/>
@@ -11588,7 +12026,7 @@
         </w:rPr>
         <w:t xml:space="preserve"> · </w:t>
       </w:r>
-      <w:hyperlink w:history="1" r:id="rIdclqnnewngeq3nyubfd4kz">
+      <w:hyperlink w:history="1" r:id="rIdqbi6limv_lk803p-u4nad">
         <w:r>
           <w:rPr>
             <w:rStyle w:val="Hyperlink"/>
@@ -11603,7 +12041,7 @@
         </w:rPr>
         <w:t xml:space="preserve"> · </w:t>
       </w:r>
-      <w:hyperlink w:history="1" r:id="rIdg1v6ltnzfc3qvglfycez6">
+      <w:hyperlink w:history="1" r:id="rIdvdot_1kc9d3tfh2ptos92">
         <w:r>
           <w:rPr>
             <w:rStyle w:val="Hyperlink"/>
@@ -11618,7 +12056,7 @@
         </w:rPr>
         <w:t xml:space="preserve"> · </w:t>
       </w:r>
-      <w:hyperlink w:history="1" r:id="rIdd17zzho5bw6va1m4wlujk">
+      <w:hyperlink w:history="1" r:id="rIdaomy7niqcnv5zkucmqktr">
         <w:r>
           <w:rPr>
             <w:rStyle w:val="Hyperlink"/>
@@ -11868,7 +12306,7 @@
   <w:abstractNum w:abstractNumId="5" w15:restartNumberingAfterBreak="0">
     <w:multiLevelType w:val="hybridMultilevel"/>
     <w:lvl w:ilvl="0" w:tentative="1">
-      <w:start w:val="4"/>
+      <w:start w:val="1"/>
       <w:numFmt w:val="decimal"/>
       <w:lvlText w:val="%1."/>
       <w:lvlJc w:val="left"/>
@@ -11880,7 +12318,7 @@
   <w:abstractNum w:abstractNumId="6" w15:restartNumberingAfterBreak="0">
     <w:multiLevelType w:val="hybridMultilevel"/>
     <w:lvl w:ilvl="0" w:tentative="1">
-      <w:start w:val="1"/>
+      <w:start w:val="4"/>
       <w:numFmt w:val="decimal"/>
       <w:lvlText w:val="%1."/>
       <w:lvlJc w:val="left"/>
@@ -11926,6 +12364,18 @@
     </w:lvl>
   </w:abstractNum>
   <w:abstractNum w:abstractNumId="10" w15:restartNumberingAfterBreak="0">
+    <w:multiLevelType w:val="hybridMultilevel"/>
+    <w:lvl w:ilvl="0" w:tentative="1">
+      <w:start w:val="1"/>
+      <w:numFmt w:val="decimal"/>
+      <w:lvlText w:val="%1."/>
+      <w:lvlJc w:val="left"/>
+      <w:pPr>
+        <w:ind w:left="720" w:hanging="360"/>
+      </w:pPr>
+    </w:lvl>
+  </w:abstractNum>
+  <w:abstractNum w:abstractNumId="11" w15:restartNumberingAfterBreak="0">
     <w:multiLevelType w:val="hybridMultilevel"/>
     <w:lvl w:ilvl="0" w:tentative="1">
       <w:start w:val="1"/>
@@ -11964,13 +12414,13 @@
   <w:num w:numId="5">
     <w:abstractNumId w:val="5"/>
     <w:lvlOverride w:ilvl="0">
-      <w:startOverride w:val="4"/>
+      <w:startOverride w:val="1"/>
     </w:lvlOverride>
   </w:num>
   <w:num w:numId="6">
     <w:abstractNumId w:val="6"/>
     <w:lvlOverride w:ilvl="0">
-      <w:startOverride w:val="1"/>
+      <w:startOverride w:val="4"/>
     </w:lvlOverride>
   </w:num>
   <w:num w:numId="7">
@@ -11993,6 +12443,12 @@
   </w:num>
   <w:num w:numId="10">
     <w:abstractNumId w:val="10"/>
+    <w:lvlOverride w:ilvl="0">
+      <w:startOverride w:val="1"/>
+    </w:lvlOverride>
+  </w:num>
+  <w:num w:numId="11">
+    <w:abstractNumId w:val="11"/>
     <w:lvlOverride w:ilvl="0">
       <w:startOverride w:val="1"/>
     </w:lvlOverride>

</xml_diff>

<commit_message>
docs: add current budget and billing terms to pricing section
Co-Authored-By: Claude Sonnet 5.5 <noreply@anthropic.com>
Claude-Session: https://claude.ai/code/session_01K2TE7hKB2uwZb8YzUQGaRz
</commit_message>
<xml_diff>
--- a/user-docs/sotoon-api-docs.docx
+++ b/user-docs/sotoon-api-docs.docx
@@ -5315,7 +5315,7 @@
               <w:rPr>
                 <w:rtl/>
               </w:rPr>
-              <w:t xml:space="preserve">بودجه‌ی workspace تمام شده</w:t>
+              <w:t xml:space="preserve">بودجه‌ی شما تمام شده</w:t>
             </w:r>
           </w:p>
         </w:tc>
@@ -5866,8 +5866,39 @@
     </w:p>
     <w:p>
       <w:pPr>
-        <w:bidi/>
-        <w:spacing w:after="120" w:line="320"/>
+        <w:pStyle w:val="Heading3"/>
+        <w:bidi/>
+      </w:pPr>
+      <w:r>
+        <w:rPr>
+          <w:rtl/>
+        </w:rPr>
+        <w:t xml:space="preserve">بودجه و پرداخت (شرایط فعلی)</w:t>
+      </w:r>
+    </w:p>
+    <w:p>
+      <w:pPr>
+        <w:shd w:fill="FFF4CE" w:color="auto" w:val="clear"/>
+        <w:bidi/>
+        <w:spacing w:after="120" w:before="80" w:line="300"/>
+        <w:ind w:left="200" w:right="200"/>
+      </w:pPr>
+      <w:r>
+        <w:rPr>
+          <w:rtl/>
+        </w:rPr>
+        <w:t xml:space="preserve">این شرایط وضعیت فعلی است و ممکن است در آینده تغییر کند.</w:t>
+      </w:r>
+    </w:p>
+    <w:p>
+      <w:pPr>
+        <w:pStyle w:val="ListParagraph"/>
+        <w:numPr>
+          <w:ilvl w:val="0"/>
+          <w:numId w:val="2"/>
+        </w:numPr>
+        <w:bidi/>
+        <w:spacing w:after="80" w:line="300"/>
       </w:pPr>
       <w:r>
         <w:rPr>
@@ -5875,13 +5906,13 @@
           <w:bCs/>
           <w:rtl/>
         </w:rPr>
-        <w:t xml:space="preserve">مصرف و بودجه:</w:t>
-      </w:r>
-      <w:r>
-        <w:rPr>
-          <w:rtl/>
-        </w:rPr>
-        <w:t xml:space="preserve"> در صفحه‌ی </w:t>
+        <w:t xml:space="preserve">بودجه‌ی اولیه:</w:t>
+      </w:r>
+      <w:r>
+        <w:rPr>
+          <w:rtl/>
+        </w:rPr>
+        <w:t xml:space="preserve"> با ساخت حساب، </w:t>
       </w:r>
       <w:r>
         <w:rPr>
@@ -5889,27 +5920,192 @@
           <w:bCs/>
           <w:rtl/>
         </w:rPr>
-        <w:t xml:space="preserve">مصرف</w:t>
-      </w:r>
-      <w:r>
-        <w:rPr>
-          <w:rtl/>
-        </w:rPr>
-        <w:t xml:space="preserve"> تعداد درخواست، توکن، هزینه و روند روزانه‌ی ۷ یا ۳۰ روز گذشته را می‌بینید. هر workspace یک </w:t>
-      </w:r>
+        <w:t xml:space="preserve">۵ دلار</w:t>
+      </w:r>
+      <w:r>
+        <w:rPr>
+          <w:rtl/>
+        </w:rPr>
+        <w:t xml:space="preserve"> بودجه‌ی اولیه به شما اختصاص داده می‌شود. مصرف شما از این بودجه کم می‌شود.</w:t>
+      </w:r>
+    </w:p>
+    <w:p>
+      <w:pPr>
+        <w:pStyle w:val="ListParagraph"/>
+        <w:numPr>
+          <w:ilvl w:val="0"/>
+          <w:numId w:val="2"/>
+        </w:numPr>
+        <w:bidi/>
+        <w:spacing w:after="80" w:line="300"/>
+      </w:pPr>
       <w:r>
         <w:rPr>
           <w:b/>
           <w:bCs/>
           <w:rtl/>
         </w:rPr>
-        <w:t xml:space="preserve">بودجه</w:t>
-      </w:r>
-      <w:r>
-        <w:rPr>
-          <w:rtl/>
-        </w:rPr>
-        <w:t xml:space="preserve"> دارد که همان‌جا نمایش داده می‌شود و می‌توانید آن را افزایش دهید.</w:t>
+        <w:t xml:space="preserve">افزایش بودجه:</w:t>
+      </w:r>
+      <w:r>
+        <w:rPr>
+          <w:rtl/>
+        </w:rPr>
+        <w:t xml:space="preserve"> هر زمان لازم شد، از صفحه‌ی </w:t>
+      </w:r>
+      <w:r>
+        <w:rPr>
+          <w:b/>
+          <w:bCs/>
+          <w:rtl/>
+        </w:rPr>
+        <w:t xml:space="preserve">مصرف</w:t>
+      </w:r>
+      <w:r>
+        <w:rPr>
+          <w:rtl/>
+        </w:rPr>
+        <w:t xml:space="preserve"> (دکمه‌ی «افزایش بودجه») بودجه را بیشتر کنید. در هر روز حداکثر </w:t>
+      </w:r>
+      <w:r>
+        <w:rPr>
+          <w:b/>
+          <w:bCs/>
+          <w:rtl/>
+        </w:rPr>
+        <w:t xml:space="preserve">۸۰ دلار</w:t>
+      </w:r>
+      <w:r>
+        <w:rPr>
+          <w:rtl/>
+        </w:rPr>
+        <w:t xml:space="preserve"> می‌توانید بودجه را افزایش دهید.</w:t>
+      </w:r>
+    </w:p>
+    <w:p>
+      <w:pPr>
+        <w:pStyle w:val="ListParagraph"/>
+        <w:numPr>
+          <w:ilvl w:val="0"/>
+          <w:numId w:val="2"/>
+        </w:numPr>
+        <w:bidi/>
+        <w:spacing w:after="80" w:line="300"/>
+      </w:pPr>
+      <w:r>
+        <w:rPr>
+          <w:b/>
+          <w:bCs/>
+          <w:rtl/>
+        </w:rPr>
+        <w:t xml:space="preserve">پرداخت:</w:t>
+      </w:r>
+      <w:r>
+        <w:rPr>
+          <w:rtl/>
+        </w:rPr>
+        <w:t xml:space="preserve"> فقط به اندازه‌ی </w:t>
+      </w:r>
+      <w:r>
+        <w:rPr>
+          <w:b/>
+          <w:bCs/>
+          <w:rtl/>
+        </w:rPr>
+        <w:t xml:space="preserve">مصرف واقعی</w:t>
+      </w:r>
+      <w:r>
+        <w:rPr>
+          <w:rtl/>
+        </w:rPr>
+        <w:t xml:space="preserve"> پرداخت می‌کنید. در روز </w:t>
+      </w:r>
+      <w:r>
+        <w:rPr>
+          <w:b/>
+          <w:bCs/>
+          <w:rtl/>
+        </w:rPr>
+        <w:t xml:space="preserve">۲۳ هر ماه</w:t>
+      </w:r>
+      <w:r>
+        <w:rPr>
+          <w:rtl/>
+        </w:rPr>
+        <w:t xml:space="preserve"> فاکتور مصرف صادر می‌شود و </w:t>
+      </w:r>
+      <w:r>
+        <w:rPr>
+          <w:b/>
+          <w:bCs/>
+          <w:rtl/>
+        </w:rPr>
+        <w:t xml:space="preserve">۱۰٪ مالیات بر ارزش افزوده</w:t>
+      </w:r>
+      <w:r>
+        <w:rPr>
+          <w:rtl/>
+        </w:rPr>
+        <w:t xml:space="preserve"> به آن اضافه می‌شود.</w:t>
+      </w:r>
+    </w:p>
+    <w:p>
+      <w:pPr>
+        <w:pStyle w:val="ListParagraph"/>
+        <w:numPr>
+          <w:ilvl w:val="0"/>
+          <w:numId w:val="2"/>
+        </w:numPr>
+        <w:bidi/>
+        <w:spacing w:after="80" w:line="300"/>
+      </w:pPr>
+      <w:r>
+        <w:rPr>
+          <w:b/>
+          <w:bCs/>
+          <w:rtl/>
+        </w:rPr>
+        <w:t xml:space="preserve">پیگیری مصرف:</w:t>
+      </w:r>
+      <w:r>
+        <w:rPr>
+          <w:rtl/>
+        </w:rPr>
+        <w:t xml:space="preserve"> در صفحه‌ی </w:t>
+      </w:r>
+      <w:r>
+        <w:rPr>
+          <w:b/>
+          <w:bCs/>
+          <w:rtl/>
+        </w:rPr>
+        <w:t xml:space="preserve">مصرف</w:t>
+      </w:r>
+      <w:r>
+        <w:rPr>
+          <w:rtl/>
+        </w:rPr>
+        <w:t xml:space="preserve"> تعداد درخواست، توکن، هزینه و روند روزانه‌ی ۷ یا ۳۰ روز گذشته را می‌بینید.</w:t>
+      </w:r>
+    </w:p>
+    <w:p>
+      <w:pPr>
+        <w:bidi/>
+        <w:spacing w:after="120" w:line="320"/>
+      </w:pPr>
+      <w:r>
+        <w:rPr>
+          <w:rtl w:val="false"/>
+        </w:rPr>
+        <w:t xml:space="preserve">⚠️ </w:t>
+      </w:r>
+      <w:r>
+        <w:rPr>
+          <w:i/>
+          <w:iCs/>
+          <w:rtl/>
+        </w:rPr>
+        <w:t xml:space="preserve">نیاز به تأیید: تقویم ماه (شمسی یا میلادی) و بازه‌ی مصرفِ هر فاکتور، واحد پول فاکتور، بودجه برای هر workspace است یا کل حساب، و اینکه وقتی بودجه تمام می‌شود API دقیقاً چه خطایی برمی‌گرداند.</w:t>
       </w:r>
     </w:p>
     <w:p>
@@ -12011,7 +12207,7 @@
         <w:bidi/>
         <w:spacing w:after="120" w:line="320"/>
       </w:pPr>
-      <w:hyperlink w:history="1" r:id="rId6vd3rjmfvo7zf1njx0dz6">
+      <w:hyperlink w:history="1" r:id="rId3c_f90xsothresefe2xnj">
         <w:r>
           <w:rPr>
             <w:rStyle w:val="Hyperlink"/>
@@ -12026,7 +12222,7 @@
         </w:rPr>
         <w:t xml:space="preserve"> · </w:t>
       </w:r>
-      <w:hyperlink w:history="1" r:id="rIdqbi6limv_lk803p-u4nad">
+      <w:hyperlink w:history="1" r:id="rIdwq3a9a2ceqrvvjgoprof_">
         <w:r>
           <w:rPr>
             <w:rStyle w:val="Hyperlink"/>
@@ -12041,7 +12237,7 @@
         </w:rPr>
         <w:t xml:space="preserve"> · </w:t>
       </w:r>
-      <w:hyperlink w:history="1" r:id="rIdvdot_1kc9d3tfh2ptos92">
+      <w:hyperlink w:history="1" r:id="rIdglqf3hbh0mi-tc49gokus">
         <w:r>
           <w:rPr>
             <w:rStyle w:val="Hyperlink"/>
@@ -12056,7 +12252,7 @@
         </w:rPr>
         <w:t xml:space="preserve"> · </w:t>
       </w:r>
-      <w:hyperlink w:history="1" r:id="rIdaomy7niqcnv5zkucmqktr">
+      <w:hyperlink w:history="1" r:id="rIdaeh0y2boczmb-nxixk9q7">
         <w:r>
           <w:rPr>
             <w:rStyle w:val="Hyperlink"/>

</xml_diff>

<commit_message>
docs: finalize billing terms (Jalali 23rd, period, dollar rate, per-workspace budget)
Co-Authored-By: Claude Sonnet 5.5 <noreply@anthropic.com>
Claude-Session: https://claude.ai/code/session_01K2TE7hKB2uwZb8YzUQGaRz
</commit_message>
<xml_diff>
--- a/user-docs/sotoon-api-docs.docx
+++ b/user-docs/sotoon-api-docs.docx
@@ -5315,7 +5315,7 @@
               <w:rPr>
                 <w:rtl/>
               </w:rPr>
-              <w:t xml:space="preserve">بودجه‌ی شما تمام شده</w:t>
+              <w:t xml:space="preserve">بودجه‌ی workspace تمام شده</w:t>
             </w:r>
           </w:p>
         </w:tc>
@@ -5344,7 +5344,7 @@
               <w:rPr>
                 <w:rtl/>
               </w:rPr>
-              <w:t xml:space="preserve">در صفحه‌ی «مصرف» افزایش دهید. </w:t>
+              <w:t xml:space="preserve">از صفحه‌ی «مصرف» بودجه را افزایش دهید. </w:t>
             </w:r>
             <w:r>
               <w:rPr>
@@ -5352,7 +5352,7 @@
                 <w:iCs/>
                 <w:rtl/>
               </w:rPr>
-              <w:t xml:space="preserve">کد و پیام دقیق تأیید نشده.</w:t>
+              <w:t xml:space="preserve">کد و متن دقیق خطا تأیید نشده.</w:t>
             </w:r>
           </w:p>
         </w:tc>
@@ -5906,7 +5906,7 @@
           <w:bCs/>
           <w:rtl/>
         </w:rPr>
-        <w:t xml:space="preserve">بودجه‌ی اولیه:</w:t>
+        <w:t xml:space="preserve">بودجه برای هر workspace جداست.</w:t>
       </w:r>
       <w:r>
         <w:rPr>
@@ -5926,7 +5926,7 @@
         <w:rPr>
           <w:rtl/>
         </w:rPr>
-        <w:t xml:space="preserve"> بودجه‌ی اولیه به شما اختصاص داده می‌شود. مصرف شما از این بودجه کم می‌شود.</w:t>
+        <w:t xml:space="preserve"> بودجه‌ی اولیه اختصاص داده می‌شود و مصرف شما از آن کم می‌شود.</w:t>
       </w:r>
     </w:p>
     <w:p>
@@ -5998,13 +5998,13 @@
           <w:bCs/>
           <w:rtl/>
         </w:rPr>
-        <w:t xml:space="preserve">پرداخت:</w:t>
-      </w:r>
-      <w:r>
-        <w:rPr>
-          <w:rtl/>
-        </w:rPr>
-        <w:t xml:space="preserve"> فقط به اندازه‌ی </w:t>
+        <w:t xml:space="preserve">وقتی بودجه تمام شود:</w:t>
+      </w:r>
+      <w:r>
+        <w:rPr>
+          <w:rtl/>
+        </w:rPr>
+        <w:t xml:space="preserve"> API خطای مربوط به بودجه برمی‌گرداند. از همان صفحه‌ی </w:t>
       </w:r>
       <w:r>
         <w:rPr>
@@ -6012,41 +6012,13 @@
           <w:bCs/>
           <w:rtl/>
         </w:rPr>
-        <w:t xml:space="preserve">مصرف واقعی</w:t>
-      </w:r>
-      <w:r>
-        <w:rPr>
-          <w:rtl/>
-        </w:rPr>
-        <w:t xml:space="preserve"> پرداخت می‌کنید. در روز </w:t>
-      </w:r>
-      <w:r>
-        <w:rPr>
-          <w:b/>
-          <w:bCs/>
-          <w:rtl/>
-        </w:rPr>
-        <w:t xml:space="preserve">۲۳ هر ماه</w:t>
-      </w:r>
-      <w:r>
-        <w:rPr>
-          <w:rtl/>
-        </w:rPr>
-        <w:t xml:space="preserve"> فاکتور مصرف صادر می‌شود و </w:t>
-      </w:r>
-      <w:r>
-        <w:rPr>
-          <w:b/>
-          <w:bCs/>
-          <w:rtl/>
-        </w:rPr>
-        <w:t xml:space="preserve">۱۰٪ مالیات بر ارزش افزوده</w:t>
-      </w:r>
-      <w:r>
-        <w:rPr>
-          <w:rtl/>
-        </w:rPr>
-        <w:t xml:space="preserve"> به آن اضافه می‌شود.</w:t>
+        <w:t xml:space="preserve">مصرف</w:t>
+      </w:r>
+      <w:r>
+        <w:rPr>
+          <w:rtl/>
+        </w:rPr>
+        <w:t xml:space="preserve"> بودجه را افزایش دهید تا درخواست‌ها دوباره پذیرفته شوند.</w:t>
       </w:r>
     </w:p>
     <w:p>
@@ -6065,13 +6037,13 @@
           <w:bCs/>
           <w:rtl/>
         </w:rPr>
-        <w:t xml:space="preserve">پیگیری مصرف:</w:t>
-      </w:r>
-      <w:r>
-        <w:rPr>
-          <w:rtl/>
-        </w:rPr>
-        <w:t xml:space="preserve"> در صفحه‌ی </w:t>
+        <w:t xml:space="preserve">پرداخت:</w:t>
+      </w:r>
+      <w:r>
+        <w:rPr>
+          <w:rtl/>
+        </w:rPr>
+        <w:t xml:space="preserve"> فقط به اندازه‌ی </w:t>
       </w:r>
       <w:r>
         <w:rPr>
@@ -6079,6 +6051,126 @@
           <w:bCs/>
           <w:rtl/>
         </w:rPr>
+        <w:t xml:space="preserve">مصرف واقعی</w:t>
+      </w:r>
+      <w:r>
+        <w:rPr>
+          <w:rtl/>
+        </w:rPr>
+        <w:t xml:space="preserve"> پرداخت می‌کنید. در روز </w:t>
+      </w:r>
+      <w:r>
+        <w:rPr>
+          <w:b/>
+          <w:bCs/>
+          <w:rtl/>
+        </w:rPr>
+        <w:t xml:space="preserve">۲۳ هر ماه (تقویم شمسی)</w:t>
+      </w:r>
+      <w:r>
+        <w:rPr>
+          <w:rtl/>
+        </w:rPr>
+        <w:t xml:space="preserve"> فاکتور صادر می‌شود و مصرف </w:t>
+      </w:r>
+      <w:r>
+        <w:rPr>
+          <w:b/>
+          <w:bCs/>
+          <w:rtl/>
+        </w:rPr>
+        <w:t xml:space="preserve">از ۲۳ ماه قبل تا ۲۲ همان ماه</w:t>
+      </w:r>
+      <w:r>
+        <w:rPr>
+          <w:rtl/>
+        </w:rPr>
+        <w:t xml:space="preserve"> را شامل می‌شود. مثلاً فاکتور ۲۳ مهر، مصرف ۲۳ شهریور تا ۲۲ مهر است.</w:t>
+      </w:r>
+    </w:p>
+    <w:p>
+      <w:pPr>
+        <w:pStyle w:val="ListParagraph"/>
+        <w:numPr>
+          <w:ilvl w:val="0"/>
+          <w:numId w:val="2"/>
+        </w:numPr>
+        <w:bidi/>
+        <w:spacing w:after="80" w:line="300"/>
+      </w:pPr>
+      <w:r>
+        <w:rPr>
+          <w:b/>
+          <w:bCs/>
+          <w:rtl/>
+        </w:rPr>
+        <w:t xml:space="preserve">نرخ تبدیل:</w:t>
+      </w:r>
+      <w:r>
+        <w:rPr>
+          <w:rtl/>
+        </w:rPr>
+        <w:t xml:space="preserve"> هزینه‌ی دلاریِ مصرف به </w:t>
+      </w:r>
+      <w:r>
+        <w:rPr>
+          <w:b/>
+          <w:bCs/>
+          <w:rtl/>
+        </w:rPr>
+        <w:t xml:space="preserve">نرخ دلار روز ۲۳ام</w:t>
+      </w:r>
+      <w:r>
+        <w:rPr>
+          <w:rtl/>
+        </w:rPr>
+        <w:t xml:space="preserve"> محاسبه می‌شود و </w:t>
+      </w:r>
+      <w:r>
+        <w:rPr>
+          <w:b/>
+          <w:bCs/>
+          <w:rtl/>
+        </w:rPr>
+        <w:t xml:space="preserve">۱۰٪ مالیات بر ارزش افزوده</w:t>
+      </w:r>
+      <w:r>
+        <w:rPr>
+          <w:rtl/>
+        </w:rPr>
+        <w:t xml:space="preserve"> به فاکتور اضافه می‌شود.</w:t>
+      </w:r>
+    </w:p>
+    <w:p>
+      <w:pPr>
+        <w:pStyle w:val="ListParagraph"/>
+        <w:numPr>
+          <w:ilvl w:val="0"/>
+          <w:numId w:val="2"/>
+        </w:numPr>
+        <w:bidi/>
+        <w:spacing w:after="80" w:line="300"/>
+      </w:pPr>
+      <w:r>
+        <w:rPr>
+          <w:b/>
+          <w:bCs/>
+          <w:rtl/>
+        </w:rPr>
+        <w:t xml:space="preserve">پیگیری مصرف:</w:t>
+      </w:r>
+      <w:r>
+        <w:rPr>
+          <w:rtl/>
+        </w:rPr>
+        <w:t xml:space="preserve"> در صفحه‌ی </w:t>
+      </w:r>
+      <w:r>
+        <w:rPr>
+          <w:b/>
+          <w:bCs/>
+          <w:rtl/>
+        </w:rPr>
         <w:t xml:space="preserve">مصرف</w:t>
       </w:r>
       <w:r>
@@ -6105,7 +6197,7 @@
           <w:iCs/>
           <w:rtl/>
         </w:rPr>
-        <w:t xml:space="preserve">نیاز به تأیید: تقویم ماه (شمسی یا میلادی) و بازه‌ی مصرفِ هر فاکتور، واحد پول فاکتور، بودجه برای هر workspace است یا کل حساب، و اینکه وقتی بودجه تمام می‌شود API دقیقاً چه خطایی برمی‌گرداند.</w:t>
+        <w:t xml:space="preserve">نیاز به تأیید: واحد پول فاکتور (ریال یا تومان)، و کد و متن دقیق خطای «بودجه تمام شد».</w:t>
       </w:r>
     </w:p>
     <w:p>
@@ -12207,7 +12299,7 @@
         <w:bidi/>
         <w:spacing w:after="120" w:line="320"/>
       </w:pPr>
-      <w:hyperlink w:history="1" r:id="rId3c_f90xsothresefe2xnj">
+      <w:hyperlink w:history="1" r:id="rIdgyp_9jz8jkh1zs5la2kcc">
         <w:r>
           <w:rPr>
             <w:rStyle w:val="Hyperlink"/>
@@ -12222,7 +12314,7 @@
         </w:rPr>
         <w:t xml:space="preserve"> · </w:t>
       </w:r>
-      <w:hyperlink w:history="1" r:id="rIdwq3a9a2ceqrvvjgoprof_">
+      <w:hyperlink w:history="1" r:id="rIdj4v1mymmcvpzsmmfcfp1w">
         <w:r>
           <w:rPr>
             <w:rStyle w:val="Hyperlink"/>
@@ -12237,7 +12329,7 @@
         </w:rPr>
         <w:t xml:space="preserve"> · </w:t>
       </w:r>
-      <w:hyperlink w:history="1" r:id="rIdglqf3hbh0mi-tc49gokus">
+      <w:hyperlink w:history="1" r:id="rIdrnp1amhdz1ac1srht5vfv">
         <w:r>
           <w:rPr>
             <w:rStyle w:val="Hyperlink"/>
@@ -12252,7 +12344,7 @@
         </w:rPr>
         <w:t xml:space="preserve"> · </w:t>
       </w:r>
-      <w:hyperlink w:history="1" r:id="rIdaeh0y2boczmb-nxixk9q7">
+      <w:hyperlink w:history="1" r:id="rId9thnjpu3co9j0g-kz5nqc">
         <w:r>
           <w:rPr>
             <w:rStyle w:val="Hyperlink"/>

</xml_diff>

<commit_message>
docs: invoice currency is rial
Co-Authored-By: Claude Sonnet 5.5 <noreply@anthropic.com>
Claude-Session: https://claude.ai/code/session_01K2TE7hKB2uwZb8YzUQGaRz
</commit_message>
<xml_diff>
--- a/user-docs/sotoon-api-docs.docx
+++ b/user-docs/sotoon-api-docs.docx
@@ -6104,7 +6104,7 @@
           <w:bCs/>
           <w:rtl/>
         </w:rPr>
-        <w:t xml:space="preserve">نرخ تبدیل:</w:t>
+        <w:t xml:space="preserve">نرخ تبدیل و واحد فاکتور:</w:t>
       </w:r>
       <w:r>
         <w:rPr>
@@ -6124,7 +6124,7 @@
         <w:rPr>
           <w:rtl/>
         </w:rPr>
-        <w:t xml:space="preserve"> محاسبه می‌شود و </w:t>
+        <w:t xml:space="preserve"> محاسبه می‌شود و فاکتور به </w:t>
       </w:r>
       <w:r>
         <w:rPr>
@@ -6132,13 +6132,27 @@
           <w:bCs/>
           <w:rtl/>
         </w:rPr>
+        <w:t xml:space="preserve">ریال</w:t>
+      </w:r>
+      <w:r>
+        <w:rPr>
+          <w:rtl/>
+        </w:rPr>
+        <w:t xml:space="preserve"> صادر می‌شود. </w:t>
+      </w:r>
+      <w:r>
+        <w:rPr>
+          <w:b/>
+          <w:bCs/>
+          <w:rtl/>
+        </w:rPr>
         <w:t xml:space="preserve">۱۰٪ مالیات بر ارزش افزوده</w:t>
       </w:r>
       <w:r>
         <w:rPr>
           <w:rtl/>
         </w:rPr>
-        <w:t xml:space="preserve"> به فاکتور اضافه می‌شود.</w:t>
+        <w:t xml:space="preserve"> هم به فاکتور اضافه می‌شود.</w:t>
       </w:r>
     </w:p>
     <w:p>
@@ -6197,7 +6211,7 @@
           <w:iCs/>
           <w:rtl/>
         </w:rPr>
-        <w:t xml:space="preserve">نیاز به تأیید: واحد پول فاکتور (ریال یا تومان)، و کد و متن دقیق خطای «بودجه تمام شد».</w:t>
+        <w:t xml:space="preserve">نیاز به تأیید: کد و متن دقیق خطای «بودجه تمام شد».</w:t>
       </w:r>
     </w:p>
     <w:p>
@@ -12299,7 +12313,7 @@
         <w:bidi/>
         <w:spacing w:after="120" w:line="320"/>
       </w:pPr>
-      <w:hyperlink w:history="1" r:id="rIdgyp_9jz8jkh1zs5la2kcc">
+      <w:hyperlink w:history="1" r:id="rIdzjoqrbnj4wtvwjobj4qp8">
         <w:r>
           <w:rPr>
             <w:rStyle w:val="Hyperlink"/>
@@ -12314,7 +12328,7 @@
         </w:rPr>
         <w:t xml:space="preserve"> · </w:t>
       </w:r>
-      <w:hyperlink w:history="1" r:id="rIdj4v1mymmcvpzsmmfcfp1w">
+      <w:hyperlink w:history="1" r:id="rIdwc5ujl8lqxpfp948mebur">
         <w:r>
           <w:rPr>
             <w:rStyle w:val="Hyperlink"/>
@@ -12329,7 +12343,7 @@
         </w:rPr>
         <w:t xml:space="preserve"> · </w:t>
       </w:r>
-      <w:hyperlink w:history="1" r:id="rIdrnp1amhdz1ac1srht5vfv">
+      <w:hyperlink w:history="1" r:id="rIdn2zxb9lbcqnxpwgbzowy_">
         <w:r>
           <w:rPr>
             <w:rStyle w:val="Hyperlink"/>
@@ -12344,7 +12358,7 @@
         </w:rPr>
         <w:t xml:space="preserve"> · </w:t>
       </w:r>
-      <w:hyperlink w:history="1" r:id="rId9thnjpu3co9j0g-kz5nqc">
+      <w:hyperlink w:history="1" r:id="rIdfy7iqlcniouqtbyuiqay6">
         <w:r>
           <w:rPr>
             <w:rStyle w:val="Hyperlink"/>

</xml_diff>

<commit_message>
docs: monthly budget cap and budget card; open question on counter
Co-Authored-By: Claude Sonnet 5.5 <noreply@anthropic.com>
Claude-Session: https://claude.ai/code/session_01K2TE7hKB2uwZb8YzUQGaRz
</commit_message>
<xml_diff>
--- a/user-docs/sotoon-api-docs.docx
+++ b/user-docs/sotoon-api-docs.docx
@@ -5861,33 +5861,41 @@
           <w:iCs/>
           <w:rtl/>
         </w:rPr>
-        <w:t xml:space="preserve">تأیید نهایی نحوه‌ی محاسبه‌ی هزینه‌ی reasoning و cache از تیم فنی.</w:t>
-      </w:r>
-    </w:p>
-    <w:p>
-      <w:pPr>
-        <w:pStyle w:val="Heading3"/>
-        <w:bidi/>
-      </w:pPr>
-      <w:r>
-        <w:rPr>
-          <w:rtl/>
-        </w:rPr>
-        <w:t xml:space="preserve">بودجه و پرداخت (شرایط فعلی)</w:t>
-      </w:r>
-    </w:p>
-    <w:p>
-      <w:pPr>
-        <w:shd w:fill="FFF4CE" w:color="auto" w:val="clear"/>
-        <w:bidi/>
-        <w:spacing w:after="120" w:before="80" w:line="300"/>
-        <w:ind w:left="200" w:right="200"/>
-      </w:pPr>
-      <w:r>
-        <w:rPr>
-          <w:rtl/>
-        </w:rPr>
-        <w:t xml:space="preserve">این شرایط وضعیت فعلی است و ممکن است در آینده تغییر کند.</w:t>
+        <w:t xml:space="preserve">تأیید نهایی نحوه‌ی محاسبه‌ی هزینه‌ی reasoning از تیم فنی.</w:t>
+      </w:r>
+    </w:p>
+    <w:p>
+      <w:pPr>
+        <w:bidi/>
+        <w:spacing w:after="120" w:line="320"/>
+      </w:pPr>
+      <w:r>
+        <w:rPr>
+          <w:b/>
+          <w:bCs/>
+          <w:rtl/>
+        </w:rPr>
+        <w:t xml:space="preserve">توکن‌های cache (prompt caching):</w:t>
+      </w:r>
+      <w:r>
+        <w:rPr>
+          <w:rtl/>
+        </w:rPr>
+        <w:t xml:space="preserve"> بعضی مدل‌ها بخش تکراری ورودی (مثلاً یک پرامپت سیستمی یا مکالمه‌ی بلند) را cache می‌کنند. توکن‌های cache با </w:t>
+      </w:r>
+      <w:r>
+        <w:rPr>
+          <w:b/>
+          <w:bCs/>
+          <w:rtl/>
+        </w:rPr>
+        <w:t xml:space="preserve">قیمت جدا</w:t>
+      </w:r>
+      <w:r>
+        <w:rPr>
+          <w:rtl/>
+        </w:rPr>
+        <w:t xml:space="preserve"> حساب می‌شوند: خواندن از cache معمولاً خیلی ارزان‌تر از ورودی عادی است و نوشتن در cache کمی گران‌تر. نکات مهم:</w:t>
       </w:r>
     </w:p>
     <w:p>
@@ -5902,31 +5910,103 @@
       </w:pPr>
       <w:r>
         <w:rPr>
+          <w:rtl/>
+        </w:rPr>
+        <w:t xml:space="preserve">در </w:t>
+      </w:r>
+      <w:r>
+        <w:rPr>
+          <w:rFonts w:ascii="Consolas" w:cs="Consolas" w:hAnsi="Consolas"/>
+          <w:sz w:val="19"/>
+          <w:szCs w:val="19"/>
+          <w:shd w:fill="EFEFEF" w:color="auto" w:val="clear"/>
+          <w:rtl w:val="false"/>
+        </w:rPr>
+        <w:t xml:space="preserve">usage</w:t>
+      </w:r>
+      <w:r>
+        <w:rPr>
+          <w:rtl/>
+        </w:rPr>
+        <w:t xml:space="preserve"> پاسخ، </w:t>
+      </w:r>
+      <w:r>
+        <w:rPr>
+          <w:rFonts w:ascii="Consolas" w:cs="Consolas" w:hAnsi="Consolas"/>
+          <w:sz w:val="19"/>
+          <w:szCs w:val="19"/>
+          <w:shd w:fill="EFEFEF" w:color="auto" w:val="clear"/>
+          <w:rtl w:val="false"/>
+        </w:rPr>
+        <w:t xml:space="preserve">prompt_tokens</w:t>
+      </w:r>
+      <w:r>
+        <w:rPr>
+          <w:rtl w:val="false"/>
+        </w:rPr>
+        <w:t xml:space="preserve"> </w:t>
+      </w:r>
+      <w:r>
+        <w:rPr>
           <w:b/>
           <w:bCs/>
           <w:rtl/>
         </w:rPr>
-        <w:t xml:space="preserve">بودجه برای هر workspace جداست.</w:t>
-      </w:r>
-      <w:r>
-        <w:rPr>
-          <w:rtl/>
-        </w:rPr>
-        <w:t xml:space="preserve"> با ساخت حساب، </w:t>
-      </w:r>
-      <w:r>
-        <w:rPr>
-          <w:b/>
-          <w:bCs/>
-          <w:rtl/>
-        </w:rPr>
-        <w:t xml:space="preserve">۵ دلار</w:t>
-      </w:r>
-      <w:r>
-        <w:rPr>
-          <w:rtl/>
-        </w:rPr>
-        <w:t xml:space="preserve"> بودجه‌ی اولیه اختصاص داده می‌شود و مصرف شما از آن کم می‌شود.</w:t>
+        <w:t xml:space="preserve">شامل توکن‌های cache هم هست</w:t>
+      </w:r>
+      <w:r>
+        <w:rPr>
+          <w:rtl/>
+        </w:rPr>
+        <w:t xml:space="preserve"> و مقدار آن‌ها در </w:t>
+      </w:r>
+      <w:r>
+        <w:rPr>
+          <w:rFonts w:ascii="Consolas" w:cs="Consolas" w:hAnsi="Consolas"/>
+          <w:sz w:val="19"/>
+          <w:szCs w:val="19"/>
+          <w:shd w:fill="EFEFEF" w:color="auto" w:val="clear"/>
+          <w:rtl w:val="false"/>
+        </w:rPr>
+        <w:t xml:space="preserve">usage.prompt_tokens_details</w:t>
+      </w:r>
+      <w:r>
+        <w:rPr>
+          <w:rtl w:val="false"/>
+        </w:rPr>
+        <w:t xml:space="preserve"> (</w:t>
+      </w:r>
+      <w:r>
+        <w:rPr>
+          <w:rFonts w:ascii="Consolas" w:cs="Consolas" w:hAnsi="Consolas"/>
+          <w:sz w:val="19"/>
+          <w:szCs w:val="19"/>
+          <w:shd w:fill="EFEFEF" w:color="auto" w:val="clear"/>
+          <w:rtl w:val="false"/>
+        </w:rPr>
+        <w:t xml:space="preserve">cached_tokens</w:t>
+      </w:r>
+      <w:r>
+        <w:rPr>
+          <w:rtl/>
+        </w:rPr>
+        <w:t xml:space="preserve"> و </w:t>
+      </w:r>
+      <w:r>
+        <w:rPr>
+          <w:rFonts w:ascii="Consolas" w:cs="Consolas" w:hAnsi="Consolas"/>
+          <w:sz w:val="19"/>
+          <w:szCs w:val="19"/>
+          <w:shd w:fill="EFEFEF" w:color="auto" w:val="clear"/>
+          <w:rtl w:val="false"/>
+        </w:rPr>
+        <w:t xml:space="preserve">cache_write_tokens</w:t>
+      </w:r>
+      <w:r>
+        <w:rPr>
+          <w:rtl/>
+        </w:rPr>
+        <w:t xml:space="preserve">) آمده است.</w:t>
       </w:r>
     </w:p>
     <w:p>
@@ -5941,17 +6021,23 @@
       </w:pPr>
       <w:r>
         <w:rPr>
+          <w:rtl/>
+        </w:rPr>
+        <w:t xml:space="preserve">عدد «توکن‌ها» در صفحه‌ی </w:t>
+      </w:r>
+      <w:r>
+        <w:rPr>
           <w:b/>
           <w:bCs/>
           <w:rtl/>
         </w:rPr>
-        <w:t xml:space="preserve">افزایش بودجه:</w:t>
-      </w:r>
-      <w:r>
-        <w:rPr>
-          <w:rtl/>
-        </w:rPr>
-        <w:t xml:space="preserve"> هر زمان لازم شد، از صفحه‌ی </w:t>
+        <w:t xml:space="preserve">مصرف</w:t>
+      </w:r>
+      <w:r>
+        <w:rPr>
+          <w:rtl/>
+        </w:rPr>
+        <w:t xml:space="preserve"> هم همه‌ی توکن‌ها را با هم می‌شمارد (ورودی + cache + خروجی). برای همین ممکن است از عددی که کنسول خود سازنده‌ی مدل نشان می‌دهد بیشتر باشد؛ سازنده‌ها معمولاً توکن cache را جدا نشان می‌دهند. </w:t>
       </w:r>
       <w:r>
         <w:rPr>
@@ -5959,20 +6045,185 @@
           <w:bCs/>
           <w:rtl/>
         </w:rPr>
-        <w:t xml:space="preserve">مصرف</w:t>
-      </w:r>
-      <w:r>
-        <w:rPr>
-          <w:rtl/>
-        </w:rPr>
-        <w:t xml:space="preserve"> (دکمه‌ی «افزایش بودجه») بودجه را بیشتر کنید. در هر روز حداکثر </w:t>
-      </w:r>
+        <w:t xml:space="preserve">هزینه</w:t>
+      </w:r>
+      <w:r>
+        <w:rPr>
+          <w:rtl/>
+        </w:rPr>
+        <w:t xml:space="preserve"> با قیمت cache حساب می‌شود، نه با قیمت کامل ورودی.</w:t>
+      </w:r>
+    </w:p>
+    <w:p>
+      <w:pPr>
+        <w:pStyle w:val="ListParagraph"/>
+        <w:numPr>
+          <w:ilvl w:val="0"/>
+          <w:numId w:val="2"/>
+        </w:numPr>
+        <w:bidi/>
+        <w:spacing w:after="80" w:line="300"/>
+      </w:pPr>
+      <w:r>
+        <w:rPr>
+          <w:rtl/>
+        </w:rPr>
+        <w:t xml:space="preserve">cache فقط روی مدل‌هایی که پشتیبانی می‌کنند کار می‌کند و بعضی مدل‌ها (مثل Claude) باید در درخواست </w:t>
+      </w:r>
+      <w:r>
+        <w:rPr>
+          <w:rFonts w:ascii="Consolas" w:cs="Consolas" w:hAnsi="Consolas"/>
+          <w:sz w:val="19"/>
+          <w:szCs w:val="19"/>
+          <w:shd w:fill="EFEFEF" w:color="auto" w:val="clear"/>
+          <w:rtl w:val="false"/>
+        </w:rPr>
+        <w:t xml:space="preserve">cache_control</w:t>
+      </w:r>
+      <w:r>
+        <w:rPr>
+          <w:rtl/>
+        </w:rPr>
+        <w:t xml:space="preserve"> بگذارید. ⚠️ </w:t>
+      </w:r>
+      <w:r>
+        <w:rPr>
+          <w:i/>
+          <w:iCs/>
+          <w:rtl/>
+        </w:rPr>
+        <w:t xml:space="preserve">این رفتار فقط برای Claude از مسیر </w:t>
+      </w:r>
+      <w:r>
+        <w:rPr>
+          <w:rFonts w:ascii="Consolas" w:cs="Consolas" w:hAnsi="Consolas"/>
+          <w:i/>
+          <w:iCs/>
+          <w:sz w:val="19"/>
+          <w:szCs w:val="19"/>
+          <w:shd w:fill="EFEFEF" w:color="auto" w:val="clear"/>
+          <w:rtl w:val="false"/>
+        </w:rPr>
+        <w:t xml:space="preserve">/v1/chat/completions</w:t>
+      </w:r>
+      <w:r>
+        <w:rPr>
+          <w:i/>
+          <w:iCs/>
+          <w:rtl/>
+        </w:rPr>
+        <w:t xml:space="preserve"> تست شده؛ مدل‌های OpenAI و بقیه تأیید نشده.</w:t>
+      </w:r>
+    </w:p>
+    <w:p>
+      <w:pPr>
+        <w:pStyle w:val="Heading3"/>
+        <w:bidi/>
+      </w:pPr>
+      <w:r>
+        <w:rPr>
+          <w:rtl/>
+        </w:rPr>
+        <w:t xml:space="preserve">بودجه و پرداخت (شرایط فعلی)</w:t>
+      </w:r>
+    </w:p>
+    <w:p>
+      <w:pPr>
+        <w:shd w:fill="FFF4CE" w:color="auto" w:val="clear"/>
+        <w:bidi/>
+        <w:spacing w:after="120" w:before="80" w:line="300"/>
+        <w:ind w:left="200" w:right="200"/>
+      </w:pPr>
+      <w:r>
+        <w:rPr>
+          <w:rtl/>
+        </w:rPr>
+        <w:t xml:space="preserve">این شرایط وضعیت فعلی است و ممکن است در آینده تغییر کند.</w:t>
+      </w:r>
+    </w:p>
+    <w:p>
+      <w:pPr>
+        <w:pStyle w:val="ListParagraph"/>
+        <w:numPr>
+          <w:ilvl w:val="0"/>
+          <w:numId w:val="2"/>
+        </w:numPr>
+        <w:bidi/>
+        <w:spacing w:after="80" w:line="300"/>
+      </w:pPr>
       <w:r>
         <w:rPr>
           <w:b/>
           <w:bCs/>
           <w:rtl/>
         </w:rPr>
+        <w:t xml:space="preserve">بودجه برای هر workspace جداست.</w:t>
+      </w:r>
+      <w:r>
+        <w:rPr>
+          <w:rtl/>
+        </w:rPr>
+        <w:t xml:space="preserve"> با ساخت حساب، </w:t>
+      </w:r>
+      <w:r>
+        <w:rPr>
+          <w:b/>
+          <w:bCs/>
+          <w:rtl/>
+        </w:rPr>
+        <w:t xml:space="preserve">۵ دلار</w:t>
+      </w:r>
+      <w:r>
+        <w:rPr>
+          <w:rtl/>
+        </w:rPr>
+        <w:t xml:space="preserve"> بودجه‌ی اولیه اختصاص داده می‌شود و مصرف شما از آن کم می‌شود.</w:t>
+      </w:r>
+    </w:p>
+    <w:p>
+      <w:pPr>
+        <w:pStyle w:val="ListParagraph"/>
+        <w:numPr>
+          <w:ilvl w:val="0"/>
+          <w:numId w:val="2"/>
+        </w:numPr>
+        <w:bidi/>
+        <w:spacing w:after="80" w:line="300"/>
+      </w:pPr>
+      <w:r>
+        <w:rPr>
+          <w:b/>
+          <w:bCs/>
+          <w:rtl/>
+        </w:rPr>
+        <w:t xml:space="preserve">افزایش بودجه:</w:t>
+      </w:r>
+      <w:r>
+        <w:rPr>
+          <w:rtl/>
+        </w:rPr>
+        <w:t xml:space="preserve"> هر زمان لازم شد، از صفحه‌ی </w:t>
+      </w:r>
+      <w:r>
+        <w:rPr>
+          <w:b/>
+          <w:bCs/>
+          <w:rtl/>
+        </w:rPr>
+        <w:t xml:space="preserve">مصرف</w:t>
+      </w:r>
+      <w:r>
+        <w:rPr>
+          <w:rtl/>
+        </w:rPr>
+        <w:t xml:space="preserve"> (دکمه‌ی «افزایش بودجه») بودجه را بیشتر کنید. در هر روز حداکثر </w:t>
+      </w:r>
+      <w:r>
+        <w:rPr>
+          <w:b/>
+          <w:bCs/>
+          <w:rtl/>
+        </w:rPr>
         <w:t xml:space="preserve">۸۰ دلار</w:t>
       </w:r>
       <w:r>
@@ -5980,6 +6231,67 @@
           <w:rtl/>
         </w:rPr>
         <w:t xml:space="preserve"> می‌توانید بودجه را افزایش دهید.</w:t>
+      </w:r>
+    </w:p>
+    <w:p>
+      <w:pPr>
+        <w:pStyle w:val="ListParagraph"/>
+        <w:numPr>
+          <w:ilvl w:val="0"/>
+          <w:numId w:val="2"/>
+        </w:numPr>
+        <w:bidi/>
+        <w:spacing w:after="80" w:line="300"/>
+      </w:pPr>
+      <w:r>
+        <w:rPr>
+          <w:b/>
+          <w:bCs/>
+          <w:rtl/>
+        </w:rPr>
+        <w:t xml:space="preserve">سقف بودجه ماهانه است.</w:t>
+      </w:r>
+      <w:r>
+        <w:rPr>
+          <w:rtl/>
+        </w:rPr>
+        <w:t xml:space="preserve"> کارت «بودجه» در صفحه‌ی </w:t>
+      </w:r>
+      <w:r>
+        <w:rPr>
+          <w:b/>
+          <w:bCs/>
+          <w:rtl/>
+        </w:rPr>
+        <w:t xml:space="preserve">مصرف</w:t>
+      </w:r>
+      <w:r>
+        <w:rPr>
+          <w:rtl/>
+        </w:rPr>
+        <w:t xml:space="preserve"> مصرف </w:t>
+      </w:r>
+      <w:r>
+        <w:rPr>
+          <w:b/>
+          <w:bCs/>
+          <w:rtl/>
+        </w:rPr>
+        <w:t xml:space="preserve">۳۰ روز گذشته</w:t>
+      </w:r>
+      <w:r>
+        <w:rPr>
+          <w:rtl/>
+        </w:rPr>
+        <w:t xml:space="preserve"> را در برابر سقف بودجه نشان می‌دهد و به انتخاب «۷ روز / ۳۰ روز» بالای صفحه بستگی ندارد. ⚠️ </w:t>
+      </w:r>
+      <w:r>
+        <w:rPr>
+          <w:i/>
+          <w:iCs/>
+          <w:rtl/>
+        </w:rPr>
+        <w:t xml:space="preserve">نیاز به تأیید: بازه‌ی دقیق (۳۰ روز غلتان یا ماه شمسی) و زمان ریست.</w:t>
       </w:r>
     </w:p>
     <w:p>
@@ -12313,7 +12625,7 @@
         <w:bidi/>
         <w:spacing w:after="120" w:line="320"/>
       </w:pPr>
-      <w:hyperlink w:history="1" r:id="rIdzjoqrbnj4wtvwjobj4qp8">
+      <w:hyperlink w:history="1" r:id="rId0xn9emj7lxhga45giefe5">
         <w:r>
           <w:rPr>
             <w:rStyle w:val="Hyperlink"/>
@@ -12328,7 +12640,7 @@
         </w:rPr>
         <w:t xml:space="preserve"> · </w:t>
       </w:r>
-      <w:hyperlink w:history="1" r:id="rIdwc5ujl8lqxpfp948mebur">
+      <w:hyperlink w:history="1" r:id="rIdxp_otuluywbmgzkol7q0h">
         <w:r>
           <w:rPr>
             <w:rStyle w:val="Hyperlink"/>
@@ -12343,7 +12655,7 @@
         </w:rPr>
         <w:t xml:space="preserve"> · </w:t>
       </w:r>
-      <w:hyperlink w:history="1" r:id="rIdn2zxb9lbcqnxpwgbzowy_">
+      <w:hyperlink w:history="1" r:id="rIdwaedph66j-u4_xmm4nxjs">
         <w:r>
           <w:rPr>
             <w:rStyle w:val="Hyperlink"/>
@@ -12358,7 +12670,7 @@
         </w:rPr>
         <w:t xml:space="preserve"> · </w:t>
       </w:r>
-      <w:hyperlink w:history="1" r:id="rIdfy7iqlcniouqtbyuiqay6">
+      <w:hyperlink w:history="1" r:id="rIdj9ipcn9zvwac5fccsri1z">
         <w:r>
           <w:rPr>
             <w:rStyle w:val="Hyperlink"/>

</xml_diff>

<commit_message>
docs: openai-direct claude code issue confirmed as gateway problem
Co-Authored-By: Claude Sonnet 5.5 <noreply@anthropic.com>
Claude-Session: https://claude.ai/code/session_01K2TE7hKB2uwZb8YzUQGaRz
</commit_message>
<xml_diff>
--- a/user-docs/sotoon-api-docs.docx
+++ b/user-docs/sotoon-api-docs.docx
@@ -9361,9 +9361,9 @@
       </w:r>
       <w:r>
         <w:rPr>
-          <w:rtl w:val="false"/>
-        </w:rPr>
-        <w:t xml:space="preserve"> ⚠️ </w:t>
+          <w:rtl/>
+        </w:rPr>
+        <w:t xml:space="preserve"> علت از سمت سرویس است (فیلدهای مخصوص Anthropic که Claude Code می‌فرستد به مدل‌های OpenAI رد می‌شوند) و با تنظیم کلاینت حل نمی‌شود. ⚠️ </w:t>
       </w:r>
       <w:r>
         <w:rPr>
@@ -9371,7 +9371,27 @@
           <w:iCs/>
           <w:rtl/>
         </w:rPr>
-        <w:t xml:space="preserve">در دست بررسی توسط تیم فنی. تا رفع آن، از مدل‌های دیگر استفاده کنید.</w:t>
+        <w:t xml:space="preserve">رفع آن در دست بررسی توسط تیم فنی است. تا آن زمان، برای Claude Code از مدل‌های دیگر (غیر </w:t>
+      </w:r>
+      <w:r>
+        <w:rPr>
+          <w:rFonts w:ascii="Consolas" w:cs="Consolas" w:hAnsi="Consolas"/>
+          <w:i/>
+          <w:iCs/>
+          <w:sz w:val="19"/>
+          <w:szCs w:val="19"/>
+          <w:shd w:fill="EFEFEF" w:color="auto" w:val="clear"/>
+          <w:rtl w:val="false"/>
+        </w:rPr>
+        <w:t xml:space="preserve">openai/...</w:t>
+      </w:r>
+      <w:r>
+        <w:rPr>
+          <w:i/>
+          <w:iCs/>
+          <w:rtl/>
+        </w:rPr>
+        <w:t xml:space="preserve">) استفاده کنید.</w:t>
       </w:r>
     </w:p>
     <w:p>
@@ -12625,7 +12645,7 @@
         <w:bidi/>
         <w:spacing w:after="120" w:line="320"/>
       </w:pPr>
-      <w:hyperlink w:history="1" r:id="rId0xn9emj7lxhga45giefe5">
+      <w:hyperlink w:history="1" r:id="rIdo88flsfl7hq0q1hd0swmt">
         <w:r>
           <w:rPr>
             <w:rStyle w:val="Hyperlink"/>
@@ -12640,7 +12660,7 @@
         </w:rPr>
         <w:t xml:space="preserve"> · </w:t>
       </w:r>
-      <w:hyperlink w:history="1" r:id="rIdxp_otuluywbmgzkol7q0h">
+      <w:hyperlink w:history="1" r:id="rIdt3pwttghvlhm2tncu082b">
         <w:r>
           <w:rPr>
             <w:rStyle w:val="Hyperlink"/>
@@ -12655,7 +12675,7 @@
         </w:rPr>
         <w:t xml:space="preserve"> · </w:t>
       </w:r>
-      <w:hyperlink w:history="1" r:id="rIdwaedph66j-u4_xmm4nxjs">
+      <w:hyperlink w:history="1" r:id="rIdvlklrroqtebuv1e7wql-2">
         <w:r>
           <w:rPr>
             <w:rStyle w:val="Hyperlink"/>
@@ -12670,7 +12690,7 @@
         </w:rPr>
         <w:t xml:space="preserve"> · </w:t>
       </w:r>
-      <w:hyperlink w:history="1" r:id="rIdj9ipcn9zvwac5fccsri1z">
+      <w:hyperlink w:history="1" r:id="rIdwtgravojccukbu-74w2ad">
         <w:r>
           <w:rPr>
             <w:rStyle w:val="Hyperlink"/>

</xml_diff>

<commit_message>
docs: max_tokens=1 on openai reasoning models breaks /model in Claude Code
Co-Authored-By: Claude Sonnet 5.5 <noreply@anthropic.com>
Claude-Session: https://claude.ai/code/session_01K2TE7hKB2uwZb8YzUQGaRz
</commit_message>
<xml_diff>
--- a/user-docs/sotoon-api-docs.docx
+++ b/user-docs/sotoon-api-docs.docx
@@ -9406,6 +9406,95 @@
       </w:pPr>
       <w:r>
         <w:rPr>
+          <w:b/>
+          <w:bCs/>
+          <w:rtl/>
+        </w:rPr>
+        <w:t xml:space="preserve">دستور </w:t>
+      </w:r>
+      <w:r>
+        <w:rPr>
+          <w:rFonts w:ascii="Consolas" w:cs="Consolas" w:hAnsi="Consolas"/>
+          <w:b/>
+          <w:bCs/>
+          <w:sz w:val="19"/>
+          <w:szCs w:val="19"/>
+          <w:shd w:fill="EFEFEF" w:color="auto" w:val="clear"/>
+          <w:rtl w:val="false"/>
+        </w:rPr>
+        <w:t xml:space="preserve">/model openai/...</w:t>
+      </w:r>
+      <w:r>
+        <w:rPr>
+          <w:b/>
+          <w:bCs/>
+          <w:rtl/>
+        </w:rPr>
+        <w:t xml:space="preserve"> ممکن است با </w:t>
+      </w:r>
+      <w:r>
+        <w:rPr>
+          <w:rFonts w:ascii="Consolas" w:cs="Consolas" w:hAnsi="Consolas"/>
+          <w:b/>
+          <w:bCs/>
+          <w:sz w:val="19"/>
+          <w:szCs w:val="19"/>
+          <w:shd w:fill="EFEFEF" w:color="auto" w:val="clear"/>
+          <w:rtl w:val="false"/>
+        </w:rPr>
+        <w:t xml:space="preserve">model not changed</w:t>
+      </w:r>
+      <w:r>
+        <w:rPr>
+          <w:b/>
+          <w:bCs/>
+          <w:rtl/>
+        </w:rPr>
+        <w:t xml:space="preserve"> رد شود</w:t>
+      </w:r>
+      <w:r>
+        <w:rPr>
+          <w:rtl/>
+        </w:rPr>
+        <w:t xml:space="preserve"> (خطای OpenAI درباره‌ی سقف خروجی، چون درخواست تأیید مدل سقف خیلی کوچکی دارد). به‌جای آن مدل را با متغیر </w:t>
+      </w:r>
+      <w:r>
+        <w:rPr>
+          <w:rFonts w:ascii="Consolas" w:cs="Consolas" w:hAnsi="Consolas"/>
+          <w:sz w:val="19"/>
+          <w:szCs w:val="19"/>
+          <w:shd w:fill="EFEFEF" w:color="auto" w:val="clear"/>
+          <w:rtl w:val="false"/>
+        </w:rPr>
+        <w:t xml:space="preserve">ANTHROPIC_MODEL</w:t>
+      </w:r>
+      <w:r>
+        <w:rPr>
+          <w:rtl/>
+        </w:rPr>
+        <w:t xml:space="preserve"> تنظیم کنید. ⚠️ </w:t>
+      </w:r>
+      <w:r>
+        <w:rPr>
+          <w:i/>
+          <w:iCs/>
+          <w:rtl/>
+        </w:rPr>
+        <w:t xml:space="preserve">بعد از رفع مشکل بالا دوباره تست شود.</w:t>
+      </w:r>
+    </w:p>
+    <w:p>
+      <w:pPr>
+        <w:pStyle w:val="ListParagraph"/>
+        <w:numPr>
+          <w:ilvl w:val="0"/>
+          <w:numId w:val="2"/>
+        </w:numPr>
+        <w:bidi/>
+        <w:spacing w:after="80" w:line="300"/>
+      </w:pPr>
+      <w:r>
+        <w:rPr>
           <w:rtl w:val="false"/>
         </w:rPr>
         <w:t xml:space="preserve">⚠️ </w:t>
@@ -12645,7 +12734,7 @@
         <w:bidi/>
         <w:spacing w:after="120" w:line="320"/>
       </w:pPr>
-      <w:hyperlink w:history="1" r:id="rIdo88flsfl7hq0q1hd0swmt">
+      <w:hyperlink w:history="1" r:id="rIdkb7kjhu2xz7-09yosaxru">
         <w:r>
           <w:rPr>
             <w:rStyle w:val="Hyperlink"/>
@@ -12660,7 +12749,7 @@
         </w:rPr>
         <w:t xml:space="preserve"> · </w:t>
       </w:r>
-      <w:hyperlink w:history="1" r:id="rIdt3pwttghvlhm2tncu082b">
+      <w:hyperlink w:history="1" r:id="rIdbg84kerbmmlgp_coddtgn">
         <w:r>
           <w:rPr>
             <w:rStyle w:val="Hyperlink"/>
@@ -12675,7 +12764,7 @@
         </w:rPr>
         <w:t xml:space="preserve"> · </w:t>
       </w:r>
-      <w:hyperlink w:history="1" r:id="rIdvlklrroqtebuv1e7wql-2">
+      <w:hyperlink w:history="1" r:id="rIdc3jx1ielf-l7ijsqg-8mj">
         <w:r>
           <w:rPr>
             <w:rStyle w:val="Hyperlink"/>
@@ -12690,7 +12779,7 @@
         </w:rPr>
         <w:t xml:space="preserve"> · </w:t>
       </w:r>
-      <w:hyperlink w:history="1" r:id="rIdwtgravojccukbu-74w2ad">
+      <w:hyperlink w:history="1" r:id="rIdzurq5rrmf0mekjeynyrra">
         <w:r>
           <w:rPr>
             <w:rStyle w:val="Hyperlink"/>

</xml_diff>

<commit_message>
docs: confirm output_config error in Claude Code; extend error table
Co-Authored-By: Claude Sonnet 5.5 <noreply@anthropic.com>
Claude-Session: https://claude.ai/code/session_01K2TE7hKB2uwZb8YzUQGaRz
</commit_message>
<xml_diff>
--- a/user-docs/sotoon-api-docs.docx
+++ b/user-docs/sotoon-api-docs.docx
@@ -4813,9 +4813,9 @@
         </w:tblBorders>
       </w:tblPr>
       <w:tblGrid>
-        <w:gridCol w:w="2349"/>
-        <w:gridCol w:w="3645"/>
-        <w:gridCol w:w="3644"/>
+        <w:gridCol w:w="3213"/>
+        <w:gridCol w:w="3213"/>
+        <w:gridCol w:w="3212"/>
       </w:tblGrid>
       <w:tr>
         <w:trPr>
@@ -4824,7 +4824,7 @@
         </w:trPr>
         <w:tc>
           <w:tcPr>
-            <w:tcW w:type="dxa" w:w="2349"/>
+            <w:tcW w:type="dxa" w:w="3213"/>
             <w:tcBorders>
               <w:top w:val="single" w:color="C9C9D6" w:sz="4"/>
               <w:left w:val="single" w:color="C9C9D6" w:sz="4"/>
@@ -4856,7 +4856,7 @@
         </w:tc>
         <w:tc>
           <w:tcPr>
-            <w:tcW w:type="dxa" w:w="3645"/>
+            <w:tcW w:type="dxa" w:w="3213"/>
             <w:tcBorders>
               <w:top w:val="single" w:color="C9C9D6" w:sz="4"/>
               <w:left w:val="single" w:color="C9C9D6" w:sz="4"/>
@@ -4888,7 +4888,7 @@
         </w:tc>
         <w:tc>
           <w:tcPr>
-            <w:tcW w:type="dxa" w:w="3644"/>
+            <w:tcW w:type="dxa" w:w="3212"/>
             <w:tcBorders>
               <w:top w:val="single" w:color="C9C9D6" w:sz="4"/>
               <w:left w:val="single" w:color="C9C9D6" w:sz="4"/>
@@ -4926,7 +4926,7 @@
         </w:trPr>
         <w:tc>
           <w:tcPr>
-            <w:tcW w:type="dxa" w:w="2349"/>
+            <w:tcW w:type="dxa" w:w="3213"/>
             <w:tcBorders>
               <w:top w:val="single" w:color="C9C9D6" w:sz="4"/>
               <w:left w:val="single" w:color="C9C9D6" w:sz="4"/>
@@ -4959,7 +4959,7 @@
         </w:tc>
         <w:tc>
           <w:tcPr>
-            <w:tcW w:type="dxa" w:w="3645"/>
+            <w:tcW w:type="dxa" w:w="3213"/>
             <w:tcBorders>
               <w:top w:val="single" w:color="C9C9D6" w:sz="4"/>
               <w:left w:val="single" w:color="C9C9D6" w:sz="4"/>
@@ -4982,13 +4982,29 @@
               <w:rPr>
                 <w:rtl/>
               </w:rPr>
-              <w:t xml:space="preserve">کلید اشتباه یا باطل شده</w:t>
+              <w:t xml:space="preserve">کلید اشتباه یا باطل شده. اگر پیام می‌گوید کلید باید با </w:t>
+            </w:r>
+            <w:r>
+              <w:rPr>
+                <w:rFonts w:ascii="Consolas" w:cs="Consolas" w:hAnsi="Consolas"/>
+                <w:sz w:val="19"/>
+                <w:szCs w:val="19"/>
+                <w:shd w:fill="EFEFEF" w:color="auto" w:val="clear"/>
+                <w:rtl w:val="false"/>
+              </w:rPr>
+              <w:t xml:space="preserve">sk-</w:t>
+            </w:r>
+            <w:r>
+              <w:rPr>
+                <w:rtl/>
+              </w:rPr>
+              <w:t xml:space="preserve"> شروع شود، مقدار کلید را درست کپی نکرده‌اید (مثلاً به‌جای کلید، متن دیگری در متغیر مانده)</w:t>
             </w:r>
           </w:p>
         </w:tc>
         <w:tc>
           <w:tcPr>
-            <w:tcW w:type="dxa" w:w="3644"/>
+            <w:tcW w:type="dxa" w:w="3212"/>
             <w:tcBorders>
               <w:top w:val="single" w:color="C9C9D6" w:sz="4"/>
               <w:left w:val="single" w:color="C9C9D6" w:sz="4"/>
@@ -5039,7 +5055,7 @@
         </w:trPr>
         <w:tc>
           <w:tcPr>
-            <w:tcW w:type="dxa" w:w="2349"/>
+            <w:tcW w:type="dxa" w:w="3213"/>
             <w:tcBorders>
               <w:top w:val="single" w:color="C9C9D6" w:sz="4"/>
               <w:left w:val="single" w:color="C9C9D6" w:sz="4"/>
@@ -5088,7 +5104,7 @@
         </w:tc>
         <w:tc>
           <w:tcPr>
-            <w:tcW w:type="dxa" w:w="3645"/>
+            <w:tcW w:type="dxa" w:w="3213"/>
             <w:tcBorders>
               <w:top w:val="single" w:color="C9C9D6" w:sz="4"/>
               <w:left w:val="single" w:color="C9C9D6" w:sz="4"/>
@@ -5117,7 +5133,7 @@
         </w:tc>
         <w:tc>
           <w:tcPr>
-            <w:tcW w:type="dxa" w:w="3644"/>
+            <w:tcW w:type="dxa" w:w="3212"/>
             <w:tcBorders>
               <w:top w:val="single" w:color="C9C9D6" w:sz="4"/>
               <w:left w:val="single" w:color="C9C9D6" w:sz="4"/>
@@ -5152,7 +5168,7 @@
         </w:trPr>
         <w:tc>
           <w:tcPr>
-            <w:tcW w:type="dxa" w:w="2349"/>
+            <w:tcW w:type="dxa" w:w="3213"/>
             <w:tcBorders>
               <w:top w:val="single" w:color="C9C9D6" w:sz="4"/>
               <w:left w:val="single" w:color="C9C9D6" w:sz="4"/>
@@ -5179,19 +5195,29 @@
                 <w:shd w:fill="EFEFEF" w:color="auto" w:val="clear"/>
                 <w:rtl w:val="false"/>
               </w:rPr>
-              <w:t xml:space="preserve">429</w:t>
-            </w:r>
-            <w:r>
-              <w:rPr>
+              <w:t xml:space="preserve">400</w:t>
+            </w:r>
+            <w:r>
+              <w:rPr>
+                <w:rtl/>
+              </w:rPr>
+              <w:t xml:space="preserve"> با </w:t>
+            </w:r>
+            <w:r>
+              <w:rPr>
+                <w:rFonts w:ascii="Consolas" w:cs="Consolas" w:hAnsi="Consolas"/>
+                <w:sz w:val="19"/>
+                <w:szCs w:val="19"/>
+                <w:shd w:fill="EFEFEF" w:color="auto" w:val="clear"/>
                 <w:rtl w:val="false"/>
               </w:rPr>
-              <w:t xml:space="preserve"> ⚠️</w:t>
+              <w:t xml:space="preserve">Unknown parameter</w:t>
             </w:r>
           </w:p>
         </w:tc>
         <w:tc>
           <w:tcPr>
-            <w:tcW w:type="dxa" w:w="3645"/>
+            <w:tcW w:type="dxa" w:w="3213"/>
             <w:tcBorders>
               <w:top w:val="single" w:color="C9C9D6" w:sz="4"/>
               <w:left w:val="single" w:color="C9C9D6" w:sz="4"/>
@@ -5214,13 +5240,13 @@
               <w:rPr>
                 <w:rtl/>
               </w:rPr>
-              <w:t xml:space="preserve">تعداد درخواست‌ها زیاد است</w:t>
+              <w:t xml:space="preserve">پارامتری فرستاده‌اید که آن مدل نمی‌شناسد (مثلاً بعضی مدل‌های OpenAI فیلدهای مخصوص Anthropic را رد می‌کنند)</w:t>
             </w:r>
           </w:p>
         </w:tc>
         <w:tc>
           <w:tcPr>
-            <w:tcW w:type="dxa" w:w="3644"/>
+            <w:tcW w:type="dxa" w:w="3212"/>
             <w:tcBorders>
               <w:top w:val="single" w:color="C9C9D6" w:sz="4"/>
               <w:left w:val="single" w:color="C9C9D6" w:sz="4"/>
@@ -5243,15 +5269,7 @@
               <w:rPr>
                 <w:rtl/>
               </w:rPr>
-              <w:t xml:space="preserve">با فاصله‌ی رو به افزایش (۱، ۲، ۴ ثانیه...) دوباره بفرستید. </w:t>
-            </w:r>
-            <w:r>
-              <w:rPr>
-                <w:i/>
-                <w:iCs/>
-                <w:rtl/>
-              </w:rPr>
-              <w:t xml:space="preserve">قالب دقیق تأیید نشده.</w:t>
+              <w:t xml:space="preserve">آن پارامتر را از درخواست حذف کنید.</w:t>
             </w:r>
           </w:p>
         </w:tc>
@@ -5263,7 +5281,7 @@
         </w:trPr>
         <w:tc>
           <w:tcPr>
-            <w:tcW w:type="dxa" w:w="2349"/>
+            <w:tcW w:type="dxa" w:w="3213"/>
             <w:tcBorders>
               <w:top w:val="single" w:color="C9C9D6" w:sz="4"/>
               <w:left w:val="single" w:color="C9C9D6" w:sz="4"/>
@@ -5284,15 +5302,41 @@
             </w:pPr>
             <w:r>
               <w:rPr>
+                <w:rFonts w:ascii="Consolas" w:cs="Consolas" w:hAnsi="Consolas"/>
+                <w:sz w:val="19"/>
+                <w:szCs w:val="19"/>
+                <w:shd w:fill="EFEFEF" w:color="auto" w:val="clear"/>
                 <w:rtl w:val="false"/>
               </w:rPr>
-              <w:t xml:space="preserve">⚠️</w:t>
+              <w:t xml:space="preserve">400</w:t>
+            </w:r>
+            <w:r>
+              <w:rPr>
+                <w:rtl/>
+              </w:rPr>
+              <w:t xml:space="preserve"> با «خروجی به سقف رسید» (</w:t>
+            </w:r>
+            <w:r>
+              <w:rPr>
+                <w:rFonts w:ascii="Consolas" w:cs="Consolas" w:hAnsi="Consolas"/>
+                <w:sz w:val="19"/>
+                <w:szCs w:val="19"/>
+                <w:shd w:fill="EFEFEF" w:color="auto" w:val="clear"/>
+                <w:rtl w:val="false"/>
+              </w:rPr>
+              <w:t xml:space="preserve">max_tokens or model output limit was reached</w:t>
+            </w:r>
+            <w:r>
+              <w:rPr>
+                <w:rtl w:val="false"/>
+              </w:rPr>
+              <w:t xml:space="preserve">)</w:t>
             </w:r>
           </w:p>
         </w:tc>
         <w:tc>
           <w:tcPr>
-            <w:tcW w:type="dxa" w:w="3645"/>
+            <w:tcW w:type="dxa" w:w="3213"/>
             <w:tcBorders>
               <w:top w:val="single" w:color="C9C9D6" w:sz="4"/>
               <w:left w:val="single" w:color="C9C9D6" w:sz="4"/>
@@ -5315,13 +5359,29 @@
               <w:rPr>
                 <w:rtl/>
               </w:rPr>
-              <w:t xml:space="preserve">بودجه‌ی workspace تمام شده</w:t>
+              <w:t xml:space="preserve">سقف </w:t>
+            </w:r>
+            <w:r>
+              <w:rPr>
+                <w:rFonts w:ascii="Consolas" w:cs="Consolas" w:hAnsi="Consolas"/>
+                <w:sz w:val="19"/>
+                <w:szCs w:val="19"/>
+                <w:shd w:fill="EFEFEF" w:color="auto" w:val="clear"/>
+                <w:rtl w:val="false"/>
+              </w:rPr>
+              <w:t xml:space="preserve">max_tokens</w:t>
+            </w:r>
+            <w:r>
+              <w:rPr>
+                <w:rtl/>
+              </w:rPr>
+              <w:t xml:space="preserve"> برای مدل reasoning خیلی کوچک است (مثلاً ۱)</w:t>
             </w:r>
           </w:p>
         </w:tc>
         <w:tc>
           <w:tcPr>
-            <w:tcW w:type="dxa" w:w="3644"/>
+            <w:tcW w:type="dxa" w:w="3212"/>
             <w:tcBorders>
               <w:top w:val="single" w:color="C9C9D6" w:sz="4"/>
               <w:left w:val="single" w:color="C9C9D6" w:sz="4"/>
@@ -5342,17 +5402,19 @@
             </w:pPr>
             <w:r>
               <w:rPr>
+                <w:rFonts w:ascii="Consolas" w:cs="Consolas" w:hAnsi="Consolas"/>
+                <w:sz w:val="19"/>
+                <w:szCs w:val="19"/>
+                <w:shd w:fill="EFEFEF" w:color="auto" w:val="clear"/>
+                <w:rtl w:val="false"/>
+              </w:rPr>
+              <w:t xml:space="preserve">max_tokens</w:t>
+            </w:r>
+            <w:r>
+              <w:rPr>
                 <w:rtl/>
               </w:rPr>
-              <w:t xml:space="preserve">از صفحه‌ی «مصرف» بودجه را افزایش دهید. </w:t>
-            </w:r>
-            <w:r>
-              <w:rPr>
-                <w:i/>
-                <w:iCs/>
-                <w:rtl/>
-              </w:rPr>
-              <w:t xml:space="preserve">کد و متن دقیق خطا تأیید نشده.</w:t>
+              <w:t xml:space="preserve"> را بزرگ‌تر بگذارید یا ننویسید.</w:t>
             </w:r>
           </w:p>
         </w:tc>
@@ -5364,7 +5426,7 @@
         </w:trPr>
         <w:tc>
           <w:tcPr>
-            <w:tcW w:type="dxa" w:w="2349"/>
+            <w:tcW w:type="dxa" w:w="3213"/>
             <w:tcBorders>
               <w:top w:val="single" w:color="C9C9D6" w:sz="4"/>
               <w:left w:val="single" w:color="C9C9D6" w:sz="4"/>
@@ -5391,13 +5453,19 @@
                 <w:shd w:fill="EFEFEF" w:color="auto" w:val="clear"/>
                 <w:rtl w:val="false"/>
               </w:rPr>
-              <w:t xml:space="preserve">5xx</w:t>
+              <w:t xml:space="preserve">429</w:t>
+            </w:r>
+            <w:r>
+              <w:rPr>
+                <w:rtl w:val="false"/>
+              </w:rPr>
+              <w:t xml:space="preserve"> ⚠️</w:t>
             </w:r>
           </w:p>
         </w:tc>
         <w:tc>
           <w:tcPr>
-            <w:tcW w:type="dxa" w:w="3645"/>
+            <w:tcW w:type="dxa" w:w="3213"/>
             <w:tcBorders>
               <w:top w:val="single" w:color="C9C9D6" w:sz="4"/>
               <w:left w:val="single" w:color="C9C9D6" w:sz="4"/>
@@ -5420,13 +5488,13 @@
               <w:rPr>
                 <w:rtl/>
               </w:rPr>
-              <w:t xml:space="preserve">خطای موقت سرور یا ارائه‌دهنده‌ی مدل</w:t>
+              <w:t xml:space="preserve">تعداد درخواست‌ها زیاد است</w:t>
             </w:r>
           </w:p>
         </w:tc>
         <w:tc>
           <w:tcPr>
-            <w:tcW w:type="dxa" w:w="3644"/>
+            <w:tcW w:type="dxa" w:w="3212"/>
             <w:tcBorders>
               <w:top w:val="single" w:color="C9C9D6" w:sz="4"/>
               <w:left w:val="single" w:color="C9C9D6" w:sz="4"/>
@@ -5449,7 +5517,15 @@
               <w:rPr>
                 <w:rtl/>
               </w:rPr>
-              <w:t xml:space="preserve">با فاصله‌ی رو به افزایش دوباره بفرستید.</w:t>
+              <w:t xml:space="preserve">با فاصله‌ی رو به افزایش (۱، ۲، ۴ ثانیه...) دوباره بفرستید. </w:t>
+            </w:r>
+            <w:r>
+              <w:rPr>
+                <w:i/>
+                <w:iCs/>
+                <w:rtl/>
+              </w:rPr>
+              <w:t xml:space="preserve">قالب دقیق تأیید نشده.</w:t>
             </w:r>
           </w:p>
         </w:tc>
@@ -5461,7 +5537,7 @@
         </w:trPr>
         <w:tc>
           <w:tcPr>
-            <w:tcW w:type="dxa" w:w="2349"/>
+            <w:tcW w:type="dxa" w:w="3213"/>
             <w:tcBorders>
               <w:top w:val="single" w:color="C9C9D6" w:sz="4"/>
               <w:left w:val="single" w:color="C9C9D6" w:sz="4"/>
@@ -5482,15 +5558,15 @@
             </w:pPr>
             <w:r>
               <w:rPr>
-                <w:rtl/>
-              </w:rPr>
-              <w:t xml:space="preserve">بدون پاسخ</w:t>
+                <w:rtl w:val="false"/>
+              </w:rPr>
+              <w:t xml:space="preserve">⚠️</w:t>
             </w:r>
           </w:p>
         </w:tc>
         <w:tc>
           <w:tcPr>
-            <w:tcW w:type="dxa" w:w="3645"/>
+            <w:tcW w:type="dxa" w:w="3213"/>
             <w:tcBorders>
               <w:top w:val="single" w:color="C9C9D6" w:sz="4"/>
               <w:left w:val="single" w:color="C9C9D6" w:sz="4"/>
@@ -5513,13 +5589,13 @@
               <w:rPr>
                 <w:rtl/>
               </w:rPr>
-              <w:t xml:space="preserve">مشکل اتصال</w:t>
+              <w:t xml:space="preserve">بودجه‌ی workspace تمام شده</w:t>
             </w:r>
           </w:p>
         </w:tc>
         <w:tc>
           <w:tcPr>
-            <w:tcW w:type="dxa" w:w="3644"/>
+            <w:tcW w:type="dxa" w:w="3212"/>
             <w:tcBorders>
               <w:top w:val="single" w:color="C9C9D6" w:sz="4"/>
               <w:left w:val="single" w:color="C9C9D6" w:sz="4"/>
@@ -5542,8 +5618,45 @@
               <w:rPr>
                 <w:rtl/>
               </w:rPr>
-              <w:t xml:space="preserve">اینترنت و VPN را بررسی کنید. در </w:t>
-            </w:r>
+              <w:t xml:space="preserve">از صفحه‌ی «مصرف» بودجه را افزایش دهید. </w:t>
+            </w:r>
+            <w:r>
+              <w:rPr>
+                <w:i/>
+                <w:iCs/>
+                <w:rtl/>
+              </w:rPr>
+              <w:t xml:space="preserve">کد و متن دقیق خطا تأیید نشده.</w:t>
+            </w:r>
+          </w:p>
+        </w:tc>
+      </w:tr>
+      <w:tr>
+        <w:trPr>
+          <w:cantSplit/>
+          <w:tblHeader w:val="off"/>
+        </w:trPr>
+        <w:tc>
+          <w:tcPr>
+            <w:tcW w:type="dxa" w:w="3213"/>
+            <w:tcBorders>
+              <w:top w:val="single" w:color="C9C9D6" w:sz="4"/>
+              <w:left w:val="single" w:color="C9C9D6" w:sz="4"/>
+              <w:bottom w:val="single" w:color="C9C9D6" w:sz="4"/>
+              <w:right w:val="single" w:color="C9C9D6" w:sz="4"/>
+            </w:tcBorders>
+            <w:tcMar>
+              <w:top w:type="dxa" w:w="70"/>
+              <w:left w:type="dxa" w:w="110"/>
+              <w:bottom w:type="dxa" w:w="70"/>
+              <w:right w:type="dxa" w:w="110"/>
+            </w:tcMar>
+          </w:tcPr>
+          <w:p>
+            <w:pPr>
+              <w:bidi/>
+              <w:spacing w:after="0" w:line="290"/>
+            </w:pPr>
             <w:r>
               <w:rPr>
                 <w:rFonts w:ascii="Consolas" w:cs="Consolas" w:hAnsi="Consolas"/>
@@ -5552,13 +5665,158 @@
                 <w:shd w:fill="EFEFEF" w:color="auto" w:val="clear"/>
                 <w:rtl w:val="false"/>
               </w:rPr>
-              <w:t xml:space="preserve">curl</w:t>
-            </w:r>
+              <w:t xml:space="preserve">5xx</w:t>
+            </w:r>
+          </w:p>
+        </w:tc>
+        <w:tc>
+          <w:tcPr>
+            <w:tcW w:type="dxa" w:w="3213"/>
+            <w:tcBorders>
+              <w:top w:val="single" w:color="C9C9D6" w:sz="4"/>
+              <w:left w:val="single" w:color="C9C9D6" w:sz="4"/>
+              <w:bottom w:val="single" w:color="C9C9D6" w:sz="4"/>
+              <w:right w:val="single" w:color="C9C9D6" w:sz="4"/>
+            </w:tcBorders>
+            <w:tcMar>
+              <w:top w:type="dxa" w:w="70"/>
+              <w:left w:type="dxa" w:w="110"/>
+              <w:bottom w:type="dxa" w:w="70"/>
+              <w:right w:type="dxa" w:w="110"/>
+            </w:tcMar>
+          </w:tcPr>
+          <w:p>
+            <w:pPr>
+              <w:bidi/>
+              <w:spacing w:after="0" w:line="290"/>
+            </w:pPr>
             <w:r>
               <w:rPr>
                 <w:rtl/>
               </w:rPr>
-              <w:t xml:space="preserve"> گزینه‌ی </w:t>
+              <w:t xml:space="preserve">خطای موقت سرور یا ارائه‌دهنده‌ی مدل</w:t>
+            </w:r>
+          </w:p>
+        </w:tc>
+        <w:tc>
+          <w:tcPr>
+            <w:tcW w:type="dxa" w:w="3212"/>
+            <w:tcBorders>
+              <w:top w:val="single" w:color="C9C9D6" w:sz="4"/>
+              <w:left w:val="single" w:color="C9C9D6" w:sz="4"/>
+              <w:bottom w:val="single" w:color="C9C9D6" w:sz="4"/>
+              <w:right w:val="single" w:color="C9C9D6" w:sz="4"/>
+            </w:tcBorders>
+            <w:tcMar>
+              <w:top w:type="dxa" w:w="70"/>
+              <w:left w:type="dxa" w:w="110"/>
+              <w:bottom w:type="dxa" w:w="70"/>
+              <w:right w:type="dxa" w:w="110"/>
+            </w:tcMar>
+          </w:tcPr>
+          <w:p>
+            <w:pPr>
+              <w:bidi/>
+              <w:spacing w:after="0" w:line="290"/>
+            </w:pPr>
+            <w:r>
+              <w:rPr>
+                <w:rtl/>
+              </w:rPr>
+              <w:t xml:space="preserve">با فاصله‌ی رو به افزایش دوباره بفرستید.</w:t>
+            </w:r>
+          </w:p>
+        </w:tc>
+      </w:tr>
+      <w:tr>
+        <w:trPr>
+          <w:cantSplit/>
+          <w:tblHeader w:val="off"/>
+        </w:trPr>
+        <w:tc>
+          <w:tcPr>
+            <w:tcW w:type="dxa" w:w="3213"/>
+            <w:tcBorders>
+              <w:top w:val="single" w:color="C9C9D6" w:sz="4"/>
+              <w:left w:val="single" w:color="C9C9D6" w:sz="4"/>
+              <w:bottom w:val="single" w:color="C9C9D6" w:sz="4"/>
+              <w:right w:val="single" w:color="C9C9D6" w:sz="4"/>
+            </w:tcBorders>
+            <w:tcMar>
+              <w:top w:type="dxa" w:w="70"/>
+              <w:left w:type="dxa" w:w="110"/>
+              <w:bottom w:type="dxa" w:w="70"/>
+              <w:right w:type="dxa" w:w="110"/>
+            </w:tcMar>
+          </w:tcPr>
+          <w:p>
+            <w:pPr>
+              <w:bidi/>
+              <w:spacing w:after="0" w:line="290"/>
+            </w:pPr>
+            <w:r>
+              <w:rPr>
+                <w:rtl/>
+              </w:rPr>
+              <w:t xml:space="preserve">بدون پاسخ</w:t>
+            </w:r>
+          </w:p>
+        </w:tc>
+        <w:tc>
+          <w:tcPr>
+            <w:tcW w:type="dxa" w:w="3213"/>
+            <w:tcBorders>
+              <w:top w:val="single" w:color="C9C9D6" w:sz="4"/>
+              <w:left w:val="single" w:color="C9C9D6" w:sz="4"/>
+              <w:bottom w:val="single" w:color="C9C9D6" w:sz="4"/>
+              <w:right w:val="single" w:color="C9C9D6" w:sz="4"/>
+            </w:tcBorders>
+            <w:tcMar>
+              <w:top w:type="dxa" w:w="70"/>
+              <w:left w:type="dxa" w:w="110"/>
+              <w:bottom w:type="dxa" w:w="70"/>
+              <w:right w:type="dxa" w:w="110"/>
+            </w:tcMar>
+          </w:tcPr>
+          <w:p>
+            <w:pPr>
+              <w:bidi/>
+              <w:spacing w:after="0" w:line="290"/>
+            </w:pPr>
+            <w:r>
+              <w:rPr>
+                <w:rtl/>
+              </w:rPr>
+              <w:t xml:space="preserve">مشکل اتصال</w:t>
+            </w:r>
+          </w:p>
+        </w:tc>
+        <w:tc>
+          <w:tcPr>
+            <w:tcW w:type="dxa" w:w="3212"/>
+            <w:tcBorders>
+              <w:top w:val="single" w:color="C9C9D6" w:sz="4"/>
+              <w:left w:val="single" w:color="C9C9D6" w:sz="4"/>
+              <w:bottom w:val="single" w:color="C9C9D6" w:sz="4"/>
+              <w:right w:val="single" w:color="C9C9D6" w:sz="4"/>
+            </w:tcBorders>
+            <w:tcMar>
+              <w:top w:type="dxa" w:w="70"/>
+              <w:left w:type="dxa" w:w="110"/>
+              <w:bottom w:type="dxa" w:w="70"/>
+              <w:right w:type="dxa" w:w="110"/>
+            </w:tcMar>
+          </w:tcPr>
+          <w:p>
+            <w:pPr>
+              <w:bidi/>
+              <w:spacing w:after="0" w:line="290"/>
+            </w:pPr>
+            <w:r>
+              <w:rPr>
+                <w:rtl/>
+              </w:rPr>
+              <w:t xml:space="preserve">اینترنت و VPN را بررسی کنید. در </w:t>
             </w:r>
             <w:r>
               <w:rPr>
@@ -5568,6 +5826,22 @@
                 <w:shd w:fill="EFEFEF" w:color="auto" w:val="clear"/>
                 <w:rtl w:val="false"/>
               </w:rPr>
+              <w:t xml:space="preserve">curl</w:t>
+            </w:r>
+            <w:r>
+              <w:rPr>
+                <w:rtl/>
+              </w:rPr>
+              <w:t xml:space="preserve"> گزینه‌ی </w:t>
+            </w:r>
+            <w:r>
+              <w:rPr>
+                <w:rFonts w:ascii="Consolas" w:cs="Consolas" w:hAnsi="Consolas"/>
+                <w:sz w:val="19"/>
+                <w:szCs w:val="19"/>
+                <w:shd w:fill="EFEFEF" w:color="auto" w:val="clear"/>
+                <w:rtl w:val="false"/>
+              </w:rPr>
               <w:t xml:space="preserve">--max-time 60</w:t>
             </w:r>
             <w:r>
@@ -5627,6 +5901,60 @@
           <w:rtl/>
         </w:rPr>
         <w:t xml:space="preserve"> تکرار درخواست فایده ندارد.</w:t>
+      </w:r>
+    </w:p>
+    <w:p>
+      <w:pPr>
+        <w:shd w:fill="FFF4CE" w:color="auto" w:val="clear"/>
+        <w:bidi/>
+        <w:spacing w:after="120" w:before="80" w:line="300"/>
+        <w:ind w:left="200" w:right="200"/>
+      </w:pPr>
+      <w:r>
+        <w:rPr>
+          <w:rtl/>
+        </w:rPr>
+        <w:t xml:space="preserve">در مسیر </w:t>
+      </w:r>
+      <w:r>
+        <w:rPr>
+          <w:rFonts w:ascii="Consolas" w:cs="Consolas" w:hAnsi="Consolas"/>
+          <w:sz w:val="19"/>
+          <w:szCs w:val="19"/>
+          <w:shd w:fill="EFEFEF" w:color="auto" w:val="clear"/>
+          <w:rtl w:val="false"/>
+        </w:rPr>
+        <w:t xml:space="preserve">/v1/messages</w:t>
+      </w:r>
+      <w:r>
+        <w:rPr>
+          <w:rtl/>
+        </w:rPr>
+        <w:t xml:space="preserve"> (قالب Anthropic) بعضی خطاها ممکن است قالب کمی متفاوت داشته باشند (مثلاً </w:t>
+      </w:r>
+      <w:r>
+        <w:rPr>
+          <w:rFonts w:ascii="Consolas" w:cs="Consolas" w:hAnsi="Consolas"/>
+          <w:sz w:val="19"/>
+          <w:szCs w:val="19"/>
+          <w:shd w:fill="EFEFEF" w:color="auto" w:val="clear"/>
+          <w:rtl w:val="false"/>
+        </w:rPr>
+        <w:t xml:space="preserve">error</w:t>
+      </w:r>
+      <w:r>
+        <w:rPr>
+          <w:rtl/>
+        </w:rPr>
+        <w:t xml:space="preserve"> یک رشته باشد، نه شیء). </w:t>
+      </w:r>
+      <w:r>
+        <w:rPr>
+          <w:i/>
+          <w:iCs/>
+          <w:rtl/>
+        </w:rPr>
+        <w:t xml:space="preserve">این فقط در یک خطا دیده شده و کامل تأیید نشده.</w:t>
       </w:r>
     </w:p>
     <w:p>
@@ -12734,7 +13062,7 @@
         <w:bidi/>
         <w:spacing w:after="120" w:line="320"/>
       </w:pPr>
-      <w:hyperlink w:history="1" r:id="rIdkb7kjhu2xz7-09yosaxru">
+      <w:hyperlink w:history="1" r:id="rIdqhgplaiyqtigw_pv5lm_u">
         <w:r>
           <w:rPr>
             <w:rStyle w:val="Hyperlink"/>
@@ -12749,7 +13077,7 @@
         </w:rPr>
         <w:t xml:space="preserve"> · </w:t>
       </w:r>
-      <w:hyperlink w:history="1" r:id="rIdbg84kerbmmlgp_coddtgn">
+      <w:hyperlink w:history="1" r:id="rIdz20frut7crb6i4on4xhkx">
         <w:r>
           <w:rPr>
             <w:rStyle w:val="Hyperlink"/>
@@ -12764,7 +13092,7 @@
         </w:rPr>
         <w:t xml:space="preserve"> · </w:t>
       </w:r>
-      <w:hyperlink w:history="1" r:id="rIdc3jx1ielf-l7ijsqg-8mj">
+      <w:hyperlink w:history="1" r:id="rIdq5qvqizllkc_uhp3988oe">
         <w:r>
           <w:rPr>
             <w:rStyle w:val="Hyperlink"/>
@@ -12779,7 +13107,7 @@
         </w:rPr>
         <w:t xml:space="preserve"> · </w:t>
       </w:r>
-      <w:hyperlink w:history="1" r:id="rIdzurq5rrmf0mekjeynyrra">
+      <w:hyperlink w:history="1" r:id="rIdmkbqiky_-rjz26oepyecd">
         <w:r>
           <w:rPr>
             <w:rStyle w:val="Hyperlink"/>

</xml_diff>

<commit_message>
docs: tool-calling requirement; vllm hosted model issue
Co-Authored-By: Claude Sonnet 5.5 <noreply@anthropic.com>
Claude-Session: https://claude.ai/code/session_01K2TE7hKB2uwZb8YzUQGaRz
</commit_message>
<xml_diff>
--- a/user-docs/sotoon-api-docs.docx
+++ b/user-docs/sotoon-api-docs.docx
@@ -9738,6 +9738,87 @@
           <w:bCs/>
           <w:rtl/>
         </w:rPr>
+        <w:t xml:space="preserve">مدل باید tool calling را پشتیبانی کند.</w:t>
+      </w:r>
+      <w:r>
+        <w:rPr>
+          <w:rtl/>
+        </w:rPr>
+        <w:t xml:space="preserve"> Claude Code و ابزارهای کدنویسی همیشه ابزار (</w:t>
+      </w:r>
+      <w:r>
+        <w:rPr>
+          <w:rFonts w:ascii="Consolas" w:cs="Consolas" w:hAnsi="Consolas"/>
+          <w:sz w:val="19"/>
+          <w:szCs w:val="19"/>
+          <w:shd w:fill="EFEFEF" w:color="auto" w:val="clear"/>
+          <w:rtl w:val="false"/>
+        </w:rPr>
+        <w:t xml:space="preserve">tools</w:t>
+      </w:r>
+      <w:r>
+        <w:rPr>
+          <w:rtl/>
+        </w:rPr>
+        <w:t xml:space="preserve">) می‌فرستند. بعضی مدل‌ها (مثلاً بعضی مدل‌های میزبانی‌شده‌ی خود سرویس مثل </w:t>
+      </w:r>
+      <w:r>
+        <w:rPr>
+          <w:rFonts w:ascii="Consolas" w:cs="Consolas" w:hAnsi="Consolas"/>
+          <w:sz w:val="19"/>
+          <w:szCs w:val="19"/>
+          <w:shd w:fill="EFEFEF" w:color="auto" w:val="clear"/>
+          <w:rtl w:val="false"/>
+        </w:rPr>
+        <w:t xml:space="preserve">google/gemma3-27b</w:t>
+      </w:r>
+      <w:r>
+        <w:rPr>
+          <w:rtl/>
+        </w:rPr>
+        <w:t xml:space="preserve">) با خطای </w:t>
+      </w:r>
+      <w:r>
+        <w:rPr>
+          <w:rFonts w:ascii="Consolas" w:cs="Consolas" w:hAnsi="Consolas"/>
+          <w:sz w:val="19"/>
+          <w:szCs w:val="19"/>
+          <w:shd w:fill="EFEFEF" w:color="auto" w:val="clear"/>
+          <w:rtl w:val="false"/>
+        </w:rPr>
+        <w:t xml:space="preserve">400 ... "auto" tool choice requires --enable-auto-tool-choice and --tool-call-parser to be set</w:t>
+      </w:r>
+      <w:r>
+        <w:rPr>
+          <w:rtl/>
+        </w:rPr>
+        <w:t xml:space="preserve"> رد می‌کنند. در این صورت مدل دیگری انتخاب کنید. ⚠️ </w:t>
+      </w:r>
+      <w:r>
+        <w:rPr>
+          <w:i/>
+          <w:iCs/>
+          <w:rtl/>
+        </w:rPr>
+        <w:t xml:space="preserve">فهرست مدل‌های سازگار با ابزارهای کدنویسی هنوز مشخص نیست؛ از تیم فنی بپرسید یا در صفحه‌ی مدل‌ها نشان داده شود.</w:t>
+      </w:r>
+    </w:p>
+    <w:p>
+      <w:pPr>
+        <w:pStyle w:val="ListParagraph"/>
+        <w:numPr>
+          <w:ilvl w:val="0"/>
+          <w:numId w:val="2"/>
+        </w:numPr>
+        <w:bidi/>
+        <w:spacing w:after="80" w:line="300"/>
+      </w:pPr>
+      <w:r>
+        <w:rPr>
+          <w:b/>
+          <w:bCs/>
+          <w:rtl/>
+        </w:rPr>
         <w:t xml:space="preserve">دستور </w:t>
       </w:r>
       <w:r>
@@ -13062,7 +13143,7 @@
         <w:bidi/>
         <w:spacing w:after="120" w:line="320"/>
       </w:pPr>
-      <w:hyperlink w:history="1" r:id="rIdqhgplaiyqtigw_pv5lm_u">
+      <w:hyperlink w:history="1" r:id="rIdiscawqbkaqshbp1k_9yjg">
         <w:r>
           <w:rPr>
             <w:rStyle w:val="Hyperlink"/>
@@ -13077,7 +13158,7 @@
         </w:rPr>
         <w:t xml:space="preserve"> · </w:t>
       </w:r>
-      <w:hyperlink w:history="1" r:id="rIdz20frut7crb6i4on4xhkx">
+      <w:hyperlink w:history="1" r:id="rIdd0ifkpxhxbpd9riod4n9m">
         <w:r>
           <w:rPr>
             <w:rStyle w:val="Hyperlink"/>
@@ -13092,7 +13173,7 @@
         </w:rPr>
         <w:t xml:space="preserve"> · </w:t>
       </w:r>
-      <w:hyperlink w:history="1" r:id="rIdq5qvqizllkc_uhp3988oe">
+      <w:hyperlink w:history="1" r:id="rIdlzvl7zffnvji3_632ooge">
         <w:r>
           <w:rPr>
             <w:rStyle w:val="Hyperlink"/>
@@ -13107,7 +13188,7 @@
         </w:rPr>
         <w:t xml:space="preserve"> · </w:t>
       </w:r>
-      <w:hyperlink w:history="1" r:id="rIdmkbqiky_-rjz26oepyecd">
+      <w:hyperlink w:history="1" r:id="rIdeidfdwm2csoaolb-ukjql">
         <w:r>
           <w:rPr>
             <w:rStyle w:val="Hyperlink"/>

</xml_diff>

<commit_message>
docs: copilot free test result (model not shown in chat picker)
Co-Authored-By: Claude Sonnet 5.5 <noreply@anthropic.com>
Claude-Session: https://claude.ai/code/session_01K2TE7hKB2uwZb8YzUQGaRz
</commit_message>
<xml_diff>
--- a/user-docs/sotoon-api-docs.docx
+++ b/user-docs/sotoon-api-docs.docx
@@ -7116,7 +7116,37 @@
         <w:rPr>
           <w:rtl/>
         </w:rPr>
-        <w:t xml:space="preserve"> از راهنمای قبلی که تست شده و کار کرده.</w:t>
+        <w:t xml:space="preserve"> مراحل از راهنمای قبلی است که قبلاً (توسط تیم) کار کرده. در تست ما (اکتبر ۲۰۲۶) با طرح </w:t>
+      </w:r>
+      <w:r>
+        <w:rPr>
+          <w:b/>
+          <w:bCs/>
+          <w:rtl w:val="false"/>
+        </w:rPr>
+        <w:t xml:space="preserve">Copilot Free</w:t>
+      </w:r>
+      <w:r>
+        <w:rPr>
+          <w:rtl/>
+        </w:rPr>
+        <w:t xml:space="preserve">: افزونه‌ی OAI Compatible نصب و Provider و مدل (</w:t>
+      </w:r>
+      <w:r>
+        <w:rPr>
+          <w:rFonts w:ascii="Consolas" w:cs="Consolas" w:hAnsi="Consolas"/>
+          <w:sz w:val="19"/>
+          <w:szCs w:val="19"/>
+          <w:shd w:fill="EFEFEF" w:color="auto" w:val="clear"/>
+          <w:rtl w:val="false"/>
+        </w:rPr>
+        <w:t xml:space="preserve">deepseek/deepseek-v4-flash-0731</w:t>
+      </w:r>
+      <w:r>
+        <w:rPr>
+          <w:rtl/>
+        </w:rPr>
+        <w:t xml:space="preserve">) ثبت شد و در Language Models با برچسب Tools دیده شد، ولی در منوی مدل چت (فقط Auto و مدل‌های Copilot) ظاهر نشد؛ علت نامشخص (احتمالاً محدودیت طرح رایگان یا سیاست حساب). چت با Auto خطای «Sorry, something went wrong» داد. پس در این محیط تا انتها تأیید نشد.</w:t>
       </w:r>
     </w:p>
     <w:p>
@@ -13143,7 +13173,7 @@
         <w:bidi/>
         <w:spacing w:after="120" w:line="320"/>
       </w:pPr>
-      <w:hyperlink w:history="1" r:id="rIdiscawqbkaqshbp1k_9yjg">
+      <w:hyperlink w:history="1" r:id="rIdzskgebs2qnw6ydsagxiow">
         <w:r>
           <w:rPr>
             <w:rStyle w:val="Hyperlink"/>
@@ -13158,7 +13188,7 @@
         </w:rPr>
         <w:t xml:space="preserve"> · </w:t>
       </w:r>
-      <w:hyperlink w:history="1" r:id="rIdd0ifkpxhxbpd9riod4n9m">
+      <w:hyperlink w:history="1" r:id="rId_4z_cjsrksdgmpszy8fyg">
         <w:r>
           <w:rPr>
             <w:rStyle w:val="Hyperlink"/>
@@ -13173,7 +13203,7 @@
         </w:rPr>
         <w:t xml:space="preserve"> · </w:t>
       </w:r>
-      <w:hyperlink w:history="1" r:id="rIdlzvl7zffnvji3_632ooge">
+      <w:hyperlink w:history="1" r:id="rId3tngywbjhwmwqznkbwjsk">
         <w:r>
           <w:rPr>
             <w:rStyle w:val="Hyperlink"/>
@@ -13188,7 +13218,7 @@
         </w:rPr>
         <w:t xml:space="preserve"> · </w:t>
       </w:r>
-      <w:hyperlink w:history="1" r:id="rIdeidfdwm2csoaolb-ukjql">
+      <w:hyperlink w:history="1" r:id="rIdpbknzzz7ypc-cdqaie1nb">
         <w:r>
           <w:rPr>
             <w:rStyle w:val="Hyperlink"/>

</xml_diff>

<commit_message>
docs: copilot session type must be Local to see custom models
Co-Authored-By: Claude Sonnet 5.5 <noreply@anthropic.com>
Claude-Session: https://claude.ai/code/session_01K2TE7hKB2uwZb8YzUQGaRz
</commit_message>
<xml_diff>
--- a/user-docs/sotoon-api-docs.docx
+++ b/user-docs/sotoon-api-docs.docx
@@ -7146,7 +7146,21 @@
         <w:rPr>
           <w:rtl/>
         </w:rPr>
-        <w:t xml:space="preserve">) ثبت شد و در Language Models با برچسب Tools دیده شد، ولی در منوی مدل چت (فقط Auto و مدل‌های Copilot) ظاهر نشد؛ علت نامشخص (احتمالاً محدودیت طرح رایگان یا سیاست حساب). چت با Auto خطای «Sorry, something went wrong» داد. پس در این محیط تا انتها تأیید نشد.</w:t>
+        <w:t xml:space="preserve">) ثبت شد و در Language Models با برچسب Tools دیده شد، ولی در منوی مدل چت (فقط Auto و مدل‌های Copilot) ظاهر نشد. علت: نوع جلسه‌ی چت روی «Copilot» مانده بود؛ بعد از تغییر به </w:t>
+      </w:r>
+      <w:r>
+        <w:rPr>
+          <w:b/>
+          <w:bCs/>
+          <w:rtl w:val="false"/>
+        </w:rPr>
+        <w:t xml:space="preserve">Local</w:t>
+      </w:r>
+      <w:r>
+        <w:rPr>
+          <w:rtl/>
+        </w:rPr>
+        <w:t xml:space="preserve"> مدل‌ها دیده شدند (در داکیومنت آمده). پیام چت با مدل ستون و حالت Agent هنوز تأیید نشده.</w:t>
       </w:r>
     </w:p>
     <w:p>
@@ -11302,6 +11316,56 @@
     </w:p>
     <w:p>
       <w:pPr>
+        <w:shd w:fill="FFF4CE" w:color="auto" w:val="clear"/>
+        <w:bidi/>
+        <w:spacing w:after="120" w:before="80" w:line="300"/>
+        <w:ind w:left="200" w:right="200"/>
+      </w:pPr>
+      <w:r>
+        <w:rPr>
+          <w:b/>
+          <w:bCs/>
+          <w:rtl/>
+        </w:rPr>
+        <w:t xml:space="preserve">نکته مهم:</w:t>
+      </w:r>
+      <w:r>
+        <w:rPr>
+          <w:rtl/>
+        </w:rPr>
+        <w:t xml:space="preserve"> در پنل چت، گزینه‌ی نوع جلسه («Continue In» / جلسه‌ی جدید) باید روی </w:t>
+      </w:r>
+      <w:r>
+        <w:rPr>
+          <w:b/>
+          <w:bCs/>
+          <w:rtl w:val="false"/>
+        </w:rPr>
+        <w:t xml:space="preserve">Local</w:t>
+      </w:r>
+      <w:r>
+        <w:rPr>
+          <w:rtl/>
+        </w:rPr>
+        <w:t xml:space="preserve"> باشد. اگر روی </w:t>
+      </w:r>
+      <w:r>
+        <w:rPr>
+          <w:b/>
+          <w:bCs/>
+          <w:rtl w:val="false"/>
+        </w:rPr>
+        <w:t xml:space="preserve">Copilot</w:t>
+      </w:r>
+      <w:r>
+        <w:rPr>
+          <w:rtl/>
+        </w:rPr>
+        <w:t xml:space="preserve"> (یا Cloud) بماند، مدل‌های ستون در منوی مدل نمایش داده نمی‌شوند. همچنین در قدم «Add Models ← OAI Compatible»، اگر چیزی باز نشد، همین گزینه را چک کنید. افزونه هنگام اولین استفاده کلید API را می‌پرسد (کادر «OAI Compatible API Key for sotoon»)؛ همان کلید ستون را وارد کنید.</w:t>
+      </w:r>
+    </w:p>
+    <w:p>
+      <w:pPr>
         <w:bidi/>
         <w:spacing w:after="120" w:line="320"/>
       </w:pPr>
@@ -13173,7 +13237,7 @@
         <w:bidi/>
         <w:spacing w:after="120" w:line="320"/>
       </w:pPr>
-      <w:hyperlink w:history="1" r:id="rIdzskgebs2qnw6ydsagxiow">
+      <w:hyperlink w:history="1" r:id="rIdisd86_bgokydelnbgsqmn">
         <w:r>
           <w:rPr>
             <w:rStyle w:val="Hyperlink"/>
@@ -13188,7 +13252,7 @@
         </w:rPr>
         <w:t xml:space="preserve"> · </w:t>
       </w:r>
-      <w:hyperlink w:history="1" r:id="rId_4z_cjsrksdgmpszy8fyg">
+      <w:hyperlink w:history="1" r:id="rIdr3m3_ufs25qzssar4hsu0">
         <w:r>
           <w:rPr>
             <w:rStyle w:val="Hyperlink"/>
@@ -13203,7 +13267,7 @@
         </w:rPr>
         <w:t xml:space="preserve"> · </w:t>
       </w:r>
-      <w:hyperlink w:history="1" r:id="rId3tngywbjhwmwqznkbwjsk">
+      <w:hyperlink w:history="1" r:id="rIdiafivqr8akdght0fplxmv">
         <w:r>
           <w:rPr>
             <w:rStyle w:val="Hyperlink"/>
@@ -13218,7 +13282,7 @@
         </w:rPr>
         <w:t xml:space="preserve"> · </w:t>
       </w:r>
-      <w:hyperlink w:history="1" r:id="rIdpbknzzz7ypc-cdqaie1nb">
+      <w:hyperlink w:history="1" r:id="rIdc6pj4wsx237ii9xkeqxqp">
         <w:r>
           <w:rPr>
             <w:rStyle w:val="Hyperlink"/>

</xml_diff>

<commit_message>
docs: finalize user docs (remove unverified sections, fix inconsistencies, add publish checklist)
Co-Authored-By: Claude Sonnet 5.5 <noreply@anthropic.com>
Claude-Session: https://claude.ai/code/session_01K2TE7hKB2uwZb8YzUQGaRz
</commit_message>
<xml_diff>
--- a/user-docs/sotoon-api-docs.docx
+++ b/user-docs/sotoon-api-docs.docx
@@ -1475,7 +1475,23 @@
         <w:rPr>
           <w:rtl/>
         </w:rPr>
-        <w:t xml:space="preserve"> هر جا ⚠️ هست یعنی هنوز روی API واقعی تأیید نشده.</w:t>
+        <w:t xml:space="preserve"> هر جا ⚠️ هست یعنی هنوز تأیید نشده. فهرست کامل در </w:t>
+      </w:r>
+      <w:r>
+        <w:rPr>
+          <w:rFonts w:ascii="Consolas" w:cs="Consolas" w:hAnsi="Consolas"/>
+          <w:sz w:val="19"/>
+          <w:szCs w:val="19"/>
+          <w:shd w:fill="EFEFEF" w:color="auto" w:val="clear"/>
+          <w:rtl w:val="false"/>
+        </w:rPr>
+        <w:t xml:space="preserve">publish-checklist.md</w:t>
+      </w:r>
+      <w:r>
+        <w:rPr>
+          <w:rtl/>
+        </w:rPr>
+        <w:t xml:space="preserve"> است.</w:t>
       </w:r>
     </w:p>
     <w:p>
@@ -1552,8 +1568,8 @@
         </w:tblBorders>
       </w:tblPr>
       <w:tblGrid>
-        <w:gridCol w:w="3672"/>
-        <w:gridCol w:w="5966"/>
+        <w:gridCol w:w="4058"/>
+        <w:gridCol w:w="5580"/>
       </w:tblGrid>
       <w:tr>
         <w:trPr>
@@ -1562,7 +1578,7 @@
         </w:trPr>
         <w:tc>
           <w:tcPr>
-            <w:tcW w:type="dxa" w:w="3672"/>
+            <w:tcW w:type="dxa" w:w="4058"/>
             <w:tcBorders>
               <w:top w:val="single" w:color="C9C9D6" w:sz="4"/>
               <w:left w:val="single" w:color="C9C9D6" w:sz="4"/>
@@ -1594,7 +1610,7 @@
         </w:tc>
         <w:tc>
           <w:tcPr>
-            <w:tcW w:type="dxa" w:w="5966"/>
+            <w:tcW w:type="dxa" w:w="5580"/>
             <w:tcBorders>
               <w:top w:val="single" w:color="C9C9D6" w:sz="4"/>
               <w:left w:val="single" w:color="C9C9D6" w:sz="4"/>
@@ -1632,7 +1648,7 @@
         </w:trPr>
         <w:tc>
           <w:tcPr>
-            <w:tcW w:type="dxa" w:w="3672"/>
+            <w:tcW w:type="dxa" w:w="4058"/>
             <w:tcBorders>
               <w:top w:val="single" w:color="C9C9D6" w:sz="4"/>
               <w:left w:val="single" w:color="C9C9D6" w:sz="4"/>
@@ -1665,7 +1681,7 @@
         </w:tc>
         <w:tc>
           <w:tcPr>
-            <w:tcW w:type="dxa" w:w="5966"/>
+            <w:tcW w:type="dxa" w:w="5580"/>
             <w:tcBorders>
               <w:top w:val="single" w:color="C9C9D6" w:sz="4"/>
               <w:left w:val="single" w:color="C9C9D6" w:sz="4"/>
@@ -1700,7 +1716,7 @@
         </w:trPr>
         <w:tc>
           <w:tcPr>
-            <w:tcW w:type="dxa" w:w="3672"/>
+            <w:tcW w:type="dxa" w:w="4058"/>
             <w:tcBorders>
               <w:top w:val="single" w:color="C9C9D6" w:sz="4"/>
               <w:left w:val="single" w:color="C9C9D6" w:sz="4"/>
@@ -1733,7 +1749,7 @@
         </w:tc>
         <w:tc>
           <w:tcPr>
-            <w:tcW w:type="dxa" w:w="5966"/>
+            <w:tcW w:type="dxa" w:w="5580"/>
             <w:tcBorders>
               <w:top w:val="single" w:color="C9C9D6" w:sz="4"/>
               <w:left w:val="single" w:color="C9C9D6" w:sz="4"/>
@@ -1768,7 +1784,7 @@
         </w:trPr>
         <w:tc>
           <w:tcPr>
-            <w:tcW w:type="dxa" w:w="3672"/>
+            <w:tcW w:type="dxa" w:w="4058"/>
             <w:tcBorders>
               <w:top w:val="single" w:color="C9C9D6" w:sz="4"/>
               <w:left w:val="single" w:color="C9C9D6" w:sz="4"/>
@@ -1801,7 +1817,7 @@
         </w:tc>
         <w:tc>
           <w:tcPr>
-            <w:tcW w:type="dxa" w:w="5966"/>
+            <w:tcW w:type="dxa" w:w="5580"/>
             <w:tcBorders>
               <w:top w:val="single" w:color="C9C9D6" w:sz="4"/>
               <w:left w:val="single" w:color="C9C9D6" w:sz="4"/>
@@ -1836,7 +1852,7 @@
         </w:trPr>
         <w:tc>
           <w:tcPr>
-            <w:tcW w:type="dxa" w:w="3672"/>
+            <w:tcW w:type="dxa" w:w="4058"/>
             <w:tcBorders>
               <w:top w:val="single" w:color="C9C9D6" w:sz="4"/>
               <w:left w:val="single" w:color="C9C9D6" w:sz="4"/>
@@ -1869,7 +1885,7 @@
         </w:tc>
         <w:tc>
           <w:tcPr>
-            <w:tcW w:type="dxa" w:w="5966"/>
+            <w:tcW w:type="dxa" w:w="5580"/>
             <w:tcBorders>
               <w:top w:val="single" w:color="C9C9D6" w:sz="4"/>
               <w:left w:val="single" w:color="C9C9D6" w:sz="4"/>
@@ -1904,7 +1920,7 @@
         </w:trPr>
         <w:tc>
           <w:tcPr>
-            <w:tcW w:type="dxa" w:w="3672"/>
+            <w:tcW w:type="dxa" w:w="4058"/>
             <w:tcBorders>
               <w:top w:val="single" w:color="C9C9D6" w:sz="4"/>
               <w:left w:val="single" w:color="C9C9D6" w:sz="4"/>
@@ -1925,89 +1941,15 @@
             </w:pPr>
             <w:r>
               <w:rPr>
-                <w:rFonts w:ascii="Consolas" w:cs="Consolas" w:hAnsi="Consolas"/>
-                <w:sz w:val="19"/>
-                <w:szCs w:val="19"/>
-                <w:shd w:fill="EFEFEF" w:color="auto" w:val="clear"/>
-                <w:rtl w:val="false"/>
-              </w:rPr>
-              <w:t xml:space="preserve">POST /responses</w:t>
-            </w:r>
-            <w:r>
-              <w:rPr>
-                <w:rtl w:val="false"/>
-              </w:rPr>
-              <w:t xml:space="preserve"> ⚠️</w:t>
+                <w:rtl/>
+              </w:rPr>
+              <w:t xml:space="preserve">تولید تصویر</w:t>
             </w:r>
           </w:p>
         </w:tc>
         <w:tc>
           <w:tcPr>
-            <w:tcW w:type="dxa" w:w="5966"/>
-            <w:tcBorders>
-              <w:top w:val="single" w:color="C9C9D6" w:sz="4"/>
-              <w:left w:val="single" w:color="C9C9D6" w:sz="4"/>
-              <w:bottom w:val="single" w:color="C9C9D6" w:sz="4"/>
-              <w:right w:val="single" w:color="C9C9D6" w:sz="4"/>
-            </w:tcBorders>
-            <w:tcMar>
-              <w:top w:type="dxa" w:w="70"/>
-              <w:left w:type="dxa" w:w="110"/>
-              <w:bottom w:type="dxa" w:w="70"/>
-              <w:right w:type="dxa" w:w="110"/>
-            </w:tcMar>
-          </w:tcPr>
-          <w:p>
-            <w:pPr>
-              <w:bidi/>
-              <w:spacing w:after="0" w:line="290"/>
-            </w:pPr>
-            <w:r>
-              <w:rPr>
-                <w:rtl/>
-              </w:rPr>
-              <w:t xml:space="preserve">قالب Responses شرکت OpenAI (تأیید نشده)</w:t>
-            </w:r>
-          </w:p>
-        </w:tc>
-      </w:tr>
-      <w:tr>
-        <w:trPr>
-          <w:cantSplit/>
-          <w:tblHeader w:val="off"/>
-        </w:trPr>
-        <w:tc>
-          <w:tcPr>
-            <w:tcW w:type="dxa" w:w="3672"/>
-            <w:tcBorders>
-              <w:top w:val="single" w:color="C9C9D6" w:sz="4"/>
-              <w:left w:val="single" w:color="C9C9D6" w:sz="4"/>
-              <w:bottom w:val="single" w:color="C9C9D6" w:sz="4"/>
-              <w:right w:val="single" w:color="C9C9D6" w:sz="4"/>
-            </w:tcBorders>
-            <w:tcMar>
-              <w:top w:type="dxa" w:w="70"/>
-              <w:left w:type="dxa" w:w="110"/>
-              <w:bottom w:type="dxa" w:w="70"/>
-              <w:right w:type="dxa" w:w="110"/>
-            </w:tcMar>
-          </w:tcPr>
-          <w:p>
-            <w:pPr>
-              <w:bidi/>
-              <w:spacing w:after="0" w:line="290"/>
-            </w:pPr>
-            <w:r>
-              <w:rPr>
-                <w:rtl/>
-              </w:rPr>
-              <w:t xml:space="preserve">تولید تصویر ⚠️</w:t>
-            </w:r>
-          </w:p>
-        </w:tc>
-        <w:tc>
-          <w:tcPr>
-            <w:tcW w:type="dxa" w:w="5966"/>
+            <w:tcW w:type="dxa" w:w="5580"/>
             <w:tcBorders>
               <w:top w:val="single" w:color="C9C9D6" w:sz="4"/>
               <w:left w:val="single" w:color="C9C9D6" w:sz="4"/>
@@ -2925,15 +2867,7 @@
               <w:rPr>
                 <w:rtl/>
               </w:rPr>
-              <w:t xml:space="preserve">میزان خلاقیت. ⚠️ </w:t>
-            </w:r>
-            <w:r>
-              <w:rPr>
-                <w:i/>
-                <w:iCs/>
-                <w:rtl/>
-              </w:rPr>
-              <w:t xml:space="preserve">بازه‌ی مجاز بسته به مدل فرق می‌کند.</w:t>
+              <w:t xml:space="preserve">میزان خلاقیت. بازه‌ی مجاز بسته به مدل فرق می‌کند.</w:t>
             </w:r>
           </w:p>
         </w:tc>
@@ -3578,31 +3512,7 @@
         <w:rPr>
           <w:rtl/>
         </w:rPr>
-        <w:t xml:space="preserve"> است.</w:t>
-      </w:r>
-    </w:p>
-    <w:p>
-      <w:pPr>
-        <w:pStyle w:val="Heading3"/>
-        <w:bidi/>
-      </w:pPr>
-      <w:r>
-        <w:rPr>
-          <w:rtl/>
-        </w:rPr>
-        <w:t xml:space="preserve">کنترل میزان تفکر ⚠️</w:t>
-      </w:r>
-    </w:p>
-    <w:p>
-      <w:pPr>
-        <w:bidi/>
-        <w:spacing w:after="120" w:line="320"/>
-      </w:pPr>
-      <w:r>
-        <w:rPr>
-          <w:rtl/>
-        </w:rPr>
-        <w:t xml:space="preserve">نام پارامتر بسته به سازنده‌ی مدل فرق دارد: برای مدل‌های OpenAI </w:t>
+        <w:t xml:space="preserve"> است. در </w:t>
       </w:r>
       <w:r>
         <w:rPr>
@@ -3612,13 +3522,13 @@
           <w:shd w:fill="EFEFEF" w:color="auto" w:val="clear"/>
           <w:rtl w:val="false"/>
         </w:rPr>
-        <w:t xml:space="preserve">"reasoning_effort": "low"</w:t>
-      </w:r>
-      <w:r>
-        <w:rPr>
-          <w:rtl/>
-        </w:rPr>
-        <w:t xml:space="preserve"> (یا </w:t>
+        <w:t xml:space="preserve">/messages</w:t>
+      </w:r>
+      <w:r>
+        <w:rPr>
+          <w:rtl/>
+        </w:rPr>
+        <w:t xml:space="preserve"> همین حالت با </w:t>
       </w:r>
       <w:r>
         <w:rPr>
@@ -3628,13 +3538,13 @@
           <w:shd w:fill="EFEFEF" w:color="auto" w:val="clear"/>
           <w:rtl w:val="false"/>
         </w:rPr>
-        <w:t xml:space="preserve">medium</w:t>
-      </w:r>
-      <w:r>
-        <w:rPr>
-          <w:rtl/>
-        </w:rPr>
-        <w:t xml:space="preserve">، </w:t>
+        <w:t xml:space="preserve">stop_reason: "max_tokens"</w:t>
+      </w:r>
+      <w:r>
+        <w:rPr>
+          <w:rtl/>
+        </w:rPr>
+        <w:t xml:space="preserve"> و متن خالی برمی‌گردد. توجه: روی بعضی مدل‌های reasoning سقف خیلی کوچک (مثلاً </w:t>
       </w:r>
       <w:r>
         <w:rPr>
@@ -3644,13 +3554,13 @@
           <w:shd w:fill="EFEFEF" w:color="auto" w:val="clear"/>
           <w:rtl w:val="false"/>
         </w:rPr>
-        <w:t xml:space="preserve">high</w:t>
-      </w:r>
-      <w:r>
-        <w:rPr>
-          <w:rtl/>
-        </w:rPr>
-        <w:t xml:space="preserve">) و برای بقیه </w:t>
+        <w:t xml:space="preserve">1</w:t>
+      </w:r>
+      <w:r>
+        <w:rPr>
+          <w:rtl/>
+        </w:rPr>
+        <w:t xml:space="preserve">) به‌جای پاسخ خالی خطای </w:t>
       </w:r>
       <w:r>
         <w:rPr>
@@ -3660,21 +3570,13 @@
           <w:shd w:fill="EFEFEF" w:color="auto" w:val="clear"/>
           <w:rtl w:val="false"/>
         </w:rPr>
-        <w:t xml:space="preserve">"reasoning": { "effort": "low" }</w:t>
-      </w:r>
-      <w:r>
-        <w:rPr>
-          <w:rtl/>
-        </w:rPr>
-        <w:t xml:space="preserve">. اگر مدل reasoning نداشته باشد، خطای ۴۰۰ می‌گیرید. </w:t>
-      </w:r>
-      <w:r>
-        <w:rPr>
-          <w:i/>
-          <w:iCs/>
-          <w:rtl/>
-        </w:rPr>
-        <w:t xml:space="preserve">هر دو فرمت هنوز تست نشده‌اند.</w:t>
+        <w:t xml:space="preserve">400</w:t>
+      </w:r>
+      <w:r>
+        <w:rPr>
+          <w:rtl/>
+        </w:rPr>
+        <w:t xml:space="preserve"> می‌دهد.</w:t>
       </w:r>
     </w:p>
     <w:p>
@@ -4376,15 +4278,39 @@
         <w:rPr>
           <w:rtl/>
         </w:rPr>
-        <w:t xml:space="preserve">همه‌ی مدل‌ها ابزار را پشتیبانی نمی‌کنند. ⚠️ </w:t>
-      </w:r>
-      <w:r>
-        <w:rPr>
-          <w:i/>
-          <w:iCs/>
-          <w:rtl/>
-        </w:rPr>
-        <w:t xml:space="preserve">نیاز به تأیید: آیا مشخصات مدل در داشبورد پشتیبانی از ابزار را نشان می‌دهد؟</w:t>
+        <w:t xml:space="preserve">همه‌ی مدل‌ها ابزار را پشتیبانی نمی‌کنند. اگر مدل ابزار را نپذیرد، خطای </w:t>
+      </w:r>
+      <w:r>
+        <w:rPr>
+          <w:rFonts w:ascii="Consolas" w:cs="Consolas" w:hAnsi="Consolas"/>
+          <w:sz w:val="19"/>
+          <w:szCs w:val="19"/>
+          <w:shd w:fill="EFEFEF" w:color="auto" w:val="clear"/>
+          <w:rtl w:val="false"/>
+        </w:rPr>
+        <w:t xml:space="preserve">400</w:t>
+      </w:r>
+      <w:r>
+        <w:rPr>
+          <w:rtl/>
+        </w:rPr>
+        <w:t xml:space="preserve"> می‌گیرید (مثلاً </w:t>
+      </w:r>
+      <w:r>
+        <w:rPr>
+          <w:rFonts w:ascii="Consolas" w:cs="Consolas" w:hAnsi="Consolas"/>
+          <w:sz w:val="19"/>
+          <w:szCs w:val="19"/>
+          <w:shd w:fill="EFEFEF" w:color="auto" w:val="clear"/>
+          <w:rtl w:val="false"/>
+        </w:rPr>
+        <w:t xml:space="preserve">"auto" tool choice requires --enable-auto-tool-choice and --tool-call-parser to be set</w:t>
+      </w:r>
+      <w:r>
+        <w:rPr>
+          <w:rtl/>
+        </w:rPr>
+        <w:t xml:space="preserve">)؛ در این صورت مدل دیگری انتخاب کنید.</w:t>
       </w:r>
     </w:p>
     <w:p>
@@ -4576,21 +4502,7 @@
         <w:rPr>
           <w:rtl/>
         </w:rPr>
-        <w:t xml:space="preserve"> با </w:t>
-      </w:r>
-      <w:r>
-        <w:rPr>
-          <w:b/>
-          <w:bCs/>
-          <w:rtl/>
-        </w:rPr>
-        <w:t xml:space="preserve">همه‌ی مدل‌ها</w:t>
-      </w:r>
-      <w:r>
-        <w:rPr>
-          <w:rtl/>
-        </w:rPr>
-        <w:t xml:space="preserve"> کار می‌کند، نه فقط Claude. </w:t>
+        <w:t xml:space="preserve"> برای مدل‌های مختلف (نه فقط Claude) کار می‌کند. </w:t>
       </w:r>
       <w:r>
         <w:rPr>
@@ -4622,7 +4534,39 @@
         <w:rPr>
           <w:rtl/>
         </w:rPr>
-        <w:t xml:space="preserve"> است.</w:t>
+        <w:t xml:space="preserve"> است. بعضی مدل‌ها (مثلاً مدل‌های OpenAI) فیلدهای اختصاصی Anthropic مثل </w:t>
+      </w:r>
+      <w:r>
+        <w:rPr>
+          <w:rFonts w:ascii="Consolas" w:cs="Consolas" w:hAnsi="Consolas"/>
+          <w:sz w:val="19"/>
+          <w:szCs w:val="19"/>
+          <w:shd w:fill="EFEFEF" w:color="auto" w:val="clear"/>
+          <w:rtl w:val="false"/>
+        </w:rPr>
+        <w:t xml:space="preserve">output_config</w:t>
+      </w:r>
+      <w:r>
+        <w:rPr>
+          <w:rtl/>
+        </w:rPr>
+        <w:t xml:space="preserve"> را رد می‌کنند و خطای </w:t>
+      </w:r>
+      <w:r>
+        <w:rPr>
+          <w:rFonts w:ascii="Consolas" w:cs="Consolas" w:hAnsi="Consolas"/>
+          <w:sz w:val="19"/>
+          <w:szCs w:val="19"/>
+          <w:shd w:fill="EFEFEF" w:color="auto" w:val="clear"/>
+          <w:rtl w:val="false"/>
+        </w:rPr>
+        <w:t xml:space="preserve">400 Unknown parameter</w:t>
+      </w:r>
+      <w:r>
+        <w:rPr>
+          <w:rtl/>
+        </w:rPr>
+        <w:t xml:space="preserve"> می‌دهند؛ درخواست ساده بدون این فیلدها مشکلی ندارد.</w:t>
       </w:r>
     </w:p>
     <w:p>
@@ -7088,49 +7032,7 @@
         <w:rPr>
           <w:rtl/>
         </w:rPr>
-        <w:t xml:space="preserve"> وضعیت هر بخش:</w:t>
-      </w:r>
-    </w:p>
-    <w:p>
-      <w:pPr>
-        <w:shd w:fill="FFF4CE" w:color="auto" w:val="clear"/>
-        <w:bidi/>
-        <w:spacing w:after="120" w:before="0" w:line="300"/>
-        <w:ind w:left="200" w:right="200"/>
-      </w:pPr>
-      <w:r>
-        <w:rPr>
-          <w:rtl w:val="false"/>
-        </w:rPr>
-        <w:t xml:space="preserve">• </w:t>
-      </w:r>
-      <w:r>
-        <w:rPr>
-          <w:b/>
-          <w:bCs/>
-          <w:rtl w:val="false"/>
-        </w:rPr>
-        <w:t xml:space="preserve">VS Code (Copilot):</w:t>
-      </w:r>
-      <w:r>
-        <w:rPr>
-          <w:rtl/>
-        </w:rPr>
-        <w:t xml:space="preserve"> مراحل از راهنمای قبلی است که قبلاً (توسط تیم) کار کرده. در تست ما (اکتبر ۲۰۲۶) با طرح </w:t>
-      </w:r>
-      <w:r>
-        <w:rPr>
-          <w:b/>
-          <w:bCs/>
-          <w:rtl w:val="false"/>
-        </w:rPr>
-        <w:t xml:space="preserve">Copilot Free</w:t>
-      </w:r>
-      <w:r>
-        <w:rPr>
-          <w:rtl/>
-        </w:rPr>
-        <w:t xml:space="preserve">: افزونه‌ی OAI Compatible نصب و Provider و مدل (</w:t>
+        <w:t xml:space="preserve"> هر جا ⚠️ هست یعنی هنوز تأیید نشده. فهرست کامل و وضعیت تست هر ابزار در </w:t>
       </w:r>
       <w:r>
         <w:rPr>
@@ -7140,191 +7042,13 @@
           <w:shd w:fill="EFEFEF" w:color="auto" w:val="clear"/>
           <w:rtl w:val="false"/>
         </w:rPr>
-        <w:t xml:space="preserve">deepseek/deepseek-v4-flash-0731</w:t>
-      </w:r>
-      <w:r>
-        <w:rPr>
-          <w:rtl/>
-        </w:rPr>
-        <w:t xml:space="preserve">) ثبت شد و در Language Models با برچسب Tools دیده شد، ولی در منوی مدل چت (فقط Auto و مدل‌های Copilot) ظاهر نشد. علت: نوع جلسه‌ی چت روی «Copilot» مانده بود؛ بعد از تغییر به </w:t>
-      </w:r>
-      <w:r>
-        <w:rPr>
-          <w:b/>
-          <w:bCs/>
-          <w:rtl w:val="false"/>
-        </w:rPr>
-        <w:t xml:space="preserve">Local</w:t>
-      </w:r>
-      <w:r>
-        <w:rPr>
-          <w:rtl/>
-        </w:rPr>
-        <w:t xml:space="preserve"> مدل‌ها دیده شدند (در داکیومنت آمده). پیام چت با مدل ستون و حالت Agent هنوز تأیید نشده.</w:t>
-      </w:r>
-    </w:p>
-    <w:p>
-      <w:pPr>
-        <w:shd w:fill="FFF4CE" w:color="auto" w:val="clear"/>
-        <w:bidi/>
-        <w:spacing w:after="120" w:before="0" w:line="300"/>
-        <w:ind w:left="200" w:right="200"/>
-      </w:pPr>
-      <w:r>
-        <w:rPr>
-          <w:rtl w:val="false"/>
-        </w:rPr>
-        <w:t xml:space="preserve">• </w:t>
-      </w:r>
-      <w:r>
-        <w:rPr>
-          <w:b/>
-          <w:bCs/>
-          <w:rtl w:val="false"/>
-        </w:rPr>
-        <w:t xml:space="preserve">Claude Code:</w:t>
-      </w:r>
-      <w:r>
-        <w:rPr>
-          <w:rtl/>
-        </w:rPr>
-        <w:t xml:space="preserve"> روی افزونه‌ی VS Code با مدل‌های </w:t>
-      </w:r>
-      <w:r>
-        <w:rPr>
-          <w:rFonts w:ascii="Consolas" w:cs="Consolas" w:hAnsi="Consolas"/>
-          <w:sz w:val="19"/>
-          <w:szCs w:val="19"/>
-          <w:shd w:fill="EFEFEF" w:color="auto" w:val="clear"/>
-          <w:rtl w:val="false"/>
-        </w:rPr>
-        <w:t xml:space="preserve">deepseek/deepseek-v4-flash-0731</w:t>
-      </w:r>
-      <w:r>
-        <w:rPr>
-          <w:rtl/>
-        </w:rPr>
-        <w:t xml:space="preserve"> و </w:t>
-      </w:r>
-      <w:r>
-        <w:rPr>
-          <w:rFonts w:ascii="Consolas" w:cs="Consolas" w:hAnsi="Consolas"/>
-          <w:sz w:val="19"/>
-          <w:szCs w:val="19"/>
-          <w:shd w:fill="EFEFEF" w:color="auto" w:val="clear"/>
-          <w:rtl w:val="false"/>
-        </w:rPr>
-        <w:t xml:space="preserve">qwen/qwen3-next-80b-a3b-instruct</w:t>
-      </w:r>
-      <w:r>
-        <w:rPr>
-          <w:rtl/>
-        </w:rPr>
-        <w:t xml:space="preserve"> تا انتها تست شده (پیام ساده، خوندن فایل، ساخت و اجرای فایل، و دستور </w:t>
-      </w:r>
-      <w:r>
-        <w:rPr>
-          <w:rFonts w:ascii="Consolas" w:cs="Consolas" w:hAnsi="Consolas"/>
-          <w:sz w:val="19"/>
-          <w:szCs w:val="19"/>
-          <w:shd w:fill="EFEFEF" w:color="auto" w:val="clear"/>
-          <w:rtl w:val="false"/>
-        </w:rPr>
-        <w:t xml:space="preserve">/model</w:t>
-      </w:r>
-      <w:r>
-        <w:rPr>
-          <w:rtl/>
-        </w:rPr>
-        <w:t xml:space="preserve"> با اسم مدل). </w:t>
-      </w:r>
-      <w:r>
-        <w:rPr>
-          <w:rFonts w:ascii="Consolas" w:cs="Consolas" w:hAnsi="Consolas"/>
-          <w:sz w:val="19"/>
-          <w:szCs w:val="19"/>
-          <w:shd w:fill="EFEFEF" w:color="auto" w:val="clear"/>
-          <w:rtl w:val="false"/>
-        </w:rPr>
-        <w:t xml:space="preserve">/status</w:t>
-      </w:r>
-      <w:r>
-        <w:rPr>
-          <w:rtl/>
-        </w:rPr>
-        <w:t xml:space="preserve"> تأیید کرد که مدل، آدرس و کلید درست‌اند. مدل‌های </w:t>
-      </w:r>
-      <w:r>
-        <w:rPr>
-          <w:rFonts w:ascii="Consolas" w:cs="Consolas" w:hAnsi="Consolas"/>
-          <w:sz w:val="19"/>
-          <w:szCs w:val="19"/>
-          <w:shd w:fill="EFEFEF" w:color="auto" w:val="clear"/>
-          <w:rtl w:val="false"/>
-        </w:rPr>
-        <w:t xml:space="preserve">openai/...</w:t>
-      </w:r>
-      <w:r>
-        <w:rPr>
-          <w:rtl/>
-        </w:rPr>
-        <w:t xml:space="preserve"> خطا می‌دهند (در دست بررسی). روش ترمینال و دسکتاپ از مستند رسمی است و تست نشده.</w:t>
-      </w:r>
-    </w:p>
-    <w:p>
-      <w:pPr>
-        <w:shd w:fill="FFF4CE" w:color="auto" w:val="clear"/>
-        <w:bidi/>
-        <w:spacing w:after="120" w:before="0" w:line="300"/>
-        <w:ind w:left="200" w:right="200"/>
-      </w:pPr>
-      <w:r>
-        <w:rPr>
-          <w:rtl w:val="false"/>
-        </w:rPr>
-        <w:t xml:space="preserve">• </w:t>
-      </w:r>
-      <w:r>
-        <w:rPr>
-          <w:b/>
-          <w:bCs/>
-          <w:rtl/>
-        </w:rPr>
-        <w:t xml:space="preserve">OpenCode و Codex:</w:t>
-      </w:r>
-      <w:r>
-        <w:rPr>
-          <w:rtl/>
-        </w:rPr>
-        <w:t xml:space="preserve"> از مستندات رسمی؛ تست نشده.</w:t>
-      </w:r>
-    </w:p>
-    <w:p>
-      <w:pPr>
-        <w:shd w:fill="FFF4CE" w:color="auto" w:val="clear"/>
-        <w:bidi/>
-        <w:spacing w:after="120" w:before="0" w:line="300"/>
-        <w:ind w:left="200" w:right="200"/>
-      </w:pPr>
-      <w:r>
-        <w:rPr>
-          <w:rtl w:val="false"/>
-        </w:rPr>
-        <w:t xml:space="preserve">• </w:t>
-      </w:r>
-      <w:r>
-        <w:rPr>
-          <w:b/>
-          <w:bCs/>
-          <w:rtl w:val="false"/>
-        </w:rPr>
-        <w:t xml:space="preserve">Cursor:</w:t>
-      </w:r>
-      <w:r>
-        <w:rPr>
-          <w:rtl/>
-        </w:rPr>
-        <w:t xml:space="preserve"> از راهنمای‌های عمومی؛ تست نشده و کم‌اطمینان‌تر است.</w:t>
+        <w:t xml:space="preserve">publish-checklist.md</w:t>
+      </w:r>
+      <w:r>
+        <w:rPr>
+          <w:rtl/>
+        </w:rPr>
+        <w:t xml:space="preserve"> است.</w:t>
       </w:r>
     </w:p>
     <w:p>
@@ -9948,17 +9672,9 @@
       </w:pPr>
       <w:r>
         <w:rPr>
-          <w:rtl w:val="false"/>
-        </w:rPr>
-        <w:t xml:space="preserve">⚠️ </w:t>
-      </w:r>
-      <w:r>
-        <w:rPr>
-          <w:i/>
-          <w:iCs/>
-          <w:rtl/>
-        </w:rPr>
-        <w:t xml:space="preserve">Anthropic استفاده از Claude Code با مدل‌های غیر Claude را به‌صورت رسمی پشتیبانی نمی‌کند. این روش کار می‌کند ولی ممکن است بعضی قابلیت‌ها (مثل سطح تفکر) رفتار متفاوتی داشته باشند.</w:t>
+          <w:rtl/>
+        </w:rPr>
+        <w:t xml:space="preserve">- اولین پاسخ بعد از باز کردن VS Code ممکن است ۱۰ تا ۱۵ ثانیه طول بکشد. پاسخ‌های بعدی سریع‌تر است (حدود ۵ ثانیه). (اندازه‌گیری ما با یک مدل.)</w:t>
       </w:r>
     </w:p>
     <w:p>
@@ -9973,17 +9689,33 @@
       </w:pPr>
       <w:r>
         <w:rPr>
-          <w:rtl/>
-        </w:rPr>
-        <w:t xml:space="preserve">اولین پاسخ بعد از باز کردن VS Code ممکن است ۱۰ تا ۱۵ ثانیه طول بکشد. پاسخ‌های بعدی سریع‌تر است (حدود ۵ ثانیه). ⚠️ </w:t>
-      </w:r>
-      <w:r>
-        <w:rPr>
-          <w:i/>
-          <w:iCs/>
-          <w:rtl/>
-        </w:rPr>
-        <w:t xml:space="preserve">با یک تست و یک مدل اندازه‌گیری شده.</w:t>
+          <w:b/>
+          <w:bCs/>
+          <w:rtl/>
+        </w:rPr>
+        <w:t xml:space="preserve">از خود مدل نپرسید «چه مدلی هستی؟».</w:t>
+      </w:r>
+      <w:r>
+        <w:rPr>
+          <w:rtl/>
+        </w:rPr>
+        <w:t xml:space="preserve"> Claude Code به همه‌ی مدل‌ها می‌گوید «تو Claude هستی»، پس هر مدلی همین را جواب می‌دهد. مدل فعلی را با </w:t>
+      </w:r>
+      <w:r>
+        <w:rPr>
+          <w:rFonts w:ascii="Consolas" w:cs="Consolas" w:hAnsi="Consolas"/>
+          <w:sz w:val="19"/>
+          <w:szCs w:val="19"/>
+          <w:shd w:fill="EFEFEF" w:color="auto" w:val="clear"/>
+          <w:rtl w:val="false"/>
+        </w:rPr>
+        <w:t xml:space="preserve">/status</w:t>
+      </w:r>
+      <w:r>
+        <w:rPr>
+          <w:rtl/>
+        </w:rPr>
+        <w:t xml:space="preserve"> ببینید.</w:t>
       </w:r>
     </w:p>
     <w:p>
@@ -9998,47 +9730,6 @@
       </w:pPr>
       <w:r>
         <w:rPr>
-          <w:b/>
-          <w:bCs/>
-          <w:rtl/>
-        </w:rPr>
-        <w:t xml:space="preserve">از خود مدل نپرسید «چه مدلی هستی؟».</w:t>
-      </w:r>
-      <w:r>
-        <w:rPr>
-          <w:rtl/>
-        </w:rPr>
-        <w:t xml:space="preserve"> Claude Code به همه‌ی مدل‌ها می‌گوید «تو Claude هستی»، پس هر مدلی همین را جواب می‌دهد. مدل فعلی را با </w:t>
-      </w:r>
-      <w:r>
-        <w:rPr>
-          <w:rFonts w:ascii="Consolas" w:cs="Consolas" w:hAnsi="Consolas"/>
-          <w:sz w:val="19"/>
-          <w:szCs w:val="19"/>
-          <w:shd w:fill="EFEFEF" w:color="auto" w:val="clear"/>
-          <w:rtl w:val="false"/>
-        </w:rPr>
-        <w:t xml:space="preserve">/status</w:t>
-      </w:r>
-      <w:r>
-        <w:rPr>
-          <w:rtl/>
-        </w:rPr>
-        <w:t xml:space="preserve"> ببینید.</w:t>
-      </w:r>
-    </w:p>
-    <w:p>
-      <w:pPr>
-        <w:pStyle w:val="ListParagraph"/>
-        <w:numPr>
-          <w:ilvl w:val="0"/>
-          <w:numId w:val="2"/>
-        </w:numPr>
-        <w:bidi/>
-        <w:spacing w:after="80" w:line="300"/>
-      </w:pPr>
-      <w:r>
-        <w:rPr>
           <w:rtl w:val="false"/>
         </w:rPr>
         <w:t xml:space="preserve">⚠️ </w:t>
@@ -10049,7 +9740,7 @@
           <w:iCs/>
           <w:rtl/>
         </w:rPr>
-        <w:t xml:space="preserve">نیاز به تأیید حقوقی/محصول: مستند رسمی Claude Code استفاده از آن را به «کشورهای پشتیبانی‌شده‌ی Anthropic» محدود می‌کند.</w:t>
+        <w:t xml:space="preserve">نیاز به تأیید حقوقی/محصول: Anthropic استفاده از Claude Code با مدل‌های غیر Claude را رسمی پشتیبانی نمی‌کند و مستند رسمی آن را به «کشورهای پشتیبانی‌شده‌ی Anthropic» محدود می‌کند. این روش کار می‌کند ولی بعضی قابلیت‌ها (مثل سطح تفکر) ممکن است رفتار متفاوتی داشته باشند.</w:t>
       </w:r>
     </w:p>
     <w:p>
@@ -10078,8 +9769,8 @@
         </w:tblBorders>
       </w:tblPr>
       <w:tblGrid>
-        <w:gridCol w:w="4349"/>
-        <w:gridCol w:w="5289"/>
+        <w:gridCol w:w="4595"/>
+        <w:gridCol w:w="5043"/>
       </w:tblGrid>
       <w:tr>
         <w:trPr>
@@ -10088,7 +9779,7 @@
         </w:trPr>
         <w:tc>
           <w:tcPr>
-            <w:tcW w:type="dxa" w:w="4349"/>
+            <w:tcW w:type="dxa" w:w="4595"/>
             <w:tcBorders>
               <w:top w:val="single" w:color="C9C9D6" w:sz="4"/>
               <w:left w:val="single" w:color="C9C9D6" w:sz="4"/>
@@ -10120,7 +9811,7 @@
         </w:tc>
         <w:tc>
           <w:tcPr>
-            <w:tcW w:type="dxa" w:w="5289"/>
+            <w:tcW w:type="dxa" w:w="5043"/>
             <w:tcBorders>
               <w:top w:val="single" w:color="C9C9D6" w:sz="4"/>
               <w:left w:val="single" w:color="C9C9D6" w:sz="4"/>
@@ -10158,7 +9849,7 @@
         </w:trPr>
         <w:tc>
           <w:tcPr>
-            <w:tcW w:type="dxa" w:w="4349"/>
+            <w:tcW w:type="dxa" w:w="4595"/>
             <w:tcBorders>
               <w:top w:val="single" w:color="C9C9D6" w:sz="4"/>
               <w:left w:val="single" w:color="C9C9D6" w:sz="4"/>
@@ -10187,7 +9878,7 @@
         </w:tc>
         <w:tc>
           <w:tcPr>
-            <w:tcW w:type="dxa" w:w="5289"/>
+            <w:tcW w:type="dxa" w:w="5043"/>
             <w:tcBorders>
               <w:top w:val="single" w:color="C9C9D6" w:sz="4"/>
               <w:left w:val="single" w:color="C9C9D6" w:sz="4"/>
@@ -10248,7 +9939,7 @@
         </w:trPr>
         <w:tc>
           <w:tcPr>
-            <w:tcW w:type="dxa" w:w="4349"/>
+            <w:tcW w:type="dxa" w:w="4595"/>
             <w:tcBorders>
               <w:top w:val="single" w:color="C9C9D6" w:sz="4"/>
               <w:left w:val="single" w:color="C9C9D6" w:sz="4"/>
@@ -10281,7 +9972,7 @@
         </w:tc>
         <w:tc>
           <w:tcPr>
-            <w:tcW w:type="dxa" w:w="5289"/>
+            <w:tcW w:type="dxa" w:w="5043"/>
             <w:tcBorders>
               <w:top w:val="single" w:color="C9C9D6" w:sz="4"/>
               <w:left w:val="single" w:color="C9C9D6" w:sz="4"/>
@@ -10348,7 +10039,7 @@
         </w:trPr>
         <w:tc>
           <w:tcPr>
-            <w:tcW w:type="dxa" w:w="4349"/>
+            <w:tcW w:type="dxa" w:w="4595"/>
             <w:tcBorders>
               <w:top w:val="single" w:color="C9C9D6" w:sz="4"/>
               <w:left w:val="single" w:color="C9C9D6" w:sz="4"/>
@@ -10381,7 +10072,7 @@
         </w:tc>
         <w:tc>
           <w:tcPr>
-            <w:tcW w:type="dxa" w:w="5289"/>
+            <w:tcW w:type="dxa" w:w="5043"/>
             <w:tcBorders>
               <w:top w:val="single" w:color="C9C9D6" w:sz="4"/>
               <w:left w:val="single" w:color="C9C9D6" w:sz="4"/>
@@ -10420,7 +10111,39 @@
               <w:rPr>
                 <w:rtl/>
               </w:rPr>
-              <w:t xml:space="preserve"> اسم دقیق را بنویسید.</w:t>
+              <w:t xml:space="preserve"> اسم دقیق را بنویسید. اگر مدل را در تنظیمات (</w:t>
+            </w:r>
+            <w:r>
+              <w:rPr>
+                <w:rFonts w:ascii="Consolas" w:cs="Consolas" w:hAnsi="Consolas"/>
+                <w:sz w:val="19"/>
+                <w:szCs w:val="19"/>
+                <w:shd w:fill="EFEFEF" w:color="auto" w:val="clear"/>
+                <w:rtl w:val="false"/>
+              </w:rPr>
+              <w:t xml:space="preserve">ANTHROPIC_MODEL</w:t>
+            </w:r>
+            <w:r>
+              <w:rPr>
+                <w:rtl/>
+              </w:rPr>
+              <w:t xml:space="preserve">) می‌نویسید، فقط خود شناسه را بگذارید، بدون </w:t>
+            </w:r>
+            <w:r>
+              <w:rPr>
+                <w:rFonts w:ascii="Consolas" w:cs="Consolas" w:hAnsi="Consolas"/>
+                <w:sz w:val="19"/>
+                <w:szCs w:val="19"/>
+                <w:shd w:fill="EFEFEF" w:color="auto" w:val="clear"/>
+                <w:rtl w:val="false"/>
+              </w:rPr>
+              <w:t xml:space="preserve">/model</w:t>
+            </w:r>
+            <w:r>
+              <w:rPr>
+                <w:rtl/>
+              </w:rPr>
+              <w:t xml:space="preserve"> در ابتدا.</w:t>
             </w:r>
           </w:p>
         </w:tc>
@@ -10432,7 +10155,7 @@
         </w:trPr>
         <w:tc>
           <w:tcPr>
-            <w:tcW w:type="dxa" w:w="4349"/>
+            <w:tcW w:type="dxa" w:w="4595"/>
             <w:tcBorders>
               <w:top w:val="single" w:color="C9C9D6" w:sz="4"/>
               <w:left w:val="single" w:color="C9C9D6" w:sz="4"/>
@@ -10453,15 +10176,19 @@
             </w:pPr>
             <w:r>
               <w:rPr>
-                <w:rtl/>
-              </w:rPr>
-              <w:t xml:space="preserve">مدل می‌گوید «من Claude هستم»</w:t>
+                <w:rFonts w:ascii="Consolas" w:cs="Consolas" w:hAnsi="Consolas"/>
+                <w:sz w:val="19"/>
+                <w:szCs w:val="19"/>
+                <w:shd w:fill="EFEFEF" w:color="auto" w:val="clear"/>
+                <w:rtl w:val="false"/>
+              </w:rPr>
+              <w:t xml:space="preserve">400 ... "auto" tool choice requires ...</w:t>
             </w:r>
           </w:p>
         </w:tc>
         <w:tc>
           <w:tcPr>
-            <w:tcW w:type="dxa" w:w="5289"/>
+            <w:tcW w:type="dxa" w:w="5043"/>
             <w:tcBorders>
               <w:top w:val="single" w:color="C9C9D6" w:sz="4"/>
               <w:left w:val="single" w:color="C9C9D6" w:sz="4"/>
@@ -10484,23 +10211,7 @@
               <w:rPr>
                 <w:rtl/>
               </w:rPr>
-              <w:t xml:space="preserve">عادی است و به معنی اشتباه بودن تنظیمات نیست. مدل واقعی را با </w:t>
-            </w:r>
-            <w:r>
-              <w:rPr>
-                <w:rFonts w:ascii="Consolas" w:cs="Consolas" w:hAnsi="Consolas"/>
-                <w:sz w:val="19"/>
-                <w:szCs w:val="19"/>
-                <w:shd w:fill="EFEFEF" w:color="auto" w:val="clear"/>
-                <w:rtl w:val="false"/>
-              </w:rPr>
-              <w:t xml:space="preserve">/status</w:t>
-            </w:r>
-            <w:r>
-              <w:rPr>
-                <w:rtl/>
-              </w:rPr>
-              <w:t xml:space="preserve"> ببینید.</w:t>
+              <w:t xml:space="preserve">مدل Tool Calling را پشتیبانی نمی‌کند. مدل دیگری انتخاب کنید.</w:t>
             </w:r>
           </w:p>
         </w:tc>
@@ -10512,7 +10223,7 @@
         </w:trPr>
         <w:tc>
           <w:tcPr>
-            <w:tcW w:type="dxa" w:w="4349"/>
+            <w:tcW w:type="dxa" w:w="4595"/>
             <w:tcBorders>
               <w:top w:val="single" w:color="C9C9D6" w:sz="4"/>
               <w:left w:val="single" w:color="C9C9D6" w:sz="4"/>
@@ -10539,19 +10250,29 @@
                 <w:shd w:fill="EFEFEF" w:color="auto" w:val="clear"/>
                 <w:rtl w:val="false"/>
               </w:rPr>
-              <w:t xml:space="preserve">command not found: claude</w:t>
+              <w:t xml:space="preserve">model not changed</w:t>
             </w:r>
             <w:r>
               <w:rPr>
                 <w:rtl/>
               </w:rPr>
-              <w:t xml:space="preserve"> (ترمینال)</w:t>
+              <w:t xml:space="preserve"> بعد از </w:t>
+            </w:r>
+            <w:r>
+              <w:rPr>
+                <w:rFonts w:ascii="Consolas" w:cs="Consolas" w:hAnsi="Consolas"/>
+                <w:sz w:val="19"/>
+                <w:szCs w:val="19"/>
+                <w:shd w:fill="EFEFEF" w:color="auto" w:val="clear"/>
+                <w:rtl w:val="false"/>
+              </w:rPr>
+              <w:t xml:space="preserve">/model</w:t>
             </w:r>
           </w:p>
         </w:tc>
         <w:tc>
           <w:tcPr>
-            <w:tcW w:type="dxa" w:w="5289"/>
+            <w:tcW w:type="dxa" w:w="5043"/>
             <w:tcBorders>
               <w:top w:val="single" w:color="C9C9D6" w:sz="4"/>
               <w:left w:val="single" w:color="C9C9D6" w:sz="4"/>
@@ -10574,7 +10295,7 @@
               <w:rPr>
                 <w:rtl/>
               </w:rPr>
-              <w:t xml:space="preserve">ترمینال را ببندید و باز کنید. اگر نشد: </w:t>
+              <w:t xml:space="preserve">مدل reasoning (مثلاً </w:t>
             </w:r>
             <w:r>
               <w:rPr>
@@ -10584,6 +10305,192 @@
                 <w:shd w:fill="EFEFEF" w:color="auto" w:val="clear"/>
                 <w:rtl w:val="false"/>
               </w:rPr>
+              <w:t xml:space="preserve">openai/...</w:t>
+            </w:r>
+            <w:r>
+              <w:rPr>
+                <w:rtl/>
+              </w:rPr>
+              <w:t xml:space="preserve">) درخواست تأییدِ خیلی کوچک را رد کرده. مدل را با </w:t>
+            </w:r>
+            <w:r>
+              <w:rPr>
+                <w:rFonts w:ascii="Consolas" w:cs="Consolas" w:hAnsi="Consolas"/>
+                <w:sz w:val="19"/>
+                <w:szCs w:val="19"/>
+                <w:shd w:fill="EFEFEF" w:color="auto" w:val="clear"/>
+                <w:rtl w:val="false"/>
+              </w:rPr>
+              <w:t xml:space="preserve">ANTHROPIC_MODEL</w:t>
+            </w:r>
+            <w:r>
+              <w:rPr>
+                <w:rtl/>
+              </w:rPr>
+              <w:t xml:space="preserve"> در تنظیمات بگذارید.</w:t>
+            </w:r>
+          </w:p>
+        </w:tc>
+      </w:tr>
+      <w:tr>
+        <w:trPr>
+          <w:cantSplit/>
+          <w:tblHeader w:val="off"/>
+        </w:trPr>
+        <w:tc>
+          <w:tcPr>
+            <w:tcW w:type="dxa" w:w="4595"/>
+            <w:tcBorders>
+              <w:top w:val="single" w:color="C9C9D6" w:sz="4"/>
+              <w:left w:val="single" w:color="C9C9D6" w:sz="4"/>
+              <w:bottom w:val="single" w:color="C9C9D6" w:sz="4"/>
+              <w:right w:val="single" w:color="C9C9D6" w:sz="4"/>
+            </w:tcBorders>
+            <w:tcMar>
+              <w:top w:type="dxa" w:w="70"/>
+              <w:left w:type="dxa" w:w="110"/>
+              <w:bottom w:type="dxa" w:w="70"/>
+              <w:right w:type="dxa" w:w="110"/>
+            </w:tcMar>
+          </w:tcPr>
+          <w:p>
+            <w:pPr>
+              <w:bidi/>
+              <w:spacing w:after="0" w:line="290"/>
+            </w:pPr>
+            <w:r>
+              <w:rPr>
+                <w:rtl/>
+              </w:rPr>
+              <w:t xml:space="preserve">مدل می‌گوید «من Claude هستم»</w:t>
+            </w:r>
+          </w:p>
+        </w:tc>
+        <w:tc>
+          <w:tcPr>
+            <w:tcW w:type="dxa" w:w="5043"/>
+            <w:tcBorders>
+              <w:top w:val="single" w:color="C9C9D6" w:sz="4"/>
+              <w:left w:val="single" w:color="C9C9D6" w:sz="4"/>
+              <w:bottom w:val="single" w:color="C9C9D6" w:sz="4"/>
+              <w:right w:val="single" w:color="C9C9D6" w:sz="4"/>
+            </w:tcBorders>
+            <w:tcMar>
+              <w:top w:type="dxa" w:w="70"/>
+              <w:left w:type="dxa" w:w="110"/>
+              <w:bottom w:type="dxa" w:w="70"/>
+              <w:right w:type="dxa" w:w="110"/>
+            </w:tcMar>
+          </w:tcPr>
+          <w:p>
+            <w:pPr>
+              <w:bidi/>
+              <w:spacing w:after="0" w:line="290"/>
+            </w:pPr>
+            <w:r>
+              <w:rPr>
+                <w:rtl/>
+              </w:rPr>
+              <w:t xml:space="preserve">عادی است و به معنی اشتباه بودن تنظیمات نیست. مدل واقعی را با </w:t>
+            </w:r>
+            <w:r>
+              <w:rPr>
+                <w:rFonts w:ascii="Consolas" w:cs="Consolas" w:hAnsi="Consolas"/>
+                <w:sz w:val="19"/>
+                <w:szCs w:val="19"/>
+                <w:shd w:fill="EFEFEF" w:color="auto" w:val="clear"/>
+                <w:rtl w:val="false"/>
+              </w:rPr>
+              <w:t xml:space="preserve">/status</w:t>
+            </w:r>
+            <w:r>
+              <w:rPr>
+                <w:rtl/>
+              </w:rPr>
+              <w:t xml:space="preserve"> ببینید.</w:t>
+            </w:r>
+          </w:p>
+        </w:tc>
+      </w:tr>
+      <w:tr>
+        <w:trPr>
+          <w:cantSplit/>
+          <w:tblHeader w:val="off"/>
+        </w:trPr>
+        <w:tc>
+          <w:tcPr>
+            <w:tcW w:type="dxa" w:w="4595"/>
+            <w:tcBorders>
+              <w:top w:val="single" w:color="C9C9D6" w:sz="4"/>
+              <w:left w:val="single" w:color="C9C9D6" w:sz="4"/>
+              <w:bottom w:val="single" w:color="C9C9D6" w:sz="4"/>
+              <w:right w:val="single" w:color="C9C9D6" w:sz="4"/>
+            </w:tcBorders>
+            <w:tcMar>
+              <w:top w:type="dxa" w:w="70"/>
+              <w:left w:type="dxa" w:w="110"/>
+              <w:bottom w:type="dxa" w:w="70"/>
+              <w:right w:type="dxa" w:w="110"/>
+            </w:tcMar>
+          </w:tcPr>
+          <w:p>
+            <w:pPr>
+              <w:bidi/>
+              <w:spacing w:after="0" w:line="290"/>
+            </w:pPr>
+            <w:r>
+              <w:rPr>
+                <w:rFonts w:ascii="Consolas" w:cs="Consolas" w:hAnsi="Consolas"/>
+                <w:sz w:val="19"/>
+                <w:szCs w:val="19"/>
+                <w:shd w:fill="EFEFEF" w:color="auto" w:val="clear"/>
+                <w:rtl w:val="false"/>
+              </w:rPr>
+              <w:t xml:space="preserve">command not found: claude</w:t>
+            </w:r>
+            <w:r>
+              <w:rPr>
+                <w:rtl/>
+              </w:rPr>
+              <w:t xml:space="preserve"> (ترمینال)</w:t>
+            </w:r>
+          </w:p>
+        </w:tc>
+        <w:tc>
+          <w:tcPr>
+            <w:tcW w:type="dxa" w:w="5043"/>
+            <w:tcBorders>
+              <w:top w:val="single" w:color="C9C9D6" w:sz="4"/>
+              <w:left w:val="single" w:color="C9C9D6" w:sz="4"/>
+              <w:bottom w:val="single" w:color="C9C9D6" w:sz="4"/>
+              <w:right w:val="single" w:color="C9C9D6" w:sz="4"/>
+            </w:tcBorders>
+            <w:tcMar>
+              <w:top w:type="dxa" w:w="70"/>
+              <w:left w:type="dxa" w:w="110"/>
+              <w:bottom w:type="dxa" w:w="70"/>
+              <w:right w:type="dxa" w:w="110"/>
+            </w:tcMar>
+          </w:tcPr>
+          <w:p>
+            <w:pPr>
+              <w:bidi/>
+              <w:spacing w:after="0" w:line="290"/>
+            </w:pPr>
+            <w:r>
+              <w:rPr>
+                <w:rtl/>
+              </w:rPr>
+              <w:t xml:space="preserve">ترمینال را ببندید و باز کنید. اگر نشد: </w:t>
+            </w:r>
+            <w:r>
+              <w:rPr>
+                <w:rFonts w:ascii="Consolas" w:cs="Consolas" w:hAnsi="Consolas"/>
+                <w:sz w:val="19"/>
+                <w:szCs w:val="19"/>
+                <w:shd w:fill="EFEFEF" w:color="auto" w:val="clear"/>
+                <w:rtl w:val="false"/>
+              </w:rPr>
               <w:t xml:space="preserve">echo 'export PATH="$HOME/.local/bin:$PATH"' &gt;&gt; ~/.zshrc</w:t>
             </w:r>
           </w:p>
@@ -10639,6 +10546,26 @@
           <w:rtl/>
         </w:rPr>
         <w:t xml:space="preserve"> مدل‌های ستون را به Copilot اضافه می‌کنید.</w:t>
+      </w:r>
+    </w:p>
+    <w:p>
+      <w:pPr>
+        <w:bidi/>
+        <w:spacing w:after="120" w:line="320"/>
+      </w:pPr>
+      <w:r>
+        <w:rPr>
+          <w:rtl w:val="false"/>
+        </w:rPr>
+        <w:t xml:space="preserve">⚠️ </w:t>
+      </w:r>
+      <w:r>
+        <w:rPr>
+          <w:i/>
+          <w:iCs/>
+          <w:rtl/>
+        </w:rPr>
+        <w:t xml:space="preserve">تست‌شده تا مرحله‌ی دیدن مدل‌ها در منوی چت؛ ارسال پیام و حالت Agent با مدل ستون هنوز تأیید نشده.</w:t>
       </w:r>
     </w:p>
     <w:p>
@@ -11403,6 +11330,26 @@
       </w:pPr>
       <w:r>
         <w:rPr>
+          <w:rtl w:val="false"/>
+        </w:rPr>
+        <w:t xml:space="preserve">⚠️ </w:t>
+      </w:r>
+      <w:r>
+        <w:rPr>
+          <w:i/>
+          <w:iCs/>
+          <w:rtl/>
+        </w:rPr>
+        <w:t xml:space="preserve">این بخش از مستندات رسمی نوشته شده و هنوز روی ستون تست نشده.</w:t>
+      </w:r>
+    </w:p>
+    <w:p>
+      <w:pPr>
+        <w:bidi/>
+        <w:spacing w:after="120" w:line="320"/>
+      </w:pPr>
+      <w:r>
+        <w:rPr>
           <w:rtl/>
         </w:rPr>
         <w:t xml:space="preserve">فایل </w:t>
@@ -11878,6 +11825,26 @@
     </w:p>
     <w:p>
       <w:pPr>
+        <w:bidi/>
+        <w:spacing w:after="120" w:line="320"/>
+      </w:pPr>
+      <w:r>
+        <w:rPr>
+          <w:rtl w:val="false"/>
+        </w:rPr>
+        <w:t xml:space="preserve">⚠️ </w:t>
+      </w:r>
+      <w:r>
+        <w:rPr>
+          <w:i/>
+          <w:iCs/>
+          <w:rtl/>
+        </w:rPr>
+        <w:t xml:space="preserve">این بخش از راهنمای عمومی نوشته شده و هنوز روی ستون تست نشده.</w:t>
+      </w:r>
+    </w:p>
+    <w:p>
+      <w:pPr>
         <w:pStyle w:val="ListParagraph"/>
         <w:numPr>
           <w:ilvl w:val="0"/>
@@ -12108,6 +12075,26 @@
           <w:rtl w:val="false"/>
         </w:rPr>
         <w:t xml:space="preserve">Codex CLI</w:t>
+      </w:r>
+    </w:p>
+    <w:p>
+      <w:pPr>
+        <w:bidi/>
+        <w:spacing w:after="120" w:line="320"/>
+      </w:pPr>
+      <w:r>
+        <w:rPr>
+          <w:rtl w:val="false"/>
+        </w:rPr>
+        <w:t xml:space="preserve">⚠️ </w:t>
+      </w:r>
+      <w:r>
+        <w:rPr>
+          <w:i/>
+          <w:iCs/>
+          <w:rtl/>
+        </w:rPr>
+        <w:t xml:space="preserve">این بخش از مستندات رسمی نوشته شده و هنوز روی ستون تست نشده.</w:t>
       </w:r>
     </w:p>
     <w:p>
@@ -13237,7 +13224,7 @@
         <w:bidi/>
         <w:spacing w:after="120" w:line="320"/>
       </w:pPr>
-      <w:hyperlink w:history="1" r:id="rIdisd86_bgokydelnbgsqmn">
+      <w:hyperlink w:history="1" r:id="rIdmt00u-2epe-3id9ekgswm">
         <w:r>
           <w:rPr>
             <w:rStyle w:val="Hyperlink"/>
@@ -13252,7 +13239,7 @@
         </w:rPr>
         <w:t xml:space="preserve"> · </w:t>
       </w:r>
-      <w:hyperlink w:history="1" r:id="rIdr3m3_ufs25qzssar4hsu0">
+      <w:hyperlink w:history="1" r:id="rIdnyk5o6dtcrbmnwl5ffjm0">
         <w:r>
           <w:rPr>
             <w:rStyle w:val="Hyperlink"/>
@@ -13267,7 +13254,7 @@
         </w:rPr>
         <w:t xml:space="preserve"> · </w:t>
       </w:r>
-      <w:hyperlink w:history="1" r:id="rIdiafivqr8akdght0fplxmv">
+      <w:hyperlink w:history="1" r:id="rIdo48_ylppx6cnf8htnukst">
         <w:r>
           <w:rPr>
             <w:rStyle w:val="Hyperlink"/>
@@ -13282,7 +13269,7 @@
         </w:rPr>
         <w:t xml:space="preserve"> · </w:t>
       </w:r>
-      <w:hyperlink w:history="1" r:id="rIdc6pj4wsx237ii9xkeqxqp">
+      <w:hyperlink w:history="1" r:id="rIdirjwof94pzifzebulv5mz">
         <w:r>
           <w:rPr>
             <w:rStyle w:val="Hyperlink"/>

</xml_diff>

<commit_message>
docs: simplify models section
Co-Authored-By: Claude Sonnet 5.5 <noreply@anthropic.com>
Claude-Session: https://claude.ai/code/session_01K2TE7hKB2uwZb8YzUQGaRz
</commit_message>
<xml_diff>
--- a/user-docs/sotoon-api-docs.docx
+++ b/user-docs/sotoon-api-docs.docx
@@ -2010,35 +2010,55 @@
       </w:pPr>
       <w:r>
         <w:rPr>
+          <w:rtl/>
+        </w:rPr>
+        <w:t xml:space="preserve">برای فرستادن هر درخواست باید </w:t>
+      </w:r>
+      <w:r>
+        <w:rPr>
+          <w:b/>
+          <w:bCs/>
+          <w:rtl/>
+        </w:rPr>
+        <w:t xml:space="preserve">شناسه‌ی دقیق مدل</w:t>
+      </w:r>
+      <w:r>
+        <w:rPr>
+          <w:rtl/>
+        </w:rPr>
+        <w:t xml:space="preserve"> (مثلاً </w:t>
+      </w:r>
+      <w:r>
+        <w:rPr>
           <w:rFonts w:ascii="Consolas" w:cs="Consolas" w:hAnsi="Consolas"/>
           <w:sz w:val="19"/>
           <w:szCs w:val="19"/>
           <w:shd w:fill="EFEFEF" w:color="auto" w:val="clear"/>
           <w:rtl w:val="false"/>
         </w:rPr>
-        <w:t xml:space="preserve">GET /models</w:t>
-      </w:r>
-      <w:r>
-        <w:rPr>
-          <w:rtl/>
-        </w:rPr>
-        <w:t xml:space="preserve"> فقط شناسه‌ی مدل‌ها را می‌دهد:</w:t>
-      </w:r>
-    </w:p>
-    <w:p>
-      <w:pPr>
-        <w:shd w:fill="F3F3F6" w:color="auto" w:val="clear"/>
-        <w:spacing w:after="200" w:line="260"/>
-        <w:ind w:left="120" w:right="120"/>
-      </w:pPr>
-      <w:r>
-        <w:rPr>
-          <w:rFonts w:ascii="Consolas" w:cs="Consolas" w:hAnsi="Consolas"/>
-          <w:sz w:val="18"/>
-          <w:szCs w:val="18"/>
-          <w:rtl w:val="false"/>
-        </w:rPr>
-        <w:t xml:space="preserve">{ "data": [ { "id": "provider/model-name", "object": "model" } ] }</w:t>
+        <w:t xml:space="preserve">provider/model-name</w:t>
+      </w:r>
+      <w:r>
+        <w:rPr>
+          <w:rtl/>
+        </w:rPr>
+        <w:t xml:space="preserve">) را در فیلد </w:t>
+      </w:r>
+      <w:r>
+        <w:rPr>
+          <w:rFonts w:ascii="Consolas" w:cs="Consolas" w:hAnsi="Consolas"/>
+          <w:sz w:val="19"/>
+          <w:szCs w:val="19"/>
+          <w:shd w:fill="EFEFEF" w:color="auto" w:val="clear"/>
+          <w:rtl w:val="false"/>
+        </w:rPr>
+        <w:t xml:space="preserve">model</w:t>
+      </w:r>
+      <w:r>
+        <w:rPr>
+          <w:rtl/>
+        </w:rPr>
+        <w:t xml:space="preserve"> بنویسید. لیست مدل‌ها را از دو جا می‌توانید ببینید:</w:t>
       </w:r>
     </w:p>
     <w:p>
@@ -2053,25 +2073,17 @@
       </w:pPr>
       <w:r>
         <w:rPr>
-          <w:rtl/>
-        </w:rPr>
-        <w:t xml:space="preserve">شناسه را دقیقاً همان‌طور که برگشته در فیلد </w:t>
-      </w:r>
-      <w:r>
-        <w:rPr>
-          <w:rFonts w:ascii="Consolas" w:cs="Consolas" w:hAnsi="Consolas"/>
-          <w:sz w:val="19"/>
-          <w:szCs w:val="19"/>
-          <w:shd w:fill="EFEFEF" w:color="auto" w:val="clear"/>
-          <w:rtl w:val="false"/>
-        </w:rPr>
-        <w:t xml:space="preserve">model</w:t>
-      </w:r>
-      <w:r>
-        <w:rPr>
-          <w:rtl/>
-        </w:rPr>
-        <w:t xml:space="preserve"> بنویسید.</w:t>
+          <w:b/>
+          <w:bCs/>
+          <w:rtl/>
+        </w:rPr>
+        <w:t xml:space="preserve">صفحه‌ی مدل‌ها در داشبورد:</w:t>
+      </w:r>
+      <w:r>
+        <w:rPr>
+          <w:rtl/>
+        </w:rPr>
+        <w:t xml:space="preserve"> شناسه، قیمت، اندازه‌ی context و نوع ورودی (متن، تصویر، صدا) هر مدل. اگر فقط یک ابزار (مثل Claude Code یا Copilot) را تنظیم می‌کنید، همین کافی است و نیازی به API نیست.</w:t>
       </w:r>
     </w:p>
     <w:p>
@@ -2086,40 +2098,61 @@
       </w:pPr>
       <w:r>
         <w:rPr>
-          <w:rtl/>
-        </w:rPr>
-        <w:t xml:space="preserve">لیست به کلید شما بستگی دارد.</w:t>
-      </w:r>
-    </w:p>
-    <w:p>
-      <w:pPr>
-        <w:pStyle w:val="ListParagraph"/>
-        <w:numPr>
-          <w:ilvl w:val="0"/>
-          <w:numId w:val="2"/>
-        </w:numPr>
-        <w:bidi/>
-        <w:spacing w:after="80" w:line="300"/>
-      </w:pPr>
-      <w:r>
-        <w:rPr>
-          <w:rtl/>
-        </w:rPr>
-        <w:t xml:space="preserve">قیمت، اندازه‌ی context و نوع ورودی (متن، تصویر، صدا) در صفحه‌ی </w:t>
-      </w:r>
-      <w:r>
-        <w:rPr>
           <w:b/>
           <w:bCs/>
           <w:rtl/>
         </w:rPr>
-        <w:t xml:space="preserve">مدل‌ها</w:t>
-      </w:r>
-      <w:r>
-        <w:rPr>
-          <w:rtl/>
-        </w:rPr>
-        <w:t xml:space="preserve"> در داشبورد است. فیلد </w:t>
+        <w:t xml:space="preserve">از طریق API</w:t>
+      </w:r>
+      <w:r>
+        <w:rPr>
+          <w:rtl/>
+        </w:rPr>
+        <w:t xml:space="preserve"> (برای وقتی که در کد می‌خواهید لیست را بگیرید):</w:t>
+      </w:r>
+    </w:p>
+    <w:p>
+      <w:pPr>
+        <w:shd w:fill="F3F3F6" w:color="auto" w:val="clear"/>
+        <w:spacing w:after="0" w:line="260"/>
+        <w:ind w:left="120" w:right="120"/>
+      </w:pPr>
+      <w:r>
+        <w:rPr>
+          <w:rFonts w:ascii="Consolas" w:cs="Consolas" w:hAnsi="Consolas"/>
+          <w:sz w:val="18"/>
+          <w:szCs w:val="18"/>
+          <w:rtl w:val="false"/>
+        </w:rPr>
+        <w:t xml:space="preserve">curl https://api.intelligence.sotoon.ir/inference/v1/models \</w:t>
+      </w:r>
+    </w:p>
+    <w:p>
+      <w:pPr>
+        <w:shd w:fill="F3F3F6" w:color="auto" w:val="clear"/>
+        <w:spacing w:after="200" w:line="260"/>
+        <w:ind w:left="120" w:right="120"/>
+      </w:pPr>
+      <w:r>
+        <w:rPr>
+          <w:rFonts w:ascii="Consolas" w:cs="Consolas" w:hAnsi="Consolas"/>
+          <w:sz w:val="18"/>
+          <w:szCs w:val="18"/>
+          <w:rtl w:val="false"/>
+        </w:rPr>
+        <w:t xml:space="preserve">-H "Authorization: Bearer $SOTOON_API_KEY"</w:t>
+      </w:r>
+    </w:p>
+    <w:p>
+      <w:pPr>
+        <w:bidi/>
+        <w:spacing w:after="120" w:line="320"/>
+      </w:pPr>
+      <w:r>
+        <w:rPr>
+          <w:rtl/>
+        </w:rPr>
+        <w:t xml:space="preserve">پاسخ، لیست مدل‌هایی است که کلید شما به آن‌ها دسترسی دارد. از هر مدل </w:t>
       </w:r>
       <w:r>
         <w:rPr>
@@ -2129,13 +2162,71 @@
           <w:shd w:fill="EFEFEF" w:color="auto" w:val="clear"/>
           <w:rtl w:val="false"/>
         </w:rPr>
-        <w:t xml:space="preserve">owned_by</w:t>
-      </w:r>
-      <w:r>
-        <w:rPr>
-          <w:rtl/>
-        </w:rPr>
-        <w:t xml:space="preserve"> معنای خاصی ندارد.</w:t>
+        <w:t xml:space="preserve">id</w:t>
+      </w:r>
+      <w:r>
+        <w:rPr>
+          <w:rtl/>
+        </w:rPr>
+        <w:t xml:space="preserve"> را بردارید و دقیقاً همان‌طور که هست در </w:t>
+      </w:r>
+      <w:r>
+        <w:rPr>
+          <w:rFonts w:ascii="Consolas" w:cs="Consolas" w:hAnsi="Consolas"/>
+          <w:sz w:val="19"/>
+          <w:szCs w:val="19"/>
+          <w:shd w:fill="EFEFEF" w:color="auto" w:val="clear"/>
+          <w:rtl w:val="false"/>
+        </w:rPr>
+        <w:t xml:space="preserve">model</w:t>
+      </w:r>
+      <w:r>
+        <w:rPr>
+          <w:rtl/>
+        </w:rPr>
+        <w:t xml:space="preserve"> بنویسید:</w:t>
+      </w:r>
+    </w:p>
+    <w:p>
+      <w:pPr>
+        <w:shd w:fill="F3F3F6" w:color="auto" w:val="clear"/>
+        <w:spacing w:after="200" w:line="260"/>
+        <w:ind w:left="120" w:right="120"/>
+      </w:pPr>
+      <w:r>
+        <w:rPr>
+          <w:rFonts w:ascii="Consolas" w:cs="Consolas" w:hAnsi="Consolas"/>
+          <w:sz w:val="18"/>
+          <w:szCs w:val="18"/>
+          <w:rtl w:val="false"/>
+        </w:rPr>
+        <w:t xml:space="preserve">{ "data": [ { "id": "provider/model-name", "object": "model" } ] }</w:t>
+      </w:r>
+    </w:p>
+    <w:p>
+      <w:pPr>
+        <w:bidi/>
+        <w:spacing w:after="120" w:line="320"/>
+      </w:pPr>
+      <w:r>
+        <w:rPr>
+          <w:rtl/>
+        </w:rPr>
+        <w:t xml:space="preserve">این دستور فقط شناسه را می‌دهد. قیمت و مشخصات مدل‌ها را فقط در صفحه‌ی </w:t>
+      </w:r>
+      <w:r>
+        <w:rPr>
+          <w:b/>
+          <w:bCs/>
+          <w:rtl/>
+        </w:rPr>
+        <w:t xml:space="preserve">مدل‌ها</w:t>
+      </w:r>
+      <w:r>
+        <w:rPr>
+          <w:rtl/>
+        </w:rPr>
+        <w:t xml:space="preserve"> می‌بینید.</w:t>
       </w:r>
     </w:p>
     <w:p>
@@ -13224,7 +13315,7 @@
         <w:bidi/>
         <w:spacing w:after="120" w:line="320"/>
       </w:pPr>
-      <w:hyperlink w:history="1" r:id="rIdmt00u-2epe-3id9ekgswm">
+      <w:hyperlink w:history="1" r:id="rId2imuh46bvazrmvm3ocz3_">
         <w:r>
           <w:rPr>
             <w:rStyle w:val="Hyperlink"/>
@@ -13239,7 +13330,7 @@
         </w:rPr>
         <w:t xml:space="preserve"> · </w:t>
       </w:r>
-      <w:hyperlink w:history="1" r:id="rIdnyk5o6dtcrbmnwl5ffjm0">
+      <w:hyperlink w:history="1" r:id="rIdtm-8p9z_v4qjhfzq_pxer">
         <w:r>
           <w:rPr>
             <w:rStyle w:val="Hyperlink"/>
@@ -13254,7 +13345,7 @@
         </w:rPr>
         <w:t xml:space="preserve"> · </w:t>
       </w:r>
-      <w:hyperlink w:history="1" r:id="rIdo48_ylppx6cnf8htnukst">
+      <w:hyperlink w:history="1" r:id="rIdocjvqfag2m4jumg5qavz0">
         <w:r>
           <w:rPr>
             <w:rStyle w:val="Hyperlink"/>
@@ -13269,7 +13360,7 @@
         </w:rPr>
         <w:t xml:space="preserve"> · </w:t>
       </w:r>
-      <w:hyperlink w:history="1" r:id="rIdirjwof94pzifzebulv5mz">
+      <w:hyperlink w:history="1" r:id="rIdjhzrvgytkp5dy_jeosrfv">
         <w:r>
           <w:rPr>
             <w:rStyle w:val="Hyperlink"/>

</xml_diff>

<commit_message>
docs: simplify empty-response section
Co-Authored-By: Claude Sonnet 5.5 <noreply@anthropic.com>
Claude-Session: https://claude.ai/code/session_01K2TE7hKB2uwZb8YzUQGaRz
</commit_message>
<xml_diff>
--- a/user-docs/sotoon-api-docs.docx
+++ b/user-docs/sotoon-api-docs.docx
@@ -3495,7 +3495,7 @@
         <w:rPr>
           <w:rtl/>
         </w:rPr>
-        <w:t xml:space="preserve">پاسخ خالی</w:t>
+        <w:t xml:space="preserve">پاسخ خالی (یک مشکل رایج)</w:t>
       </w:r>
     </w:p>
     <w:p>
@@ -3507,7 +3507,7 @@
         <w:rPr>
           <w:rtl/>
         </w:rPr>
-        <w:t xml:space="preserve">مدل‌های reasoning قبل از جواب «فکر می‌کنند» و توکن‌های تفکر هم از </w:t>
+        <w:t xml:space="preserve">بعضی مدل‌ها (مدل‌های reasoning) قبل از نوشتن جواب، پشت صحنه «فکر می‌کنند». این فکر کردن هم از سقف </w:t>
       </w:r>
       <w:r>
         <w:rPr>
@@ -3523,7 +3523,19 @@
         <w:rPr>
           <w:rtl/>
         </w:rPr>
-        <w:t xml:space="preserve"> کم می‌شود. اگر سقف کوچک باشد، همه‌اش صرف تفکر می‌شود و </w:t>
+        <w:t xml:space="preserve"> کم می‌شود و هم جزو توکن‌های خروجی حساب می‌شود.</w:t>
+      </w:r>
+    </w:p>
+    <w:p>
+      <w:pPr>
+        <w:bidi/>
+        <w:spacing w:after="120" w:line="320"/>
+      </w:pPr>
+      <w:r>
+        <w:rPr>
+          <w:rtl/>
+        </w:rPr>
+        <w:t xml:space="preserve">اگر </w:t>
       </w:r>
       <w:r>
         <w:rPr>
@@ -3533,13 +3545,13 @@
           <w:shd w:fill="EFEFEF" w:color="auto" w:val="clear"/>
           <w:rtl w:val="false"/>
         </w:rPr>
-        <w:t xml:space="preserve">content</w:t>
-      </w:r>
-      <w:r>
-        <w:rPr>
-          <w:rtl/>
-        </w:rPr>
-        <w:t xml:space="preserve"> خالی برمی‌گردد و </w:t>
+        <w:t xml:space="preserve">max_tokens</w:t>
+      </w:r>
+      <w:r>
+        <w:rPr>
+          <w:rtl/>
+        </w:rPr>
+        <w:t xml:space="preserve"> کوچک باشد، همه‌ی سقف صرف فکر کردن می‌شود و جوابی نمی‌ماند: </w:t>
       </w:r>
       <w:r>
         <w:rPr>
@@ -3549,13 +3561,13 @@
           <w:shd w:fill="EFEFEF" w:color="auto" w:val="clear"/>
           <w:rtl w:val="false"/>
         </w:rPr>
-        <w:t xml:space="preserve">finish_reason</w:t>
-      </w:r>
-      <w:r>
-        <w:rPr>
-          <w:rtl/>
-        </w:rPr>
-        <w:t xml:space="preserve"> برابر </w:t>
+        <w:t xml:space="preserve">content</w:t>
+      </w:r>
+      <w:r>
+        <w:rPr>
+          <w:rtl/>
+        </w:rPr>
+        <w:t xml:space="preserve"> خالی برمی‌گردد، </w:t>
       </w:r>
       <w:r>
         <w:rPr>
@@ -3565,13 +3577,13 @@
           <w:shd w:fill="EFEFEF" w:color="auto" w:val="clear"/>
           <w:rtl w:val="false"/>
         </w:rPr>
-        <w:t xml:space="preserve">length</w:t>
-      </w:r>
-      <w:r>
-        <w:rPr>
-          <w:rtl/>
-        </w:rPr>
-        <w:t xml:space="preserve"> است. </w:t>
+        <w:t xml:space="preserve">finish_reason</w:t>
+      </w:r>
+      <w:r>
+        <w:rPr>
+          <w:rtl/>
+        </w:rPr>
+        <w:t xml:space="preserve"> برابر </w:t>
       </w:r>
       <w:r>
         <w:rPr>
@@ -3581,13 +3593,33 @@
           <w:shd w:fill="EFEFEF" w:color="auto" w:val="clear"/>
           <w:rtl w:val="false"/>
         </w:rPr>
-        <w:t xml:space="preserve">max_tokens</w:t>
-      </w:r>
-      <w:r>
-        <w:rPr>
-          <w:rtl/>
-        </w:rPr>
-        <w:t xml:space="preserve"> را بزرگ‌تر کنید یا ننویسید. تعداد توکن‌های تفکر در </w:t>
+        <w:t xml:space="preserve">length</w:t>
+      </w:r>
+      <w:r>
+        <w:rPr>
+          <w:rtl/>
+        </w:rPr>
+        <w:t xml:space="preserve"> است و هزینه‌ی همان توکن‌ها حساب می‌شود.</w:t>
+      </w:r>
+    </w:p>
+    <w:p>
+      <w:pPr>
+        <w:bidi/>
+        <w:spacing w:after="120" w:line="320"/>
+      </w:pPr>
+      <w:r>
+        <w:rPr>
+          <w:b/>
+          <w:bCs/>
+          <w:rtl/>
+        </w:rPr>
+        <w:t xml:space="preserve">مثال:</w:t>
+      </w:r>
+      <w:r>
+        <w:rPr>
+          <w:rtl/>
+        </w:rPr>
+        <w:t xml:space="preserve"> در یک تست، یک «سلام» ساده با </w:t>
       </w:r>
       <w:r>
         <w:rPr>
@@ -3597,13 +3629,13 @@
           <w:shd w:fill="EFEFEF" w:color="auto" w:val="clear"/>
           <w:rtl w:val="false"/>
         </w:rPr>
-        <w:t xml:space="preserve">usage.completion_tokens_details.reasoning_tokens</w:t>
-      </w:r>
-      <w:r>
-        <w:rPr>
-          <w:rtl/>
-        </w:rPr>
-        <w:t xml:space="preserve"> است. در </w:t>
+        <w:t xml:space="preserve">max_tokens: 16</w:t>
+      </w:r>
+      <w:r>
+        <w:rPr>
+          <w:rtl/>
+        </w:rPr>
+        <w:t xml:space="preserve"> جواب خالی داد. با </w:t>
       </w:r>
       <w:r>
         <w:rPr>
@@ -3613,13 +3645,33 @@
           <w:shd w:fill="EFEFEF" w:color="auto" w:val="clear"/>
           <w:rtl w:val="false"/>
         </w:rPr>
-        <w:t xml:space="preserve">/messages</w:t>
-      </w:r>
-      <w:r>
-        <w:rPr>
-          <w:rtl/>
-        </w:rPr>
-        <w:t xml:space="preserve"> همین حالت با </w:t>
+        <w:t xml:space="preserve">max_tokens: 300</w:t>
+      </w:r>
+      <w:r>
+        <w:rPr>
+          <w:rtl/>
+        </w:rPr>
+        <w:t xml:space="preserve"> جواب کامل داد و بیش از ۸۰ توکن خروجی مصرف شد.</w:t>
+      </w:r>
+    </w:p>
+    <w:p>
+      <w:pPr>
+        <w:bidi/>
+        <w:spacing w:after="120" w:line="320"/>
+      </w:pPr>
+      <w:r>
+        <w:rPr>
+          <w:b/>
+          <w:bCs/>
+          <w:rtl/>
+        </w:rPr>
+        <w:t xml:space="preserve">چه کنم؟</w:t>
+      </w:r>
+      <w:r>
+        <w:rPr>
+          <w:rtl w:val="false"/>
+        </w:rPr>
+        <w:t xml:space="preserve"> </w:t>
       </w:r>
       <w:r>
         <w:rPr>
@@ -3629,13 +3681,13 @@
           <w:shd w:fill="EFEFEF" w:color="auto" w:val="clear"/>
           <w:rtl w:val="false"/>
         </w:rPr>
-        <w:t xml:space="preserve">stop_reason: "max_tokens"</w:t>
-      </w:r>
-      <w:r>
-        <w:rPr>
-          <w:rtl/>
-        </w:rPr>
-        <w:t xml:space="preserve"> و متن خالی برمی‌گردد. توجه: روی بعضی مدل‌های reasoning سقف خیلی کوچک (مثلاً </w:t>
+        <w:t xml:space="preserve">max_tokens</w:t>
+      </w:r>
+      <w:r>
+        <w:rPr>
+          <w:rtl/>
+        </w:rPr>
+        <w:t xml:space="preserve"> را بزرگ‌تر بگذارید یا اصلاً ننویسید. تعداد توکن‌های تفکر در </w:t>
       </w:r>
       <w:r>
         <w:rPr>
@@ -3645,13 +3697,13 @@
           <w:shd w:fill="EFEFEF" w:color="auto" w:val="clear"/>
           <w:rtl w:val="false"/>
         </w:rPr>
-        <w:t xml:space="preserve">1</w:t>
-      </w:r>
-      <w:r>
-        <w:rPr>
-          <w:rtl/>
-        </w:rPr>
-        <w:t xml:space="preserve">) به‌جای پاسخ خالی خطای </w:t>
+        <w:t xml:space="preserve">usage.completion_tokens_details.reasoning_tokens</w:t>
+      </w:r>
+      <w:r>
+        <w:rPr>
+          <w:rtl/>
+        </w:rPr>
+        <w:t xml:space="preserve"> است. (در قالب </w:t>
       </w:r>
       <w:r>
         <w:rPr>
@@ -3661,13 +3713,29 @@
           <w:shd w:fill="EFEFEF" w:color="auto" w:val="clear"/>
           <w:rtl w:val="false"/>
         </w:rPr>
-        <w:t xml:space="preserve">400</w:t>
-      </w:r>
-      <w:r>
-        <w:rPr>
-          <w:rtl/>
-        </w:rPr>
-        <w:t xml:space="preserve"> می‌دهد.</w:t>
+        <w:t xml:space="preserve">/messages</w:t>
+      </w:r>
+      <w:r>
+        <w:rPr>
+          <w:rtl/>
+        </w:rPr>
+        <w:t xml:space="preserve"> همین حالت با </w:t>
+      </w:r>
+      <w:r>
+        <w:rPr>
+          <w:rFonts w:ascii="Consolas" w:cs="Consolas" w:hAnsi="Consolas"/>
+          <w:sz w:val="19"/>
+          <w:szCs w:val="19"/>
+          <w:shd w:fill="EFEFEF" w:color="auto" w:val="clear"/>
+          <w:rtl w:val="false"/>
+        </w:rPr>
+        <w:t xml:space="preserve">stop_reason: "max_tokens"</w:t>
+      </w:r>
+      <w:r>
+        <w:rPr>
+          <w:rtl/>
+        </w:rPr>
+        <w:t xml:space="preserve"> برمی‌گردد.)</w:t>
       </w:r>
     </w:p>
     <w:p>
@@ -13315,7 +13383,7 @@
         <w:bidi/>
         <w:spacing w:after="120" w:line="320"/>
       </w:pPr>
-      <w:hyperlink w:history="1" r:id="rId2imuh46bvazrmvm3ocz3_">
+      <w:hyperlink w:history="1" r:id="rId9fvxoynzadp8nh-nwj4nj">
         <w:r>
           <w:rPr>
             <w:rStyle w:val="Hyperlink"/>
@@ -13330,7 +13398,7 @@
         </w:rPr>
         <w:t xml:space="preserve"> · </w:t>
       </w:r>
-      <w:hyperlink w:history="1" r:id="rIdtm-8p9z_v4qjhfzq_pxer">
+      <w:hyperlink w:history="1" r:id="rIdmtvc5blc74drpusxkk03u">
         <w:r>
           <w:rPr>
             <w:rStyle w:val="Hyperlink"/>
@@ -13345,7 +13413,7 @@
         </w:rPr>
         <w:t xml:space="preserve"> · </w:t>
       </w:r>
-      <w:hyperlink w:history="1" r:id="rIdocjvqfag2m4jumg5qavz0">
+      <w:hyperlink w:history="1" r:id="rIdmat89pxxcju1ymbm_-nam">
         <w:r>
           <w:rPr>
             <w:rStyle w:val="Hyperlink"/>
@@ -13360,7 +13428,7 @@
         </w:rPr>
         <w:t xml:space="preserve"> · </w:t>
       </w:r>
-      <w:hyperlink w:history="1" r:id="rIdjhzrvgytkp5dy_jeosrfv">
+      <w:hyperlink w:history="1" r:id="rIdbhumbqxnotaqjdykx-ygl">
         <w:r>
           <w:rPr>
             <w:rStyle w:val="Hyperlink"/>

</xml_diff>